<commit_message>
studies/ai-governance: v0.4 — per-department authoritative AI content evaluator
Generalize Section 6 from 'technical->CHENG' to authoritative evaluation by the cognizant domain authority (technical->CHENG, IT->CIO, business/strategic->BSPO, other->cognizant authority); each department designates an AI content evaluator, with technical content always routed to the CHENG chain. Rebuilt the working-group routing package (clean instruction + cover + .docx) from v0.4. Decision logged item 15.

Co-Authored-By: Claude Opus 4.8 (1M context) <noreply@anthropic.com>
</commit_message>
<xml_diff>
--- a/studies/ai-governance/03_instruction/routing/SRF-JRMC-INST-5239.1-DRAFT-working-group.docx
+++ b/studies/ai-governance/03_instruction/routing/SRF-JRMC-INST-5239.1-DRAFT-working-group.docx
@@ -303,34 +303,62 @@
         <w:t xml:space="preserve"> </w:t>
       </w:r>
       <w:r>
-        <w:t xml:space="preserve">technical adjudication stays with the</w:t>
-      </w:r>
-      <w:r>
-        <w:t xml:space="preserve"> </w:t>
-      </w:r>
-      <w:r>
-        <w:rPr>
-          <w:b/>
-          <w:bCs/>
-        </w:rPr>
-        <w:t xml:space="preserve">CHENG</w:t>
-      </w:r>
-      <w:r>
-        <w:rPr>
-          <w:b/>
-          <w:bCs/>
-        </w:rPr>
-        <w:t xml:space="preserve"> </w:t>
-      </w:r>
-      <w:r>
-        <w:rPr>
-          <w:b/>
-          <w:bCs/>
-        </w:rPr>
-        <w:t xml:space="preserve">chain</w:t>
-      </w:r>
-      <w:r>
-        <w:t xml:space="preserve">; AI output is always a non-authoritative draft.</w:t>
+        <w:t xml:space="preserve">AI output is authoritatively evaluated by the</w:t>
+      </w:r>
+      <w:r>
+        <w:t xml:space="preserve"> </w:t>
+      </w:r>
+      <w:r>
+        <w:rPr>
+          <w:b/>
+          <w:bCs/>
+        </w:rPr>
+        <w:t xml:space="preserve">cognizant domain authority</w:t>
+      </w:r>
+      <w:r>
+        <w:t xml:space="preserve"> </w:t>
+      </w:r>
+      <w:r>
+        <w:t xml:space="preserve">(technical → CHENG chain, IT/security → CIO, business/</w:t>
+      </w:r>
+      <w:r>
+        <w:t xml:space="preserve"> </w:t>
+      </w:r>
+      <w:r>
+        <w:t xml:space="preserve">strategic → BSPO, and so on), and</w:t>
+      </w:r>
+      <w:r>
+        <w:t xml:space="preserve"> </w:t>
+      </w:r>
+      <w:r>
+        <w:rPr>
+          <w:b/>
+          <w:bCs/>
+        </w:rPr>
+        <w:t xml:space="preserve">each department designates an authoritative AI content</w:t>
+      </w:r>
+      <w:r>
+        <w:rPr>
+          <w:b/>
+          <w:bCs/>
+        </w:rPr>
+        <w:t xml:space="preserve"> </w:t>
+      </w:r>
+      <w:r>
+        <w:rPr>
+          <w:b/>
+          <w:bCs/>
+        </w:rPr>
+        <w:t xml:space="preserve">evaluator</w:t>
+      </w:r>
+      <w:r>
+        <w:t xml:space="preserve">. Anything technical always routes to the CHENG chain. AI output is always a</w:t>
+      </w:r>
+      <w:r>
+        <w:t xml:space="preserve"> </w:t>
+      </w:r>
+      <w:r>
+        <w:t xml:space="preserve">non-authoritative draft.</w:t>
       </w:r>
     </w:p>
     <w:p>
@@ -574,13 +602,25 @@
         </w:numPr>
       </w:pPr>
       <w:r>
-        <w:t xml:space="preserve">Confirm the engineering and quality-assurance codes and the Technical Warrant Holder</w:t>
-      </w:r>
-      <w:r>
-        <w:t xml:space="preserve"> </w:t>
-      </w:r>
-      <w:r>
-        <w:t xml:space="preserve">assignments for the CHENG chain (§6.a).</w:t>
+        <w:t xml:space="preserve">Complete the domain-to-authority mapping (technical → CHENG, IT → CIO, business → BSPO,</w:t>
+      </w:r>
+      <w:r>
+        <w:t xml:space="preserve"> </w:t>
+      </w:r>
+      <w:r>
+        <w:t xml:space="preserve">plus the rest of the organization) and confirm the engineering/QA codes and Technical</w:t>
+      </w:r>
+      <w:r>
+        <w:t xml:space="preserve"> </w:t>
+      </w:r>
+      <w:r>
+        <w:t xml:space="preserve">Warrant Holder assignments; each department names its authoritative AI content evaluator</w:t>
+      </w:r>
+      <w:r>
+        <w:t xml:space="preserve"> </w:t>
+      </w:r>
+      <w:r>
+        <w:t xml:space="preserve">(§6.a–b).</w:t>
       </w:r>
     </w:p>
     <w:p>
@@ -2307,13 +2347,13 @@
       </w:r>
     </w:p>
     <w:bookmarkEnd w:id="18"/>
-    <w:bookmarkStart w:id="19" w:name="X0022217766359b71491f82438f8ce3c076b2bd7"/>
+    <w:bookmarkStart w:id="19" w:name="X202263741ef985fbdc1a728e19fe30f81842b52"/>
     <w:p>
       <w:pPr>
         <w:pStyle w:val="Heading2"/>
       </w:pPr>
       <w:r>
-        <w:t xml:space="preserve">6. Technical authority and the human-in-the-loop</w:t>
+        <w:t xml:space="preserve">6. Authoritative evaluation of AI output (the human-in-the-loop)</w:t>
       </w:r>
     </w:p>
     <w:p>
@@ -2329,37 +2369,209 @@
           <w:b/>
           <w:bCs/>
         </w:rPr>
-        <w:t xml:space="preserve">Technical adjudication belongs to the Chief Engineer (CHENG) and the CHENG’s chain.</w:t>
-      </w:r>
-      <w:r>
-        <w:t xml:space="preserve"> </w:t>
-      </w:r>
-      <w:r>
-        <w:t xml:space="preserve">Any AI output bearing on a technical requirement — a weld specification, a torque value,</w:t>
-      </w:r>
-      <w:r>
-        <w:t xml:space="preserve"> </w:t>
-      </w:r>
-      <w:r>
-        <w:t xml:space="preserve">a tag-out, a NAVSEA Standard Item interpretation, a repair procedure — is a</w:t>
-      </w:r>
-      <w:r>
-        <w:t xml:space="preserve"> </w:t>
-      </w:r>
-      <w:r>
-        <w:t xml:space="preserve">non-authoritative clerical draft. The technical human-in-the-loop adjudication is</w:t>
-      </w:r>
-      <w:r>
-        <w:t xml:space="preserve"> </w:t>
-      </w:r>
-      <w:r>
-        <w:t xml:space="preserve">performed by a qualified person in the CHENG’s chain, not by the general end user and not</w:t>
-      </w:r>
-      <w:r>
-        <w:t xml:space="preserve"> </w:t>
-      </w:r>
-      <w:r>
-        <w:t xml:space="preserve">by the Command Information Officer (CIO).</w:t>
+        <w:t xml:space="preserve">AI output is authoritatively evaluated by the cognizant domain authority.</w:t>
+      </w:r>
+      <w:r>
+        <w:t xml:space="preserve"> </w:t>
+      </w:r>
+      <w:r>
+        <w:t xml:space="preserve">No AI</w:t>
+      </w:r>
+      <w:r>
+        <w:t xml:space="preserve"> </w:t>
+      </w:r>
+      <w:r>
+        <w:t xml:space="preserve">output is authoritative on its own. A qualified human who owns the relevant subject matter</w:t>
+      </w:r>
+      <w:r>
+        <w:t xml:space="preserve"> </w:t>
+      </w:r>
+      <w:r>
+        <w:t xml:space="preserve">must evaluate AI-produced content before it is used or released, and the cognizant</w:t>
+      </w:r>
+      <w:r>
+        <w:t xml:space="preserve"> </w:t>
+      </w:r>
+      <w:r>
+        <w:t xml:space="preserve">authority follows the content, not the tool that produced it:</w:t>
+      </w:r>
+    </w:p>
+    <w:p>
+      <w:pPr>
+        <w:pStyle w:val="Compact"/>
+        <w:numPr>
+          <w:ilvl w:val="0"/>
+          <w:numId w:val="1010"/>
+        </w:numPr>
+      </w:pPr>
+      <w:r>
+        <w:rPr>
+          <w:b/>
+          <w:bCs/>
+        </w:rPr>
+        <w:t xml:space="preserve">Technical content</w:t>
+      </w:r>
+      <w:r>
+        <w:t xml:space="preserve"> </w:t>
+      </w:r>
+      <w:r>
+        <w:t xml:space="preserve">(a weld specification, torque value, tag-out, NAVSEA Standard Item</w:t>
+      </w:r>
+      <w:r>
+        <w:t xml:space="preserve"> </w:t>
+      </w:r>
+      <w:r>
+        <w:t xml:space="preserve">interpretation, repair procedure): the</w:t>
+      </w:r>
+      <w:r>
+        <w:t xml:space="preserve"> </w:t>
+      </w:r>
+      <w:r>
+        <w:rPr>
+          <w:b/>
+          <w:bCs/>
+        </w:rPr>
+        <w:t xml:space="preserve">Chief Engineer (CHENG) and the CHENG’s chain.</w:t>
+      </w:r>
+    </w:p>
+    <w:p>
+      <w:pPr>
+        <w:pStyle w:val="Compact"/>
+        <w:numPr>
+          <w:ilvl w:val="0"/>
+          <w:numId w:val="1010"/>
+        </w:numPr>
+      </w:pPr>
+      <w:r>
+        <w:rPr>
+          <w:b/>
+          <w:bCs/>
+        </w:rPr>
+        <w:t xml:space="preserve">Information-technology and information-security content:</w:t>
+      </w:r>
+      <w:r>
+        <w:t xml:space="preserve"> </w:t>
+      </w:r>
+      <w:r>
+        <w:t xml:space="preserve">the</w:t>
+      </w:r>
+      <w:r>
+        <w:t xml:space="preserve"> </w:t>
+      </w:r>
+      <w:r>
+        <w:rPr>
+          <w:b/>
+          <w:bCs/>
+        </w:rPr>
+        <w:t xml:space="preserve">Command Information</w:t>
+      </w:r>
+      <w:r>
+        <w:rPr>
+          <w:b/>
+          <w:bCs/>
+        </w:rPr>
+        <w:t xml:space="preserve"> </w:t>
+      </w:r>
+      <w:r>
+        <w:rPr>
+          <w:b/>
+          <w:bCs/>
+        </w:rPr>
+        <w:t xml:space="preserve">Officer (CIO).</w:t>
+      </w:r>
+    </w:p>
+    <w:p>
+      <w:pPr>
+        <w:pStyle w:val="Compact"/>
+        <w:numPr>
+          <w:ilvl w:val="0"/>
+          <w:numId w:val="1010"/>
+        </w:numPr>
+      </w:pPr>
+      <w:r>
+        <w:rPr>
+          <w:b/>
+          <w:bCs/>
+        </w:rPr>
+        <w:t xml:space="preserve">Business and strategic-planning content:</w:t>
+      </w:r>
+      <w:r>
+        <w:t xml:space="preserve"> </w:t>
+      </w:r>
+      <w:r>
+        <w:t xml:space="preserve">the</w:t>
+      </w:r>
+      <w:r>
+        <w:t xml:space="preserve"> </w:t>
+      </w:r>
+      <w:r>
+        <w:rPr>
+          <w:b/>
+          <w:bCs/>
+        </w:rPr>
+        <w:t xml:space="preserve">Business Strategic Planning Office</w:t>
+      </w:r>
+      <w:r>
+        <w:rPr>
+          <w:b/>
+          <w:bCs/>
+        </w:rPr>
+        <w:t xml:space="preserve"> </w:t>
+      </w:r>
+      <w:r>
+        <w:rPr>
+          <w:b/>
+          <w:bCs/>
+        </w:rPr>
+        <w:t xml:space="preserve">(BSPO).</w:t>
+      </w:r>
+    </w:p>
+    <w:p>
+      <w:pPr>
+        <w:pStyle w:val="Compact"/>
+        <w:numPr>
+          <w:ilvl w:val="0"/>
+          <w:numId w:val="1010"/>
+        </w:numPr>
+      </w:pPr>
+      <w:r>
+        <w:rPr>
+          <w:b/>
+          <w:bCs/>
+        </w:rPr>
+        <w:t xml:space="preserve">Any other functional content</w:t>
+      </w:r>
+      <w:r>
+        <w:t xml:space="preserve"> </w:t>
+      </w:r>
+      <w:r>
+        <w:t xml:space="preserve">(for example contracts, supply, manpower, safety): the</w:t>
+      </w:r>
+      <w:r>
+        <w:t xml:space="preserve"> </w:t>
+      </w:r>
+      <w:r>
+        <w:t xml:space="preserve">cognizant department head or functional authority for that area.</w:t>
+      </w:r>
+    </w:p>
+    <w:p>
+      <w:pPr>
+        <w:pStyle w:val="FirstParagraph"/>
+      </w:pPr>
+      <w:r>
+        <w:t xml:space="preserve">For technical content the bar is highest: because seaworthiness and safety of life are</w:t>
+      </w:r>
+      <w:r>
+        <w:t xml:space="preserve"> </w:t>
+      </w:r>
+      <w:r>
+        <w:t xml:space="preserve">paramount, such output is a non-authoritative clerical draft until a qualified person in</w:t>
+      </w:r>
+      <w:r>
+        <w:t xml:space="preserve"> </w:t>
+      </w:r>
+      <w:r>
+        <w:t xml:space="preserve">the CHENG’s chain adjudicates it — never the general end user’s or the CIO’s call.</w:t>
       </w:r>
     </w:p>
     <w:p>
@@ -2377,14 +2589,71 @@
         <w:t xml:space="preserve"> </w:t>
       </w:r>
       <w:r>
-        <w:t xml:space="preserve">confirm the engineering and quality-assurance codes and the Technical Warrant Holder assignments.</w:t>
-      </w:r>
-    </w:p>
-    <w:p>
-      <w:pPr>
-        <w:numPr>
-          <w:ilvl w:val="0"/>
-          <w:numId w:val="1010"/>
+        <w:t xml:space="preserve">complete the domain-to-authority mapping for the command’s full organization, and confirm the engineering and quality-assurance codes and Technical Warrant Holder assignments.</w:t>
+      </w:r>
+    </w:p>
+    <w:p>
+      <w:pPr>
+        <w:numPr>
+          <w:ilvl w:val="0"/>
+          <w:numId w:val="1011"/>
+        </w:numPr>
+      </w:pPr>
+      <w:r>
+        <w:rPr>
+          <w:b/>
+          <w:bCs/>
+        </w:rPr>
+        <w:t xml:space="preserve">Each department designates an authoritative AI content evaluator.</w:t>
+      </w:r>
+      <w:r>
+        <w:t xml:space="preserve"> </w:t>
+      </w:r>
+      <w:r>
+        <w:t xml:space="preserve">Every department</w:t>
+      </w:r>
+      <w:r>
+        <w:t xml:space="preserve"> </w:t>
+      </w:r>
+      <w:r>
+        <w:t xml:space="preserve">designates, in writing, a qualified person responsible for the authoritative evaluation of</w:t>
+      </w:r>
+      <w:r>
+        <w:t xml:space="preserve"> </w:t>
+      </w:r>
+      <w:r>
+        <w:t xml:space="preserve">AI-produced content used in that department. That evaluator performs the evaluation for</w:t>
+      </w:r>
+      <w:r>
+        <w:t xml:space="preserve"> </w:t>
+      </w:r>
+      <w:r>
+        <w:t xml:space="preserve">content in the department’s own domain and routes content that falls in another domain to</w:t>
+      </w:r>
+      <w:r>
+        <w:t xml:space="preserve"> </w:t>
+      </w:r>
+      <w:r>
+        <w:t xml:space="preserve">the cognizant authority in paragraph (a) — anything technical goes to the CHENG chain. The</w:t>
+      </w:r>
+      <w:r>
+        <w:t xml:space="preserve"> </w:t>
+      </w:r>
+      <w:r>
+        <w:t xml:space="preserve">designated evaluator is recorded with the department’s use cases in the inventory</w:t>
+      </w:r>
+      <w:r>
+        <w:t xml:space="preserve"> </w:t>
+      </w:r>
+      <w:r>
+        <w:t xml:space="preserve">(Section 8).</w:t>
+      </w:r>
+    </w:p>
+    <w:p>
+      <w:pPr>
+        <w:numPr>
+          <w:ilvl w:val="0"/>
+          <w:numId w:val="1011"/>
         </w:numPr>
       </w:pPr>
       <w:r>
@@ -2423,7 +2692,7 @@
       <w:pPr>
         <w:numPr>
           <w:ilvl w:val="0"/>
-          <w:numId w:val="1010"/>
+          <w:numId w:val="1011"/>
         </w:numPr>
       </w:pPr>
       <w:r>
@@ -2511,7 +2780,7 @@
         <w:pStyle w:val="Compact"/>
         <w:numPr>
           <w:ilvl w:val="0"/>
-          <w:numId w:val="1011"/>
+          <w:numId w:val="1012"/>
         </w:numPr>
       </w:pPr>
       <w:r>
@@ -2594,7 +2863,7 @@
       <w:pPr>
         <w:numPr>
           <w:ilvl w:val="0"/>
-          <w:numId w:val="1012"/>
+          <w:numId w:val="1013"/>
         </w:numPr>
       </w:pPr>
       <w:r>
@@ -2621,7 +2890,7 @@
       <w:pPr>
         <w:numPr>
           <w:ilvl w:val="0"/>
-          <w:numId w:val="1012"/>
+          <w:numId w:val="1013"/>
         </w:numPr>
       </w:pPr>
       <w:r>
@@ -2647,7 +2916,7 @@
         <w:t xml:space="preserve"> </w:t>
       </w:r>
       <w:r>
-        <w:t xml:space="preserve">requires a structured human approval (Section 6.d) before execution. The AI does not</w:t>
+        <w:t xml:space="preserve">requires a structured human approval (Section 6.e) before execution. The AI does not</w:t>
       </w:r>
       <w:r>
         <w:t xml:space="preserve"> </w:t>
@@ -2660,7 +2929,7 @@
       <w:pPr>
         <w:numPr>
           <w:ilvl w:val="0"/>
-          <w:numId w:val="1012"/>
+          <w:numId w:val="1013"/>
         </w:numPr>
       </w:pPr>
       <w:r>
@@ -2723,7 +2992,7 @@
       <w:pPr>
         <w:numPr>
           <w:ilvl w:val="0"/>
-          <w:numId w:val="1012"/>
+          <w:numId w:val="1013"/>
         </w:numPr>
       </w:pPr>
       <w:r>
@@ -2762,7 +3031,7 @@
       <w:pPr>
         <w:numPr>
           <w:ilvl w:val="0"/>
-          <w:numId w:val="1012"/>
+          <w:numId w:val="1013"/>
         </w:numPr>
       </w:pPr>
       <w:r>
@@ -2824,7 +3093,7 @@
         <w:pStyle w:val="Compact"/>
         <w:numPr>
           <w:ilvl w:val="0"/>
-          <w:numId w:val="1013"/>
+          <w:numId w:val="1014"/>
         </w:numPr>
       </w:pPr>
       <w:r>
@@ -2897,7 +3166,7 @@
       <w:pPr>
         <w:numPr>
           <w:ilvl w:val="0"/>
-          <w:numId w:val="1014"/>
+          <w:numId w:val="1015"/>
         </w:numPr>
       </w:pPr>
       <w:r>
@@ -2942,7 +3211,7 @@
       <w:pPr>
         <w:numPr>
           <w:ilvl w:val="0"/>
-          <w:numId w:val="1014"/>
+          <w:numId w:val="1015"/>
         </w:numPr>
       </w:pPr>
       <w:r>
@@ -3003,7 +3272,7 @@
       <w:pPr>
         <w:numPr>
           <w:ilvl w:val="0"/>
-          <w:numId w:val="1014"/>
+          <w:numId w:val="1015"/>
         </w:numPr>
       </w:pPr>
       <w:r>
@@ -3036,7 +3305,7 @@
       <w:pPr>
         <w:numPr>
           <w:ilvl w:val="0"/>
-          <w:numId w:val="1014"/>
+          <w:numId w:val="1015"/>
         </w:numPr>
       </w:pPr>
       <w:r>
@@ -3066,20 +3335,47 @@
         <w:t xml:space="preserve"> </w:t>
       </w:r>
       <w:r>
-        <w:t xml:space="preserve">technical scope per 8.c; CIO validates platform/security), enforce the human-in-the-loop</w:t>
-      </w:r>
-      <w:r>
-        <w:t xml:space="preserve"> </w:t>
-      </w:r>
-      <w:r>
-        <w:t xml:space="preserve">and least-privilege requirements, and submit their use cases to the inventory.</w:t>
-      </w:r>
-    </w:p>
-    <w:p>
-      <w:pPr>
-        <w:numPr>
-          <w:ilvl w:val="0"/>
-          <w:numId w:val="1014"/>
+        <w:t xml:space="preserve">technical scope per 8.c; CIO validates platform/security),</w:t>
+      </w:r>
+      <w:r>
+        <w:t xml:space="preserve"> </w:t>
+      </w:r>
+      <w:r>
+        <w:rPr>
+          <w:b/>
+          <w:bCs/>
+        </w:rPr>
+        <w:t xml:space="preserve">designate the department’s</w:t>
+      </w:r>
+      <w:r>
+        <w:rPr>
+          <w:b/>
+          <w:bCs/>
+        </w:rPr>
+        <w:t xml:space="preserve"> </w:t>
+      </w:r>
+      <w:r>
+        <w:rPr>
+          <w:b/>
+          <w:bCs/>
+        </w:rPr>
+        <w:t xml:space="preserve">authoritative AI content evaluator (Section 6.b)</w:t>
+      </w:r>
+      <w:r>
+        <w:t xml:space="preserve">, enforce the human-in-the-loop and</w:t>
+      </w:r>
+      <w:r>
+        <w:t xml:space="preserve"> </w:t>
+      </w:r>
+      <w:r>
+        <w:t xml:space="preserve">least-privilege requirements, and submit their use cases to the inventory.</w:t>
+      </w:r>
+    </w:p>
+    <w:p>
+      <w:pPr>
+        <w:numPr>
+          <w:ilvl w:val="0"/>
+          <w:numId w:val="1015"/>
         </w:numPr>
       </w:pPr>
       <w:r>
@@ -3106,7 +3402,7 @@
       <w:pPr>
         <w:numPr>
           <w:ilvl w:val="0"/>
-          <w:numId w:val="1014"/>
+          <w:numId w:val="1015"/>
         </w:numPr>
       </w:pPr>
       <w:r>
@@ -3176,7 +3472,7 @@
       <w:pPr>
         <w:numPr>
           <w:ilvl w:val="0"/>
-          <w:numId w:val="1015"/>
+          <w:numId w:val="1016"/>
         </w:numPr>
       </w:pPr>
       <w:r>
@@ -3234,7 +3530,7 @@
       <w:pPr>
         <w:numPr>
           <w:ilvl w:val="0"/>
-          <w:numId w:val="1015"/>
+          <w:numId w:val="1016"/>
         </w:numPr>
       </w:pPr>
       <w:r>
@@ -3267,7 +3563,7 @@
       <w:pPr>
         <w:numPr>
           <w:ilvl w:val="0"/>
-          <w:numId w:val="1015"/>
+          <w:numId w:val="1016"/>
         </w:numPr>
       </w:pPr>
       <w:r>
@@ -3300,7 +3596,7 @@
       <w:pPr>
         <w:numPr>
           <w:ilvl w:val="0"/>
-          <w:numId w:val="1015"/>
+          <w:numId w:val="1016"/>
         </w:numPr>
       </w:pPr>
       <w:r>
@@ -3337,7 +3633,7 @@
       <w:pPr>
         <w:numPr>
           <w:ilvl w:val="0"/>
-          <w:numId w:val="1016"/>
+          <w:numId w:val="1017"/>
         </w:numPr>
       </w:pPr>
       <w:r>
@@ -3376,7 +3672,7 @@
       <w:pPr>
         <w:numPr>
           <w:ilvl w:val="0"/>
-          <w:numId w:val="1016"/>
+          <w:numId w:val="1017"/>
         </w:numPr>
       </w:pPr>
       <w:r>
@@ -3450,7 +3746,7 @@
         <w:pStyle w:val="Compact"/>
         <w:numPr>
           <w:ilvl w:val="0"/>
-          <w:numId w:val="1017"/>
+          <w:numId w:val="1018"/>
         </w:numPr>
       </w:pPr>
       <w:r>
@@ -3607,7 +3903,7 @@
       <w:pPr>
         <w:numPr>
           <w:ilvl w:val="0"/>
-          <w:numId w:val="1018"/>
+          <w:numId w:val="1019"/>
         </w:numPr>
       </w:pPr>
       <w:r>
@@ -3640,7 +3936,7 @@
       <w:pPr>
         <w:numPr>
           <w:ilvl w:val="0"/>
-          <w:numId w:val="1018"/>
+          <w:numId w:val="1019"/>
         </w:numPr>
       </w:pPr>
       <w:r>
@@ -3683,7 +3979,7 @@
       <w:pPr>
         <w:numPr>
           <w:ilvl w:val="0"/>
-          <w:numId w:val="1019"/>
+          <w:numId w:val="1020"/>
         </w:numPr>
       </w:pPr>
       <w:r>
@@ -3731,7 +4027,7 @@
       <w:pPr>
         <w:numPr>
           <w:ilvl w:val="0"/>
-          <w:numId w:val="1019"/>
+          <w:numId w:val="1020"/>
         </w:numPr>
       </w:pPr>
       <w:r>
@@ -3780,7 +4076,7 @@
       <w:pPr>
         <w:numPr>
           <w:ilvl w:val="0"/>
-          <w:numId w:val="1020"/>
+          <w:numId w:val="1021"/>
         </w:numPr>
       </w:pPr>
       <w:r>
@@ -3821,7 +4117,7 @@
       <w:pPr>
         <w:numPr>
           <w:ilvl w:val="0"/>
-          <w:numId w:val="1020"/>
+          <w:numId w:val="1021"/>
         </w:numPr>
       </w:pPr>
       <w:r>
@@ -3844,7 +4140,7 @@
       <w:pPr>
         <w:numPr>
           <w:ilvl w:val="0"/>
-          <w:numId w:val="1020"/>
+          <w:numId w:val="1021"/>
         </w:numPr>
       </w:pPr>
       <w:r>
@@ -3871,7 +4167,7 @@
       <w:pPr>
         <w:numPr>
           <w:ilvl w:val="0"/>
-          <w:numId w:val="1021"/>
+          <w:numId w:val="1022"/>
         </w:numPr>
       </w:pPr>
       <w:r>
@@ -3904,7 +4200,7 @@
       <w:pPr>
         <w:numPr>
           <w:ilvl w:val="0"/>
-          <w:numId w:val="1021"/>
+          <w:numId w:val="1022"/>
         </w:numPr>
       </w:pPr>
       <w:r>
@@ -3931,7 +4227,7 @@
       <w:pPr>
         <w:numPr>
           <w:ilvl w:val="0"/>
-          <w:numId w:val="1021"/>
+          <w:numId w:val="1022"/>
         </w:numPr>
       </w:pPr>
       <w:r>
@@ -3982,7 +4278,7 @@
       <w:pPr>
         <w:numPr>
           <w:ilvl w:val="0"/>
-          <w:numId w:val="1021"/>
+          <w:numId w:val="1022"/>
         </w:numPr>
       </w:pPr>
       <w:r>
@@ -4083,7 +4379,7 @@
         <w:pStyle w:val="Compact"/>
         <w:numPr>
           <w:ilvl w:val="0"/>
-          <w:numId w:val="1022"/>
+          <w:numId w:val="1023"/>
         </w:numPr>
       </w:pPr>
       <w:r>
@@ -4111,7 +4407,7 @@
         <w:pStyle w:val="Compact"/>
         <w:numPr>
           <w:ilvl w:val="0"/>
-          <w:numId w:val="1022"/>
+          <w:numId w:val="1023"/>
         </w:numPr>
       </w:pPr>
       <w:r>
@@ -4139,7 +4435,7 @@
         <w:pStyle w:val="Compact"/>
         <w:numPr>
           <w:ilvl w:val="0"/>
-          <w:numId w:val="1022"/>
+          <w:numId w:val="1023"/>
         </w:numPr>
       </w:pPr>
       <w:r>
@@ -4179,7 +4475,7 @@
         <w:pStyle w:val="Compact"/>
         <w:numPr>
           <w:ilvl w:val="0"/>
-          <w:numId w:val="1022"/>
+          <w:numId w:val="1023"/>
         </w:numPr>
       </w:pPr>
       <w:r>
@@ -4842,11 +5138,11 @@
       </w:pPr>
     </w:lvl>
   </w:abstractNum>
-  <w:abstractNum w:abstractNumId="99714">
-    <w:nsid w:val="00A99714"/>
+  <w:abstractNum w:abstractNumId="99715">
+    <w:nsid w:val="00A99715"/>
     <w:multiLevelType w:val="multilevel"/>
     <w:lvl w:ilvl="0">
-      <w:start w:val="4"/>
+      <w:start w:val="5"/>
       <w:numFmt w:val="lowerLetter"/>
       <w:lvlText w:val="%1."/>
       <w:lvlJc w:val="left"/>
@@ -4855,7 +5151,7 @@
       </w:pPr>
     </w:lvl>
     <w:lvl w:ilvl="1">
-      <w:start w:val="4"/>
+      <w:start w:val="5"/>
       <w:numFmt w:val="lowerLetter"/>
       <w:lvlText w:val="%2."/>
       <w:lvlJc w:val="left"/>
@@ -4864,7 +5160,7 @@
       </w:pPr>
     </w:lvl>
     <w:lvl w:ilvl="2">
-      <w:start w:val="4"/>
+      <w:start w:val="5"/>
       <w:numFmt w:val="lowerLetter"/>
       <w:lvlText w:val="%3."/>
       <w:lvlJc w:val="left"/>
@@ -4873,7 +5169,7 @@
       </w:pPr>
     </w:lvl>
     <w:lvl w:ilvl="3">
-      <w:start w:val="4"/>
+      <w:start w:val="5"/>
       <w:numFmt w:val="lowerLetter"/>
       <w:lvlText w:val="%4."/>
       <w:lvlJc w:val="left"/>
@@ -4882,7 +5178,7 @@
       </w:pPr>
     </w:lvl>
     <w:lvl w:ilvl="4">
-      <w:start w:val="4"/>
+      <w:start w:val="5"/>
       <w:numFmt w:val="lowerLetter"/>
       <w:lvlText w:val="%5."/>
       <w:lvlJc w:val="left"/>
@@ -4891,7 +5187,7 @@
       </w:pPr>
     </w:lvl>
     <w:lvl w:ilvl="5">
-      <w:start w:val="4"/>
+      <w:start w:val="5"/>
       <w:numFmt w:val="lowerLetter"/>
       <w:lvlText w:val="%6."/>
       <w:lvlJc w:val="left"/>
@@ -4900,7 +5196,7 @@
       </w:pPr>
     </w:lvl>
     <w:lvl w:ilvl="6">
-      <w:start w:val="4"/>
+      <w:start w:val="5"/>
       <w:numFmt w:val="lowerLetter"/>
       <w:lvlText w:val="%7."/>
       <w:lvlJc w:val="left"/>
@@ -4909,7 +5205,7 @@
       </w:pPr>
     </w:lvl>
     <w:lvl w:ilvl="7">
-      <w:start w:val="4"/>
+      <w:start w:val="5"/>
       <w:numFmt w:val="lowerLetter"/>
       <w:lvlText w:val="%8."/>
       <w:lvlJc w:val="left"/>
@@ -4918,7 +5214,7 @@
       </w:pPr>
     </w:lvl>
     <w:lvl w:ilvl="8">
-      <w:start w:val="4"/>
+      <w:start w:val="5"/>
       <w:numFmt w:val="lowerLetter"/>
       <w:lvlText w:val="%9."/>
       <w:lvlJc w:val="left"/>
@@ -5174,6 +5470,9 @@
     </w:lvlOverride>
   </w:num>
   <w:num w:numId="1010">
+    <w:abstractNumId w:val="991"/>
+  </w:num>
+  <w:num w:numId="1011">
     <w:abstractNumId w:val="99712"/>
     <w:lvlOverride w:ilvl="0">
       <w:startOverride w:val="2"/>
@@ -5203,64 +5502,34 @@
       <w:startOverride w:val="2"/>
     </w:lvlOverride>
   </w:num>
-  <w:num w:numId="1011">
-    <w:abstractNumId w:val="99714"/>
+  <w:num w:numId="1012">
+    <w:abstractNumId w:val="99715"/>
     <w:lvlOverride w:ilvl="0">
-      <w:startOverride w:val="4"/>
+      <w:startOverride w:val="5"/>
     </w:lvlOverride>
     <w:lvlOverride w:ilvl="1">
-      <w:startOverride w:val="4"/>
+      <w:startOverride w:val="5"/>
     </w:lvlOverride>
     <w:lvlOverride w:ilvl="2">
-      <w:startOverride w:val="4"/>
+      <w:startOverride w:val="5"/>
     </w:lvlOverride>
     <w:lvlOverride w:ilvl="3">
-      <w:startOverride w:val="4"/>
+      <w:startOverride w:val="5"/>
     </w:lvlOverride>
     <w:lvlOverride w:ilvl="4">
-      <w:startOverride w:val="4"/>
+      <w:startOverride w:val="5"/>
     </w:lvlOverride>
     <w:lvlOverride w:ilvl="5">
-      <w:startOverride w:val="4"/>
+      <w:startOverride w:val="5"/>
     </w:lvlOverride>
     <w:lvlOverride w:ilvl="6">
-      <w:startOverride w:val="4"/>
+      <w:startOverride w:val="5"/>
     </w:lvlOverride>
     <w:lvlOverride w:ilvl="7">
-      <w:startOverride w:val="4"/>
+      <w:startOverride w:val="5"/>
     </w:lvlOverride>
     <w:lvlOverride w:ilvl="8">
-      <w:startOverride w:val="4"/>
-    </w:lvlOverride>
-  </w:num>
-  <w:num w:numId="1012">
-    <w:abstractNumId w:val="99711"/>
-    <w:lvlOverride w:ilvl="0">
-      <w:startOverride w:val="1"/>
-    </w:lvlOverride>
-    <w:lvlOverride w:ilvl="1">
-      <w:startOverride w:val="1"/>
-    </w:lvlOverride>
-    <w:lvlOverride w:ilvl="2">
-      <w:startOverride w:val="1"/>
-    </w:lvlOverride>
-    <w:lvlOverride w:ilvl="3">
-      <w:startOverride w:val="1"/>
-    </w:lvlOverride>
-    <w:lvlOverride w:ilvl="4">
-      <w:startOverride w:val="1"/>
-    </w:lvlOverride>
-    <w:lvlOverride w:ilvl="5">
-      <w:startOverride w:val="1"/>
-    </w:lvlOverride>
-    <w:lvlOverride w:ilvl="6">
-      <w:startOverride w:val="1"/>
-    </w:lvlOverride>
-    <w:lvlOverride w:ilvl="7">
-      <w:startOverride w:val="1"/>
-    </w:lvlOverride>
-    <w:lvlOverride w:ilvl="8">
-      <w:startOverride w:val="1"/>
+      <w:startOverride w:val="5"/>
     </w:lvlOverride>
   </w:num>
   <w:num w:numId="1013">
@@ -5294,6 +5563,36 @@
     </w:lvlOverride>
   </w:num>
   <w:num w:numId="1014">
+    <w:abstractNumId w:val="99711"/>
+    <w:lvlOverride w:ilvl="0">
+      <w:startOverride w:val="1"/>
+    </w:lvlOverride>
+    <w:lvlOverride w:ilvl="1">
+      <w:startOverride w:val="1"/>
+    </w:lvlOverride>
+    <w:lvlOverride w:ilvl="2">
+      <w:startOverride w:val="1"/>
+    </w:lvlOverride>
+    <w:lvlOverride w:ilvl="3">
+      <w:startOverride w:val="1"/>
+    </w:lvlOverride>
+    <w:lvlOverride w:ilvl="4">
+      <w:startOverride w:val="1"/>
+    </w:lvlOverride>
+    <w:lvlOverride w:ilvl="5">
+      <w:startOverride w:val="1"/>
+    </w:lvlOverride>
+    <w:lvlOverride w:ilvl="6">
+      <w:startOverride w:val="1"/>
+    </w:lvlOverride>
+    <w:lvlOverride w:ilvl="7">
+      <w:startOverride w:val="1"/>
+    </w:lvlOverride>
+    <w:lvlOverride w:ilvl="8">
+      <w:startOverride w:val="1"/>
+    </w:lvlOverride>
+  </w:num>
+  <w:num w:numId="1015">
     <w:abstractNumId w:val="99712"/>
     <w:lvlOverride w:ilvl="0">
       <w:startOverride w:val="2"/>
@@ -5321,36 +5620,6 @@
     </w:lvlOverride>
     <w:lvlOverride w:ilvl="8">
       <w:startOverride w:val="2"/>
-    </w:lvlOverride>
-  </w:num>
-  <w:num w:numId="1015">
-    <w:abstractNumId w:val="99711"/>
-    <w:lvlOverride w:ilvl="0">
-      <w:startOverride w:val="1"/>
-    </w:lvlOverride>
-    <w:lvlOverride w:ilvl="1">
-      <w:startOverride w:val="1"/>
-    </w:lvlOverride>
-    <w:lvlOverride w:ilvl="2">
-      <w:startOverride w:val="1"/>
-    </w:lvlOverride>
-    <w:lvlOverride w:ilvl="3">
-      <w:startOverride w:val="1"/>
-    </w:lvlOverride>
-    <w:lvlOverride w:ilvl="4">
-      <w:startOverride w:val="1"/>
-    </w:lvlOverride>
-    <w:lvlOverride w:ilvl="5">
-      <w:startOverride w:val="1"/>
-    </w:lvlOverride>
-    <w:lvlOverride w:ilvl="6">
-      <w:startOverride w:val="1"/>
-    </w:lvlOverride>
-    <w:lvlOverride w:ilvl="7">
-      <w:startOverride w:val="1"/>
-    </w:lvlOverride>
-    <w:lvlOverride w:ilvl="8">
-      <w:startOverride w:val="1"/>
     </w:lvlOverride>
   </w:num>
   <w:num w:numId="1016">
@@ -5414,6 +5683,36 @@
     </w:lvlOverride>
   </w:num>
   <w:num w:numId="1018">
+    <w:abstractNumId w:val="99711"/>
+    <w:lvlOverride w:ilvl="0">
+      <w:startOverride w:val="1"/>
+    </w:lvlOverride>
+    <w:lvlOverride w:ilvl="1">
+      <w:startOverride w:val="1"/>
+    </w:lvlOverride>
+    <w:lvlOverride w:ilvl="2">
+      <w:startOverride w:val="1"/>
+    </w:lvlOverride>
+    <w:lvlOverride w:ilvl="3">
+      <w:startOverride w:val="1"/>
+    </w:lvlOverride>
+    <w:lvlOverride w:ilvl="4">
+      <w:startOverride w:val="1"/>
+    </w:lvlOverride>
+    <w:lvlOverride w:ilvl="5">
+      <w:startOverride w:val="1"/>
+    </w:lvlOverride>
+    <w:lvlOverride w:ilvl="6">
+      <w:startOverride w:val="1"/>
+    </w:lvlOverride>
+    <w:lvlOverride w:ilvl="7">
+      <w:startOverride w:val="1"/>
+    </w:lvlOverride>
+    <w:lvlOverride w:ilvl="8">
+      <w:startOverride w:val="1"/>
+    </w:lvlOverride>
+  </w:num>
+  <w:num w:numId="1019">
     <w:abstractNumId w:val="99712"/>
     <w:lvlOverride w:ilvl="0">
       <w:startOverride w:val="2"/>
@@ -5441,36 +5740,6 @@
     </w:lvlOverride>
     <w:lvlOverride w:ilvl="8">
       <w:startOverride w:val="2"/>
-    </w:lvlOverride>
-  </w:num>
-  <w:num w:numId="1019">
-    <w:abstractNumId w:val="99711"/>
-    <w:lvlOverride w:ilvl="0">
-      <w:startOverride w:val="1"/>
-    </w:lvlOverride>
-    <w:lvlOverride w:ilvl="1">
-      <w:startOverride w:val="1"/>
-    </w:lvlOverride>
-    <w:lvlOverride w:ilvl="2">
-      <w:startOverride w:val="1"/>
-    </w:lvlOverride>
-    <w:lvlOverride w:ilvl="3">
-      <w:startOverride w:val="1"/>
-    </w:lvlOverride>
-    <w:lvlOverride w:ilvl="4">
-      <w:startOverride w:val="1"/>
-    </w:lvlOverride>
-    <w:lvlOverride w:ilvl="5">
-      <w:startOverride w:val="1"/>
-    </w:lvlOverride>
-    <w:lvlOverride w:ilvl="6">
-      <w:startOverride w:val="1"/>
-    </w:lvlOverride>
-    <w:lvlOverride w:ilvl="7">
-      <w:startOverride w:val="1"/>
-    </w:lvlOverride>
-    <w:lvlOverride w:ilvl="8">
-      <w:startOverride w:val="1"/>
     </w:lvlOverride>
   </w:num>
   <w:num w:numId="1020">
@@ -5534,6 +5803,36 @@
     </w:lvlOverride>
   </w:num>
   <w:num w:numId="1022">
+    <w:abstractNumId w:val="99711"/>
+    <w:lvlOverride w:ilvl="0">
+      <w:startOverride w:val="1"/>
+    </w:lvlOverride>
+    <w:lvlOverride w:ilvl="1">
+      <w:startOverride w:val="1"/>
+    </w:lvlOverride>
+    <w:lvlOverride w:ilvl="2">
+      <w:startOverride w:val="1"/>
+    </w:lvlOverride>
+    <w:lvlOverride w:ilvl="3">
+      <w:startOverride w:val="1"/>
+    </w:lvlOverride>
+    <w:lvlOverride w:ilvl="4">
+      <w:startOverride w:val="1"/>
+    </w:lvlOverride>
+    <w:lvlOverride w:ilvl="5">
+      <w:startOverride w:val="1"/>
+    </w:lvlOverride>
+    <w:lvlOverride w:ilvl="6">
+      <w:startOverride w:val="1"/>
+    </w:lvlOverride>
+    <w:lvlOverride w:ilvl="7">
+      <w:startOverride w:val="1"/>
+    </w:lvlOverride>
+    <w:lvlOverride w:ilvl="8">
+      <w:startOverride w:val="1"/>
+    </w:lvlOverride>
+  </w:num>
+  <w:num w:numId="1023">
     <w:abstractNumId w:val="991"/>
   </w:num>
 </w:numbering>

</xml_diff>

<commit_message>
studies/ai-governance: v0.5 — real department structure; AI changes no existing process; federated KB
Operator supplied SRF-JRMC Codes 100-1200 (no 400/800/1000). Embedded the department->evaluation map (S6.a), deleted the overbearing 'route technical to CHENG' language (responsibility follows established command lines; S3.e capstone), flipped S5 to a federated knowledge base (each dept owns/feeds/controls its repository; 200 owns the technical library + derivative classifier; CIO/ISSM = platform custodian), generalized records/directives to the command SORM. New _glossary.md; routing package rebuilt from v0.5; reference memory for the department structure.

Co-Authored-By: Claude Opus 4.8 (1M context) <noreply@anthropic.com>
</commit_message>
<xml_diff>
--- a/studies/ai-governance/03_instruction/routing/SRF-JRMC-INST-5239.1-DRAFT-working-group.docx
+++ b/studies/ai-governance/03_instruction/routing/SRF-JRMC-INST-5239.1-DRAFT-working-group.docx
@@ -297,68 +297,25 @@
           <w:b/>
           <w:bCs/>
         </w:rPr>
-        <w:t xml:space="preserve">AI is decision support, not authority:</w:t>
-      </w:r>
-      <w:r>
-        <w:t xml:space="preserve"> </w:t>
-      </w:r>
-      <w:r>
-        <w:t xml:space="preserve">AI output is authoritatively evaluated by the</w:t>
-      </w:r>
-      <w:r>
-        <w:t xml:space="preserve"> </w:t>
-      </w:r>
-      <w:r>
-        <w:rPr>
-          <w:b/>
-          <w:bCs/>
-        </w:rPr>
-        <w:t xml:space="preserve">cognizant domain authority</w:t>
-      </w:r>
-      <w:r>
-        <w:t xml:space="preserve"> </w:t>
-      </w:r>
-      <w:r>
-        <w:t xml:space="preserve">(technical → CHENG chain, IT/security → CIO, business/</w:t>
-      </w:r>
-      <w:r>
-        <w:t xml:space="preserve"> </w:t>
-      </w:r>
-      <w:r>
-        <w:t xml:space="preserve">strategic → BSPO, and so on), and</w:t>
-      </w:r>
-      <w:r>
-        <w:t xml:space="preserve"> </w:t>
-      </w:r>
-      <w:r>
-        <w:rPr>
-          <w:b/>
-          <w:bCs/>
-        </w:rPr>
-        <w:t xml:space="preserve">each department designates an authoritative AI content</w:t>
-      </w:r>
-      <w:r>
-        <w:rPr>
-          <w:b/>
-          <w:bCs/>
-        </w:rPr>
-        <w:t xml:space="preserve"> </w:t>
-      </w:r>
-      <w:r>
-        <w:rPr>
-          <w:b/>
-          <w:bCs/>
-        </w:rPr>
-        <w:t xml:space="preserve">evaluator</w:t>
-      </w:r>
-      <w:r>
-        <w:t xml:space="preserve">. Anything technical always routes to the CHENG chain. AI output is always a</w:t>
-      </w:r>
-      <w:r>
-        <w:t xml:space="preserve"> </w:t>
-      </w:r>
-      <w:r>
-        <w:t xml:space="preserve">non-authoritative draft.</w:t>
+        <w:t xml:space="preserve">The AI changes no existing process.</w:t>
+      </w:r>
+      <w:r>
+        <w:t xml:space="preserve"> </w:t>
+      </w:r>
+      <w:r>
+        <w:t xml:space="preserve">It governs askSage use within the command’s</w:t>
+      </w:r>
+      <w:r>
+        <w:t xml:space="preserve"> </w:t>
+      </w:r>
+      <w:r>
+        <w:t xml:space="preserve">established authorities, quality, security, and records processes. Where it names who is</w:t>
+      </w:r>
+      <w:r>
+        <w:t xml:space="preserve"> </w:t>
+      </w:r>
+      <w:r>
+        <w:t xml:space="preserve">responsible, it restates the established line.</w:t>
       </w:r>
     </w:p>
     <w:p>
@@ -374,49 +331,74 @@
           <w:b/>
           <w:bCs/>
         </w:rPr>
-        <w:t xml:space="preserve">Governance is run through existing structures:</w:t>
-      </w:r>
-      <w:r>
-        <w:t xml:space="preserve"> </w:t>
-      </w:r>
-      <w:r>
-        <w:t xml:space="preserve">CIO/ISSM own IT and security; CHENG</w:t>
-      </w:r>
-      <w:r>
-        <w:t xml:space="preserve"> </w:t>
-      </w:r>
-      <w:r>
-        <w:t xml:space="preserve">chain owns technical use; Legal concurs on records;</w:t>
-      </w:r>
-      <w:r>
-        <w:t xml:space="preserve"> </w:t>
-      </w:r>
-      <w:r>
-        <w:rPr>
-          <w:b/>
-          <w:bCs/>
-        </w:rPr>
-        <w:t xml:space="preserve">Department Heads are the governance</w:t>
-      </w:r>
-      <w:r>
-        <w:rPr>
-          <w:b/>
-          <w:bCs/>
-        </w:rPr>
-        <w:t xml:space="preserve"> </w:t>
-      </w:r>
-      <w:r>
-        <w:rPr>
-          <w:b/>
-          <w:bCs/>
-        </w:rPr>
-        <w:t xml:space="preserve">forum, reviewing the use-case inventory quarterly.</w:t>
-      </w:r>
-      <w:r>
-        <w:t xml:space="preserve"> </w:t>
-      </w:r>
-      <w:r>
-        <w:t xml:space="preserve">No new board.</w:t>
+        <w:t xml:space="preserve">AI is decision support, not authority:</w:t>
+      </w:r>
+      <w:r>
+        <w:t xml:space="preserve"> </w:t>
+      </w:r>
+      <w:r>
+        <w:t xml:space="preserve">AI output is authoritatively evaluated by the</w:t>
+      </w:r>
+      <w:r>
+        <w:t xml:space="preserve"> </w:t>
+      </w:r>
+      <w:r>
+        <w:t xml:space="preserve">cognizant authority</w:t>
+      </w:r>
+      <w:r>
+        <w:t xml:space="preserve"> </w:t>
+      </w:r>
+      <w:r>
+        <w:rPr>
+          <w:b/>
+          <w:bCs/>
+        </w:rPr>
+        <w:t xml:space="preserve">along existing lines of responsibility</w:t>
+      </w:r>
+      <w:r>
+        <w:t xml:space="preserve"> </w:t>
+      </w:r>
+      <w:r>
+        <w:t xml:space="preserve">— the department that owns</w:t>
+      </w:r>
+      <w:r>
+        <w:t xml:space="preserve"> </w:t>
+      </w:r>
+      <w:r>
+        <w:t xml:space="preserve">that subject matter (the Code 100–1200 map is embedded in §6.a) — and</w:t>
+      </w:r>
+      <w:r>
+        <w:t xml:space="preserve"> </w:t>
+      </w:r>
+      <w:r>
+        <w:rPr>
+          <w:b/>
+          <w:bCs/>
+        </w:rPr>
+        <w:t xml:space="preserve">each department</w:t>
+      </w:r>
+      <w:r>
+        <w:rPr>
+          <w:b/>
+          <w:bCs/>
+        </w:rPr>
+        <w:t xml:space="preserve"> </w:t>
+      </w:r>
+      <w:r>
+        <w:rPr>
+          <w:b/>
+          <w:bCs/>
+        </w:rPr>
+        <w:t xml:space="preserve">designates an authoritative AI content evaluator</w:t>
+      </w:r>
+      <w:r>
+        <w:t xml:space="preserve">. AI output is always a non-authoritative</w:t>
+      </w:r>
+      <w:r>
+        <w:t xml:space="preserve"> </w:t>
+      </w:r>
+      <w:r>
+        <w:t xml:space="preserve">draft.</w:t>
       </w:r>
     </w:p>
     <w:p>
@@ -432,19 +414,31 @@
           <w:b/>
           <w:bCs/>
         </w:rPr>
-        <w:t xml:space="preserve">Out of scope:</w:t>
-      </w:r>
-      <w:r>
-        <w:t xml:space="preserve"> </w:t>
-      </w:r>
-      <w:r>
-        <w:t xml:space="preserve">digital supervision of any person; final technical/quality/contractual</w:t>
-      </w:r>
-      <w:r>
-        <w:t xml:space="preserve"> </w:t>
-      </w:r>
-      <w:r>
-        <w:t xml:space="preserve">authority.</w:t>
+        <w:t xml:space="preserve">Knowledge base is federated:</w:t>
+      </w:r>
+      <w:r>
+        <w:t xml:space="preserve"> </w:t>
+      </w:r>
+      <w:r>
+        <w:t xml:space="preserve">each department owns, feeds, and controls access to its</w:t>
+      </w:r>
+      <w:r>
+        <w:t xml:space="preserve"> </w:t>
+      </w:r>
+      <w:r>
+        <w:t xml:space="preserve">own repository; Code 200 owns the technical library and the derivative-classifier</w:t>
+      </w:r>
+      <w:r>
+        <w:t xml:space="preserve"> </w:t>
+      </w:r>
+      <w:r>
+        <w:t xml:space="preserve">screening; the CIO/ISSM is custodian of the platform (connection registry, access,</w:t>
+      </w:r>
+      <w:r>
+        <w:t xml:space="preserve"> </w:t>
+      </w:r>
+      <w:r>
+        <w:t xml:space="preserve">monitoring), not the content.</w:t>
       </w:r>
     </w:p>
     <w:p>
@@ -460,6 +454,92 @@
           <w:b/>
           <w:bCs/>
         </w:rPr>
+        <w:t xml:space="preserve">Governance is run through existing structures:</w:t>
+      </w:r>
+      <w:r>
+        <w:t xml:space="preserve"> </w:t>
+      </w:r>
+      <w:r>
+        <w:t xml:space="preserve">Legal concurs on records;</w:t>
+      </w:r>
+      <w:r>
+        <w:t xml:space="preserve"> </w:t>
+      </w:r>
+      <w:r>
+        <w:rPr>
+          <w:b/>
+          <w:bCs/>
+        </w:rPr>
+        <w:t xml:space="preserve">Department</w:t>
+      </w:r>
+      <w:r>
+        <w:rPr>
+          <w:b/>
+          <w:bCs/>
+        </w:rPr>
+        <w:t xml:space="preserve"> </w:t>
+      </w:r>
+      <w:r>
+        <w:rPr>
+          <w:b/>
+          <w:bCs/>
+        </w:rPr>
+        <w:t xml:space="preserve">Heads are the governance forum, reviewing the use-case inventory quarterly.</w:t>
+      </w:r>
+      <w:r>
+        <w:t xml:space="preserve"> </w:t>
+      </w:r>
+      <w:r>
+        <w:t xml:space="preserve">No new board.</w:t>
+      </w:r>
+      <w:r>
+        <w:t xml:space="preserve"> </w:t>
+      </w:r>
+      <w:r>
+        <w:t xml:space="preserve">Records and directives are managed per the command SORM.</w:t>
+      </w:r>
+    </w:p>
+    <w:p>
+      <w:pPr>
+        <w:pStyle w:val="Compact"/>
+        <w:numPr>
+          <w:ilvl w:val="0"/>
+          <w:numId w:val="1001"/>
+        </w:numPr>
+      </w:pPr>
+      <w:r>
+        <w:rPr>
+          <w:b/>
+          <w:bCs/>
+        </w:rPr>
+        <w:t xml:space="preserve">Out of scope:</w:t>
+      </w:r>
+      <w:r>
+        <w:t xml:space="preserve"> </w:t>
+      </w:r>
+      <w:r>
+        <w:t xml:space="preserve">digital supervision of any person; final technical/quality/contractual</w:t>
+      </w:r>
+      <w:r>
+        <w:t xml:space="preserve"> </w:t>
+      </w:r>
+      <w:r>
+        <w:t xml:space="preserve">authority.</w:t>
+      </w:r>
+    </w:p>
+    <w:p>
+      <w:pPr>
+        <w:pStyle w:val="Compact"/>
+        <w:numPr>
+          <w:ilvl w:val="0"/>
+          <w:numId w:val="1001"/>
+        </w:numPr>
+      </w:pPr>
+      <w:r>
+        <w:rPr>
+          <w:b/>
+          <w:bCs/>
+        </w:rPr>
         <w:t xml:space="preserve">Other settled calls:</w:t>
       </w:r>
       <w:r>
@@ -560,7 +640,13 @@
         </w:numPr>
       </w:pPr>
       <w:r>
-        <w:t xml:space="preserve">Name the cognizant Security Classification Guide(s) (§4.e).</w:t>
+        <w:t xml:space="preserve">Name the governing SORM / records-management reference (§5.a) and the cognizant Security</w:t>
+      </w:r>
+      <w:r>
+        <w:t xml:space="preserve"> </w:t>
+      </w:r>
+      <w:r>
+        <w:t xml:space="preserve">Classification Guide(s) (§4.e).</w:t>
       </w:r>
     </w:p>
     <w:p>
@@ -572,7 +658,37 @@
         </w:numPr>
       </w:pPr>
       <w:r>
-        <w:t xml:space="preserve">Assign the knowledge-base recertification owner and cadence (§5.b).</w:t>
+        <w:t xml:space="preserve">Each department names its authoritative AI content evaluator; confirm the Technical</w:t>
+      </w:r>
+      <w:r>
+        <w:t xml:space="preserve"> </w:t>
+      </w:r>
+      <w:r>
+        <w:t xml:space="preserve">Warrant Holder billets within Code 200 (§6).</w:t>
+      </w:r>
+      <w:r>
+        <w:t xml:space="preserve"> </w:t>
+      </w:r>
+      <w:r>
+        <w:rPr>
+          <w:i/>
+          <w:iCs/>
+        </w:rPr>
+        <w:t xml:space="preserve">(The Code 100–1200 structure is already</w:t>
+      </w:r>
+      <w:r>
+        <w:rPr>
+          <w:i/>
+          <w:iCs/>
+        </w:rPr>
+        <w:t xml:space="preserve"> </w:t>
+      </w:r>
+      <w:r>
+        <w:rPr>
+          <w:i/>
+          <w:iCs/>
+        </w:rPr>
+        <w:t xml:space="preserve">embedded in §6.a.)</w:t>
       </w:r>
     </w:p>
     <w:p>
@@ -584,55 +700,7 @@
         </w:numPr>
       </w:pPr>
       <w:r>
-        <w:t xml:space="preserve">Confirm the derivative-classifier screening process and name the screened</w:t>
-      </w:r>
-      <w:r>
-        <w:t xml:space="preserve"> </w:t>
-      </w:r>
-      <w:r>
-        <w:t xml:space="preserve">authoritative-corpus source the AI indexes from (§5.c).</w:t>
-      </w:r>
-    </w:p>
-    <w:p>
-      <w:pPr>
-        <w:pStyle w:val="Compact"/>
-        <w:numPr>
-          <w:ilvl w:val="0"/>
-          <w:numId w:val="1002"/>
-        </w:numPr>
-      </w:pPr>
-      <w:r>
-        <w:t xml:space="preserve">Complete the domain-to-authority mapping (technical → CHENG, IT → CIO, business → BSPO,</w:t>
-      </w:r>
-      <w:r>
-        <w:t xml:space="preserve"> </w:t>
-      </w:r>
-      <w:r>
-        <w:t xml:space="preserve">plus the rest of the organization) and confirm the engineering/QA codes and Technical</w:t>
-      </w:r>
-      <w:r>
-        <w:t xml:space="preserve"> </w:t>
-      </w:r>
-      <w:r>
-        <w:t xml:space="preserve">Warrant Holder assignments; each department names its authoritative AI content evaluator</w:t>
-      </w:r>
-      <w:r>
-        <w:t xml:space="preserve"> </w:t>
-      </w:r>
-      <w:r>
-        <w:t xml:space="preserve">(§6.a–b).</w:t>
-      </w:r>
-    </w:p>
-    <w:p>
-      <w:pPr>
-        <w:pStyle w:val="Compact"/>
-        <w:numPr>
-          <w:ilvl w:val="0"/>
-          <w:numId w:val="1002"/>
-        </w:numPr>
-      </w:pPr>
-      <w:r>
-        <w:t xml:space="preserve">Name the authoritative source-of-record system used for out-of-band verification (§6.c).</w:t>
+        <w:t xml:space="preserve">Name the authoritative source-of-record system used for out-of-band verification (§6.d).</w:t>
       </w:r>
     </w:p>
     <w:p>
@@ -1653,6 +1721,51 @@
         <w:t xml:space="preserve">(Section 8).</w:t>
       </w:r>
     </w:p>
+    <w:p>
+      <w:pPr>
+        <w:numPr>
+          <w:ilvl w:val="0"/>
+          <w:numId w:val="1003"/>
+        </w:numPr>
+      </w:pPr>
+      <w:r>
+        <w:rPr>
+          <w:b/>
+          <w:bCs/>
+        </w:rPr>
+        <w:t xml:space="preserve">This instruction changes no existing process.</w:t>
+      </w:r>
+      <w:r>
+        <w:t xml:space="preserve"> </w:t>
+      </w:r>
+      <w:r>
+        <w:t xml:space="preserve">It does not alter the command’s</w:t>
+      </w:r>
+      <w:r>
+        <w:t xml:space="preserve"> </w:t>
+      </w:r>
+      <w:r>
+        <w:t xml:space="preserve">existing authorities, responsibilities, technical authority, quality, security, or records</w:t>
+      </w:r>
+      <w:r>
+        <w:t xml:space="preserve"> </w:t>
+      </w:r>
+      <w:r>
+        <w:t xml:space="preserve">processes, or its lines of responsibility. It governs the use of askSage within them. Where</w:t>
+      </w:r>
+      <w:r>
+        <w:t xml:space="preserve"> </w:t>
+      </w:r>
+      <w:r>
+        <w:t xml:space="preserve">this instruction names who is responsible for something, it restates the established line,</w:t>
+      </w:r>
+      <w:r>
+        <w:t xml:space="preserve"> </w:t>
+      </w:r>
+      <w:r>
+        <w:t xml:space="preserve">it does not create a new one.</w:t>
+      </w:r>
+    </w:p>
     <w:bookmarkEnd w:id="16"/>
     <w:bookmarkStart w:id="17" w:name="authorized-and-prohibited-information"/>
     <w:p>
@@ -2114,6 +2227,7 @@
     </w:p>
     <w:p>
       <w:pPr>
+        <w:pStyle w:val="Compact"/>
         <w:numPr>
           <w:ilvl w:val="0"/>
           <w:numId w:val="1007"/>
@@ -2124,64 +2238,74 @@
           <w:b/>
           <w:bCs/>
         </w:rPr>
-        <w:t xml:space="preserve">Centralized, version-controlled sources.</w:t>
-      </w:r>
-      <w:r>
-        <w:t xml:space="preserve"> </w:t>
-      </w:r>
-      <w:r>
-        <w:t xml:space="preserve">Authoritative references the command</w:t>
-      </w:r>
-      <w:r>
-        <w:t xml:space="preserve"> </w:t>
-      </w:r>
-      <w:r>
-        <w:t xml:space="preserve">preloads for askSage (the JFMM, NAVSEA Standard Items, technical manuals) are centrally</w:t>
-      </w:r>
-      <w:r>
-        <w:t xml:space="preserve"> </w:t>
-      </w:r>
-      <w:r>
-        <w:t xml:space="preserve">indexed by the CIO/ISSM, not uploaded ad hoc by individual users. This protects accuracy</w:t>
-      </w:r>
-      <w:r>
-        <w:t xml:space="preserve"> </w:t>
-      </w:r>
-      <w:r>
-        <w:t xml:space="preserve">and conserves compute (Annex A).</w:t>
-      </w:r>
-    </w:p>
-    <w:p>
-      <w:pPr>
-        <w:numPr>
-          <w:ilvl w:val="0"/>
-          <w:numId w:val="1007"/>
-        </w:numPr>
-      </w:pPr>
-      <w:r>
-        <w:rPr>
-          <w:b/>
-          <w:bCs/>
-        </w:rPr>
-        <w:t xml:space="preserve">Recertification.</w:t>
-      </w:r>
-      <w:r>
-        <w:t xml:space="preserve"> </w:t>
-      </w:r>
-      <w:r>
-        <w:t xml:space="preserve">A stale authoritative source is a safety hazard, not merely an</w:t>
-      </w:r>
-      <w:r>
-        <w:t xml:space="preserve"> </w:t>
-      </w:r>
-      <w:r>
-        <w:t xml:space="preserve">error. Indexed references are recertified on a defined cycle and upon change transmittal,</w:t>
-      </w:r>
-      <w:r>
-        <w:t xml:space="preserve"> </w:t>
-      </w:r>
-      <w:r>
-        <w:t xml:space="preserve">with a named owner, so the AI never reasons from a superseded version.</w:t>
+        <w:t xml:space="preserve">Departments own their repositories; the command owns the platform.</w:t>
+      </w:r>
+      <w:r>
+        <w:t xml:space="preserve"> </w:t>
+      </w:r>
+      <w:r>
+        <w:t xml:space="preserve">Each department</w:t>
+      </w:r>
+      <w:r>
+        <w:t xml:space="preserve"> </w:t>
+      </w:r>
+      <w:r>
+        <w:t xml:space="preserve">owns, feeds, and controls access to its own document repository (its SharePoint or</w:t>
+      </w:r>
+      <w:r>
+        <w:t xml:space="preserve"> </w:t>
+      </w:r>
+      <w:r>
+        <w:t xml:space="preserve">equivalent) and is responsible for the content and releasability of what it places there.</w:t>
+      </w:r>
+      <w:r>
+        <w:t xml:space="preserve"> </w:t>
+      </w:r>
+      <w:r>
+        <w:t xml:space="preserve">askSage draws on those repositories under each user’s existing access. The Command</w:t>
+      </w:r>
+      <w:r>
+        <w:t xml:space="preserve"> </w:t>
+      </w:r>
+      <w:r>
+        <w:t xml:space="preserve">Information Officer (CIO) and Information System Security Manager (ISSM) are custodians of</w:t>
+      </w:r>
+      <w:r>
+        <w:t xml:space="preserve"> </w:t>
+      </w:r>
+      <w:r>
+        <w:t xml:space="preserve">the</w:t>
+      </w:r>
+      <w:r>
+        <w:t xml:space="preserve"> </w:t>
+      </w:r>
+      <w:r>
+        <w:rPr>
+          <w:b/>
+          <w:bCs/>
+        </w:rPr>
+        <w:t xml:space="preserve">platform</w:t>
+      </w:r>
+      <w:r>
+        <w:t xml:space="preserve">: they maintain a registry of the repositories connected to askSage and</w:t>
+      </w:r>
+      <w:r>
+        <w:t xml:space="preserve"> </w:t>
+      </w:r>
+      <w:r>
+        <w:t xml:space="preserve">manage platform access and identity, but they do not own the content. Records, directives,</w:t>
+      </w:r>
+      <w:r>
+        <w:t xml:space="preserve"> </w:t>
+      </w:r>
+      <w:r>
+        <w:t xml:space="preserve">and information are managed in accordance with the command’s Standard Organization and</w:t>
+      </w:r>
+      <w:r>
+        <w:t xml:space="preserve"> </w:t>
+      </w:r>
+      <w:r>
+        <w:t xml:space="preserve">Regulations Manual (SORM) and existing records program.</w:t>
       </w:r>
     </w:p>
     <w:p>
@@ -2199,12 +2323,11 @@
         <w:t xml:space="preserve"> </w:t>
       </w:r>
       <w:r>
-        <w:t xml:space="preserve">assign the recertification owner and cadence.</w:t>
-      </w:r>
-    </w:p>
-    <w:p>
-      <w:pPr>
-        <w:pStyle w:val="Compact"/>
+        <w:t xml:space="preserve">name the governing SORM / records-management reference.</w:t>
+      </w:r>
+    </w:p>
+    <w:p>
+      <w:pPr>
         <w:numPr>
           <w:ilvl w:val="0"/>
           <w:numId w:val="1008"/>
@@ -2215,31 +2338,88 @@
           <w:b/>
           <w:bCs/>
         </w:rPr>
-        <w:t xml:space="preserve">Releasability rests on the command’s existing screening, not a new AI mechanism.</w:t>
-      </w:r>
-      <w:r>
-        <w:t xml:space="preserve"> </w:t>
-      </w:r>
-      <w:r>
-        <w:t xml:space="preserve">SRF-JRMC already bars NOFORN material from its network share and screens all technical</w:t>
-      </w:r>
-      <w:r>
-        <w:t xml:space="preserve"> </w:t>
-      </w:r>
-      <w:r>
-        <w:t xml:space="preserve">direction (drawings, policy, manuals) through a derivative classifier, who redacts or</w:t>
-      </w:r>
-      <w:r>
-        <w:t xml:space="preserve"> </w:t>
-      </w:r>
-      <w:r>
-        <w:t xml:space="preserve">denies any unreleasable information before it reaches the share. The askSage knowledge</w:t>
-      </w:r>
-      <w:r>
-        <w:t xml:space="preserve"> </w:t>
-      </w:r>
-      <w:r>
-        <w:t xml:space="preserve">base</w:t>
+        <w:t xml:space="preserve">Authoritative technical sources and recertification.</w:t>
+      </w:r>
+      <w:r>
+        <w:t xml:space="preserve"> </w:t>
+      </w:r>
+      <w:r>
+        <w:t xml:space="preserve">Code 200 (Engineering and</w:t>
+      </w:r>
+      <w:r>
+        <w:t xml:space="preserve"> </w:t>
+      </w:r>
+      <w:r>
+        <w:t xml:space="preserve">Planning) owns the authoritative technical library — the Joint Fleet Maintenance Manual</w:t>
+      </w:r>
+      <w:r>
+        <w:t xml:space="preserve"> </w:t>
+      </w:r>
+      <w:r>
+        <w:t xml:space="preserve">(JFMM), NAVSEA Standard Items, and technical manuals — and keeps it current. A stale</w:t>
+      </w:r>
+      <w:r>
+        <w:t xml:space="preserve"> </w:t>
+      </w:r>
+      <w:r>
+        <w:t xml:space="preserve">authoritative source is a safety hazard, not merely an error, so each repository owner</w:t>
+      </w:r>
+      <w:r>
+        <w:t xml:space="preserve"> </w:t>
+      </w:r>
+      <w:r>
+        <w:t xml:space="preserve">recertifies its content on a defined cycle and upon change transmittal, so the AI never</w:t>
+      </w:r>
+      <w:r>
+        <w:t xml:space="preserve"> </w:t>
+      </w:r>
+      <w:r>
+        <w:t xml:space="preserve">reasons from a superseded version.</w:t>
+      </w:r>
+    </w:p>
+    <w:p>
+      <w:pPr>
+        <w:numPr>
+          <w:ilvl w:val="0"/>
+          <w:numId w:val="1008"/>
+        </w:numPr>
+      </w:pPr>
+      <w:r>
+        <w:rPr>
+          <w:b/>
+          <w:bCs/>
+        </w:rPr>
+        <w:t xml:space="preserve">Releasability rests on existing screening, by the owning department.</w:t>
+      </w:r>
+      <w:r>
+        <w:t xml:space="preserve"> </w:t>
+      </w:r>
+      <w:r>
+        <w:t xml:space="preserve">Each department</w:t>
+      </w:r>
+      <w:r>
+        <w:t xml:space="preserve"> </w:t>
+      </w:r>
+      <w:r>
+        <w:t xml:space="preserve">is responsible for the releasability of its own repository. For technical direction</w:t>
+      </w:r>
+      <w:r>
+        <w:t xml:space="preserve"> </w:t>
+      </w:r>
+      <w:r>
+        <w:t xml:space="preserve">(drawings, policy, manuals), Code 200 already screens content through a derivative</w:t>
+      </w:r>
+      <w:r>
+        <w:t xml:space="preserve"> </w:t>
+      </w:r>
+      <w:r>
+        <w:t xml:space="preserve">classifier, who redacts or denies any unreleasable information, and NOFORN is already barred</w:t>
+      </w:r>
+      <w:r>
+        <w:t xml:space="preserve"> </w:t>
+      </w:r>
+      <w:r>
+        <w:t xml:space="preserve">from the command’s network share. The askSage knowledge base</w:t>
       </w:r>
       <w:r>
         <w:t xml:space="preserve"> </w:t>
@@ -2255,19 +2435,19 @@
         <w:t xml:space="preserve"> </w:t>
       </w:r>
       <w:r>
-        <w:t xml:space="preserve">that control: it shall index only from the command’s already-screened</w:t>
-      </w:r>
-      <w:r>
-        <w:t xml:space="preserve"> </w:t>
-      </w:r>
-      <w:r>
-        <w:t xml:space="preserve">authoritative corpus. The AI is neither a new releasability authority nor a substitute</w:t>
-      </w:r>
-      <w:r>
-        <w:t xml:space="preserve"> </w:t>
-      </w:r>
-      <w:r>
-        <w:t xml:space="preserve">for the derivative classifier. The one new risk is that the AI could become a</w:t>
+        <w:t xml:space="preserve">these controls;</w:t>
+      </w:r>
+      <w:r>
+        <w:t xml:space="preserve"> </w:t>
+      </w:r>
+      <w:r>
+        <w:t xml:space="preserve">the AI is neither a new releasability authority nor a substitute for the derivative</w:t>
+      </w:r>
+      <w:r>
+        <w:t xml:space="preserve"> </w:t>
+      </w:r>
+      <w:r>
+        <w:t xml:space="preserve">classifier. The one new risk is that the AI could become a</w:t>
       </w:r>
       <w:r>
         <w:t xml:space="preserve"> </w:t>
@@ -2283,67 +2463,29 @@
         <w:t xml:space="preserve"> </w:t>
       </w:r>
       <w:r>
-        <w:t xml:space="preserve">of</w:t>
-      </w:r>
-      <w:r>
-        <w:t xml:space="preserve"> </w:t>
-      </w:r>
-      <w:r>
-        <w:t xml:space="preserve">that screening, so</w:t>
-      </w:r>
-      <w:r>
-        <w:t xml:space="preserve"> </w:t>
-      </w:r>
-      <w:r>
-        <w:rPr>
-          <w:b/>
-          <w:bCs/>
-        </w:rPr>
-        <w:t xml:space="preserve">ad hoc ingestion of un-screened source documents into askSage is</w:t>
-      </w:r>
-      <w:r>
-        <w:rPr>
-          <w:b/>
-          <w:bCs/>
-        </w:rPr>
-        <w:t xml:space="preserve"> </w:t>
-      </w:r>
-      <w:r>
-        <w:rPr>
-          <w:b/>
-          <w:bCs/>
-        </w:rPr>
-        <w:t xml:space="preserve">prohibited</w:t>
-      </w:r>
-      <w:r>
-        <w:t xml:space="preserve"> </w:t>
-      </w:r>
-      <w:r>
-        <w:t xml:space="preserve">— source material enters the knowledge base only after the existing</w:t>
-      </w:r>
-      <w:r>
-        <w:t xml:space="preserve"> </w:t>
-      </w:r>
-      <w:r>
-        <w:t xml:space="preserve">screening, through the centralized index (5.a).</w:t>
-      </w:r>
-    </w:p>
-    <w:p>
-      <w:pPr>
-        <w:pStyle w:val="BlockText"/>
-      </w:pPr>
-      <w:r>
-        <w:rPr>
-          <w:b/>
-          <w:bCs/>
-        </w:rPr>
-        <w:t xml:space="preserve">Working group to resolve:</w:t>
-      </w:r>
-      <w:r>
-        <w:t xml:space="preserve"> </w:t>
-      </w:r>
-      <w:r>
-        <w:t xml:space="preserve">confirm the screening process and name the screened authoritative-corpus source.</w:t>
+        <w:t xml:space="preserve">of that screening, so</w:t>
+      </w:r>
+      <w:r>
+        <w:t xml:space="preserve"> </w:t>
+      </w:r>
+      <w:r>
+        <w:rPr>
+          <w:b/>
+          <w:bCs/>
+        </w:rPr>
+        <w:t xml:space="preserve">ad hoc ingestion of un-screened documents into askSage is prohibited</w:t>
+      </w:r>
+      <w:r>
+        <w:t xml:space="preserve"> </w:t>
+      </w:r>
+      <w:r>
+        <w:t xml:space="preserve">— material enters a</w:t>
+      </w:r>
+      <w:r>
+        <w:t xml:space="preserve"> </w:t>
+      </w:r>
+      <w:r>
+        <w:t xml:space="preserve">repository only through the owning department’s established feed.</w:t>
       </w:r>
     </w:p>
     <w:bookmarkEnd w:id="18"/>
@@ -2369,36 +2511,435 @@
           <w:b/>
           <w:bCs/>
         </w:rPr>
-        <w:t xml:space="preserve">AI output is authoritatively evaluated by the cognizant domain authority.</w:t>
-      </w:r>
-      <w:r>
-        <w:t xml:space="preserve"> </w:t>
-      </w:r>
-      <w:r>
-        <w:t xml:space="preserve">No AI</w:t>
-      </w:r>
-      <w:r>
-        <w:t xml:space="preserve"> </w:t>
-      </w:r>
-      <w:r>
-        <w:t xml:space="preserve">output is authoritative on its own. A qualified human who owns the relevant subject matter</w:t>
-      </w:r>
-      <w:r>
-        <w:t xml:space="preserve"> </w:t>
-      </w:r>
-      <w:r>
-        <w:t xml:space="preserve">must evaluate AI-produced content before it is used or released, and the cognizant</w:t>
-      </w:r>
-      <w:r>
-        <w:t xml:space="preserve"> </w:t>
-      </w:r>
-      <w:r>
-        <w:t xml:space="preserve">authority follows the content, not the tool that produced it:</w:t>
-      </w:r>
-    </w:p>
-    <w:p>
-      <w:pPr>
-        <w:pStyle w:val="Compact"/>
+        <w:t xml:space="preserve">AI output is authoritatively evaluated by the cognizant authority, along the command’s</w:t>
+      </w:r>
+      <w:r>
+        <w:rPr>
+          <w:b/>
+          <w:bCs/>
+        </w:rPr>
+        <w:t xml:space="preserve"> </w:t>
+      </w:r>
+      <w:r>
+        <w:rPr>
+          <w:b/>
+          <w:bCs/>
+        </w:rPr>
+        <w:t xml:space="preserve">existing lines of responsibility.</w:t>
+      </w:r>
+      <w:r>
+        <w:t xml:space="preserve"> </w:t>
+      </w:r>
+      <w:r>
+        <w:t xml:space="preserve">No AI output is authoritative on its own. A qualified</w:t>
+      </w:r>
+      <w:r>
+        <w:t xml:space="preserve"> </w:t>
+      </w:r>
+      <w:r>
+        <w:t xml:space="preserve">person who owns the relevant subject matter evaluates AI-produced content before it is used</w:t>
+      </w:r>
+      <w:r>
+        <w:t xml:space="preserve"> </w:t>
+      </w:r>
+      <w:r>
+        <w:t xml:space="preserve">or released — the same person who would own that work product if a human had produced it.</w:t>
+      </w:r>
+      <w:r>
+        <w:t xml:space="preserve"> </w:t>
+      </w:r>
+      <w:r>
+        <w:t xml:space="preserve">askSage does not change who is responsible; responsibility follows the established command</w:t>
+      </w:r>
+      <w:r>
+        <w:t xml:space="preserve"> </w:t>
+      </w:r>
+      <w:r>
+        <w:t xml:space="preserve">organization:</w:t>
+      </w:r>
+    </w:p>
+    <w:tbl>
+      <w:tblPr>
+        <w:tblStyle w:val="Table"/>
+        <w:tblW w:type="pct" w:w="5000"/>
+        <w:tblLayout w:type="fixed"/>
+        <w:tblLook w:firstRow="1" w:lastRow="0" w:firstColumn="0" w:lastColumn="0" w:noHBand="0" w:noVBand="0" w:val="0020"/>
+      </w:tblPr>
+      <w:tblGrid>
+        <w:gridCol w:w="931"/>
+        <w:gridCol w:w="1863"/>
+        <w:gridCol w:w="5124"/>
+      </w:tblGrid>
+      <w:tr>
+        <w:trPr>
+          <w:tblHeader w:val="on"/>
+        </w:trPr>
+        <w:tc>
+          <w:tcPr/>
+          <w:p>
+            <w:pPr>
+              <w:pStyle w:val="Compact"/>
+            </w:pPr>
+            <w:r>
+              <w:t xml:space="preserve">Code</w:t>
+            </w:r>
+          </w:p>
+        </w:tc>
+        <w:tc>
+          <w:tcPr/>
+          <w:p>
+            <w:pPr>
+              <w:pStyle w:val="Compact"/>
+            </w:pPr>
+            <w:r>
+              <w:t xml:space="preserve">Department</w:t>
+            </w:r>
+          </w:p>
+        </w:tc>
+        <w:tc>
+          <w:tcPr/>
+          <w:p>
+            <w:pPr>
+              <w:pStyle w:val="Compact"/>
+            </w:pPr>
+            <w:r>
+              <w:t xml:space="preserve">Authoritative for AI content in</w:t>
+            </w:r>
+          </w:p>
+        </w:tc>
+      </w:tr>
+      <w:tr>
+        <w:tc>
+          <w:tcPr/>
+          <w:p>
+            <w:pPr>
+              <w:pStyle w:val="Compact"/>
+            </w:pPr>
+            <w:r>
+              <w:t xml:space="preserve">100</w:t>
+            </w:r>
+          </w:p>
+        </w:tc>
+        <w:tc>
+          <w:tcPr/>
+          <w:p>
+            <w:pPr>
+              <w:pStyle w:val="Compact"/>
+            </w:pPr>
+            <w:r>
+              <w:t xml:space="preserve">Command (CO, XO, Executive Director, Legal, Warfighting Readiness)</w:t>
+            </w:r>
+          </w:p>
+        </w:tc>
+        <w:tc>
+          <w:tcPr/>
+          <w:p>
+            <w:pPr>
+              <w:pStyle w:val="Compact"/>
+            </w:pPr>
+            <w:r>
+              <w:t xml:space="preserve">command, legal, and warfighting-readiness matters</w:t>
+            </w:r>
+          </w:p>
+        </w:tc>
+      </w:tr>
+      <w:tr>
+        <w:tc>
+          <w:tcPr/>
+          <w:p>
+            <w:pPr>
+              <w:pStyle w:val="Compact"/>
+            </w:pPr>
+            <w:r>
+              <w:t xml:space="preserve">200</w:t>
+            </w:r>
+          </w:p>
+        </w:tc>
+        <w:tc>
+          <w:tcPr/>
+          <w:p>
+            <w:pPr>
+              <w:pStyle w:val="Compact"/>
+            </w:pPr>
+            <w:r>
+              <w:t xml:space="preserve">Engineering and Planning (CHENG; engineers, planners)</w:t>
+            </w:r>
+          </w:p>
+        </w:tc>
+        <w:tc>
+          <w:tcPr/>
+          <w:p>
+            <w:pPr>
+              <w:pStyle w:val="Compact"/>
+            </w:pPr>
+            <w:r>
+              <w:t xml:space="preserve">technical and engineering matters; owns the technical library and derivative classifier</w:t>
+            </w:r>
+          </w:p>
+        </w:tc>
+      </w:tr>
+      <w:tr>
+        <w:tc>
+          <w:tcPr/>
+          <w:p>
+            <w:pPr>
+              <w:pStyle w:val="Compact"/>
+            </w:pPr>
+            <w:r>
+              <w:t xml:space="preserve">300</w:t>
+            </w:r>
+          </w:p>
+        </w:tc>
+        <w:tc>
+          <w:tcPr/>
+          <w:p>
+            <w:pPr>
+              <w:pStyle w:val="Compact"/>
+            </w:pPr>
+            <w:r>
+              <w:t xml:space="preserve">Waterfront Operations</w:t>
+            </w:r>
+          </w:p>
+        </w:tc>
+        <w:tc>
+          <w:tcPr/>
+          <w:p>
+            <w:pPr>
+              <w:pStyle w:val="Compact"/>
+            </w:pPr>
+            <w:r>
+              <w:t xml:space="preserve">availability execution, scheduling, project management</w:t>
+            </w:r>
+          </w:p>
+        </w:tc>
+      </w:tr>
+      <w:tr>
+        <w:tc>
+          <w:tcPr/>
+          <w:p>
+            <w:pPr>
+              <w:pStyle w:val="Compact"/>
+            </w:pPr>
+            <w:r>
+              <w:t xml:space="preserve">500</w:t>
+            </w:r>
+          </w:p>
+        </w:tc>
+        <w:tc>
+          <w:tcPr/>
+          <w:p>
+            <w:pPr>
+              <w:pStyle w:val="Compact"/>
+            </w:pPr>
+            <w:r>
+              <w:t xml:space="preserve">Supply</w:t>
+            </w:r>
+          </w:p>
+        </w:tc>
+        <w:tc>
+          <w:tcPr/>
+          <w:p>
+            <w:pPr>
+              <w:pStyle w:val="Compact"/>
+            </w:pPr>
+            <w:r>
+              <w:t xml:space="preserve">supply and logistics</w:t>
+            </w:r>
+          </w:p>
+        </w:tc>
+      </w:tr>
+      <w:tr>
+        <w:tc>
+          <w:tcPr/>
+          <w:p>
+            <w:pPr>
+              <w:pStyle w:val="Compact"/>
+            </w:pPr>
+            <w:r>
+              <w:t xml:space="preserve">600</w:t>
+            </w:r>
+          </w:p>
+        </w:tc>
+        <w:tc>
+          <w:tcPr/>
+          <w:p>
+            <w:pPr>
+              <w:pStyle w:val="Compact"/>
+            </w:pPr>
+            <w:r>
+              <w:t xml:space="preserve">Financial</w:t>
+            </w:r>
+          </w:p>
+        </w:tc>
+        <w:tc>
+          <w:tcPr/>
+          <w:p>
+            <w:pPr>
+              <w:pStyle w:val="Compact"/>
+            </w:pPr>
+            <w:r>
+              <w:t xml:space="preserve">budget, accounting, cost estimates</w:t>
+            </w:r>
+          </w:p>
+        </w:tc>
+      </w:tr>
+      <w:tr>
+        <w:tc>
+          <w:tcPr/>
+          <w:p>
+            <w:pPr>
+              <w:pStyle w:val="Compact"/>
+            </w:pPr>
+            <w:r>
+              <w:t xml:space="preserve">700</w:t>
+            </w:r>
+          </w:p>
+        </w:tc>
+        <w:tc>
+          <w:tcPr/>
+          <w:p>
+            <w:pPr>
+              <w:pStyle w:val="Compact"/>
+            </w:pPr>
+            <w:r>
+              <w:t xml:space="preserve">Crane and Rigging</w:t>
+            </w:r>
+          </w:p>
+        </w:tc>
+        <w:tc>
+          <w:tcPr/>
+          <w:p>
+            <w:pPr>
+              <w:pStyle w:val="Compact"/>
+            </w:pPr>
+            <w:r>
+              <w:t xml:space="preserve">crane, rigging, and lift planning</w:t>
+            </w:r>
+          </w:p>
+        </w:tc>
+      </w:tr>
+      <w:tr>
+        <w:tc>
+          <w:tcPr/>
+          <w:p>
+            <w:pPr>
+              <w:pStyle w:val="Compact"/>
+            </w:pPr>
+            <w:r>
+              <w:t xml:space="preserve">900</w:t>
+            </w:r>
+          </w:p>
+        </w:tc>
+        <w:tc>
+          <w:tcPr/>
+          <w:p>
+            <w:pPr>
+              <w:pStyle w:val="Compact"/>
+            </w:pPr>
+            <w:r>
+              <w:t xml:space="preserve">Production</w:t>
+            </w:r>
+          </w:p>
+        </w:tc>
+        <w:tc>
+          <w:tcPr/>
+          <w:p>
+            <w:pPr>
+              <w:pStyle w:val="Compact"/>
+            </w:pPr>
+            <w:r>
+              <w:t xml:space="preserve">production</w:t>
+            </w:r>
+          </w:p>
+        </w:tc>
+      </w:tr>
+      <w:tr>
+        <w:tc>
+          <w:tcPr/>
+          <w:p>
+            <w:pPr>
+              <w:pStyle w:val="Compact"/>
+            </w:pPr>
+            <w:r>
+              <w:t xml:space="preserve">1100</w:t>
+            </w:r>
+          </w:p>
+        </w:tc>
+        <w:tc>
+          <w:tcPr/>
+          <w:p>
+            <w:pPr>
+              <w:pStyle w:val="Compact"/>
+            </w:pPr>
+            <w:r>
+              <w:t xml:space="preserve">Manpower</w:t>
+            </w:r>
+          </w:p>
+        </w:tc>
+        <w:tc>
+          <w:tcPr/>
+          <w:p>
+            <w:pPr>
+              <w:pStyle w:val="Compact"/>
+            </w:pPr>
+            <w:r>
+              <w:t xml:space="preserve">manpower, training, and industrial security</w:t>
+            </w:r>
+          </w:p>
+        </w:tc>
+      </w:tr>
+      <w:tr>
+        <w:tc>
+          <w:tcPr/>
+          <w:p>
+            <w:pPr>
+              <w:pStyle w:val="Compact"/>
+            </w:pPr>
+            <w:r>
+              <w:t xml:space="preserve">1200</w:t>
+            </w:r>
+          </w:p>
+        </w:tc>
+        <w:tc>
+          <w:tcPr/>
+          <w:p>
+            <w:pPr>
+              <w:pStyle w:val="Compact"/>
+            </w:pPr>
+            <w:r>
+              <w:t xml:space="preserve">Business and Strategic Planning Office (BSPO)</w:t>
+            </w:r>
+          </w:p>
+        </w:tc>
+        <w:tc>
+          <w:tcPr/>
+          <w:p>
+            <w:pPr>
+              <w:pStyle w:val="Compact"/>
+            </w:pPr>
+            <w:r>
+              <w:t xml:space="preserve">business, strategic planning, and contracting (requirements packages)</w:t>
+            </w:r>
+          </w:p>
+        </w:tc>
+      </w:tr>
+    </w:tbl>
+    <w:p>
+      <w:pPr>
+        <w:pStyle w:val="BodyText"/>
+      </w:pPr>
+      <w:r>
+        <w:t xml:space="preserve">There is no Code 400, 800, or 1000. Quality assurance is an existing function and is</w:t>
+      </w:r>
+      <w:r>
+        <w:t xml:space="preserve"> </w:t>
+      </w:r>
+      <w:r>
+        <w:t xml:space="preserve">exercised as such (Section 9.b).</w:t>
+      </w:r>
+    </w:p>
+    <w:p>
+      <w:pPr>
         <w:numPr>
           <w:ilvl w:val="0"/>
           <w:numId w:val="1010"/>
@@ -2409,34 +2950,35 @@
           <w:b/>
           <w:bCs/>
         </w:rPr>
-        <w:t xml:space="preserve">Technical content</w:t>
-      </w:r>
-      <w:r>
-        <w:t xml:space="preserve"> </w:t>
-      </w:r>
-      <w:r>
-        <w:t xml:space="preserve">(a weld specification, torque value, tag-out, NAVSEA Standard Item</w:t>
-      </w:r>
-      <w:r>
-        <w:t xml:space="preserve"> </w:t>
-      </w:r>
-      <w:r>
-        <w:t xml:space="preserve">interpretation, repair procedure): the</w:t>
-      </w:r>
-      <w:r>
-        <w:t xml:space="preserve"> </w:t>
-      </w:r>
-      <w:r>
-        <w:rPr>
-          <w:b/>
-          <w:bCs/>
-        </w:rPr>
-        <w:t xml:space="preserve">Chief Engineer (CHENG) and the CHENG’s chain.</w:t>
-      </w:r>
-    </w:p>
-    <w:p>
-      <w:pPr>
-        <w:pStyle w:val="Compact"/>
+        <w:t xml:space="preserve">Each department designates an authoritative AI content evaluator.</w:t>
+      </w:r>
+      <w:r>
+        <w:t xml:space="preserve"> </w:t>
+      </w:r>
+      <w:r>
+        <w:t xml:space="preserve">Every department</w:t>
+      </w:r>
+      <w:r>
+        <w:t xml:space="preserve"> </w:t>
+      </w:r>
+      <w:r>
+        <w:t xml:space="preserve">designates, in writing, a qualified person responsible for the authoritative evaluation of</w:t>
+      </w:r>
+      <w:r>
+        <w:t xml:space="preserve"> </w:t>
+      </w:r>
+      <w:r>
+        <w:t xml:space="preserve">AI-produced content used in that department’s area of responsibility. The designated</w:t>
+      </w:r>
+      <w:r>
+        <w:t xml:space="preserve"> </w:t>
+      </w:r>
+      <w:r>
+        <w:t xml:space="preserve">evaluator is recorded with the department’s use cases in the inventory (Section 8).</w:t>
+      </w:r>
+    </w:p>
+    <w:p>
+      <w:pPr>
         <w:numPr>
           <w:ilvl w:val="0"/>
           <w:numId w:val="1010"/>
@@ -2447,42 +2989,35 @@
           <w:b/>
           <w:bCs/>
         </w:rPr>
-        <w:t xml:space="preserve">Information-technology and information-security content:</w:t>
-      </w:r>
-      <w:r>
-        <w:t xml:space="preserve"> </w:t>
-      </w:r>
-      <w:r>
-        <w:t xml:space="preserve">the</w:t>
-      </w:r>
-      <w:r>
-        <w:t xml:space="preserve"> </w:t>
-      </w:r>
-      <w:r>
-        <w:rPr>
-          <w:b/>
-          <w:bCs/>
-        </w:rPr>
-        <w:t xml:space="preserve">Command Information</w:t>
-      </w:r>
-      <w:r>
-        <w:rPr>
-          <w:b/>
-          <w:bCs/>
-        </w:rPr>
-        <w:t xml:space="preserve"> </w:t>
-      </w:r>
-      <w:r>
-        <w:rPr>
-          <w:b/>
-          <w:bCs/>
-        </w:rPr>
-        <w:t xml:space="preserve">Officer (CIO).</w:t>
-      </w:r>
-    </w:p>
-    <w:p>
-      <w:pPr>
-        <w:pStyle w:val="Compact"/>
+        <w:t xml:space="preserve">Departures from specification.</w:t>
+      </w:r>
+      <w:r>
+        <w:t xml:space="preserve"> </w:t>
+      </w:r>
+      <w:r>
+        <w:t xml:space="preserve">Any AI suggestion that would depart from a</w:t>
+      </w:r>
+      <w:r>
+        <w:t xml:space="preserve"> </w:t>
+      </w:r>
+      <w:r>
+        <w:t xml:space="preserve">controlling specification (JFMM, NAVSEA Standard Item, technical manual) is processed</w:t>
+      </w:r>
+      <w:r>
+        <w:t xml:space="preserve"> </w:t>
+      </w:r>
+      <w:r>
+        <w:t xml:space="preserve">through the command’s existing Departure-from-Specification (DFS) process. AI does not</w:t>
+      </w:r>
+      <w:r>
+        <w:t xml:space="preserve"> </w:t>
+      </w:r>
+      <w:r>
+        <w:t xml:space="preserve">create a path around the technical authority chain.</w:t>
+      </w:r>
+    </w:p>
+    <w:p>
+      <w:pPr>
         <w:numPr>
           <w:ilvl w:val="0"/>
           <w:numId w:val="1010"/>
@@ -2493,107 +3028,84 @@
           <w:b/>
           <w:bCs/>
         </w:rPr>
-        <w:t xml:space="preserve">Business and strategic-planning content:</w:t>
-      </w:r>
-      <w:r>
-        <w:t xml:space="preserve"> </w:t>
-      </w:r>
-      <w:r>
-        <w:t xml:space="preserve">the</w:t>
-      </w:r>
-      <w:r>
-        <w:t xml:space="preserve"> </w:t>
-      </w:r>
-      <w:r>
-        <w:rPr>
-          <w:b/>
-          <w:bCs/>
-        </w:rPr>
-        <w:t xml:space="preserve">Business Strategic Planning Office</w:t>
-      </w:r>
-      <w:r>
-        <w:rPr>
-          <w:b/>
-          <w:bCs/>
-        </w:rPr>
-        <w:t xml:space="preserve"> </w:t>
-      </w:r>
-      <w:r>
-        <w:rPr>
-          <w:b/>
-          <w:bCs/>
-        </w:rPr>
-        <w:t xml:space="preserve">(BSPO).</w:t>
+        <w:t xml:space="preserve">Out-of-band verification.</w:t>
+      </w:r>
+      <w:r>
+        <w:t xml:space="preserve"> </w:t>
+      </w:r>
+      <w:r>
+        <w:t xml:space="preserve">AI output that cites a technical requirement is verified</w:t>
+      </w:r>
+      <w:r>
+        <w:t xml:space="preserve"> </w:t>
+      </w:r>
+      <w:r>
+        <w:t xml:space="preserve">against the controlling document through a non-AI authoritative source (the official</w:t>
+      </w:r>
+      <w:r>
+        <w:t xml:space="preserve"> </w:t>
+      </w:r>
+      <w:r>
+        <w:t xml:space="preserve">technical library / source of record), confirming the specific paragraph wording and</w:t>
+      </w:r>
+      <w:r>
+        <w:t xml:space="preserve"> </w:t>
+      </w:r>
+      <w:r>
+        <w:t xml:space="preserve">current change number.</w:t>
+      </w:r>
+      <w:r>
+        <w:t xml:space="preserve"> </w:t>
+      </w:r>
+      <w:r>
+        <w:rPr>
+          <w:b/>
+          <w:bCs/>
+        </w:rPr>
+        <w:t xml:space="preserve">The AI’s own retrieved snippet is not a sufficient verification</w:t>
+      </w:r>
+      <w:r>
+        <w:rPr>
+          <w:b/>
+          <w:bCs/>
+        </w:rPr>
+        <w:t xml:space="preserve"> </w:t>
+      </w:r>
+      <w:r>
+        <w:rPr>
+          <w:b/>
+          <w:bCs/>
+        </w:rPr>
+        <w:t xml:space="preserve">source</w:t>
+      </w:r>
+      <w:r>
+        <w:t xml:space="preserve"> </w:t>
+      </w:r>
+      <w:r>
+        <w:t xml:space="preserve">— relying on it re-introduces the hallucination it is meant to catch.</w:t>
+      </w:r>
+    </w:p>
+    <w:p>
+      <w:pPr>
+        <w:pStyle w:val="BlockText"/>
+      </w:pPr>
+      <w:r>
+        <w:rPr>
+          <w:b/>
+          <w:bCs/>
+        </w:rPr>
+        <w:t xml:space="preserve">Working group to resolve:</w:t>
+      </w:r>
+      <w:r>
+        <w:t xml:space="preserve"> </w:t>
+      </w:r>
+      <w:r>
+        <w:t xml:space="preserve">name the authoritative source-of-record system (the non-AI technical library used for verification).</w:t>
       </w:r>
     </w:p>
     <w:p>
       <w:pPr>
         <w:pStyle w:val="Compact"/>
-        <w:numPr>
-          <w:ilvl w:val="0"/>
-          <w:numId w:val="1010"/>
-        </w:numPr>
-      </w:pPr>
-      <w:r>
-        <w:rPr>
-          <w:b/>
-          <w:bCs/>
-        </w:rPr>
-        <w:t xml:space="preserve">Any other functional content</w:t>
-      </w:r>
-      <w:r>
-        <w:t xml:space="preserve"> </w:t>
-      </w:r>
-      <w:r>
-        <w:t xml:space="preserve">(for example contracts, supply, manpower, safety): the</w:t>
-      </w:r>
-      <w:r>
-        <w:t xml:space="preserve"> </w:t>
-      </w:r>
-      <w:r>
-        <w:t xml:space="preserve">cognizant department head or functional authority for that area.</w:t>
-      </w:r>
-    </w:p>
-    <w:p>
-      <w:pPr>
-        <w:pStyle w:val="FirstParagraph"/>
-      </w:pPr>
-      <w:r>
-        <w:t xml:space="preserve">For technical content the bar is highest: because seaworthiness and safety of life are</w:t>
-      </w:r>
-      <w:r>
-        <w:t xml:space="preserve"> </w:t>
-      </w:r>
-      <w:r>
-        <w:t xml:space="preserve">paramount, such output is a non-authoritative clerical draft until a qualified person in</w:t>
-      </w:r>
-      <w:r>
-        <w:t xml:space="preserve"> </w:t>
-      </w:r>
-      <w:r>
-        <w:t xml:space="preserve">the CHENG’s chain adjudicates it — never the general end user’s or the CIO’s call.</w:t>
-      </w:r>
-    </w:p>
-    <w:p>
-      <w:pPr>
-        <w:pStyle w:val="BlockText"/>
-      </w:pPr>
-      <w:r>
-        <w:rPr>
-          <w:b/>
-          <w:bCs/>
-        </w:rPr>
-        <w:t xml:space="preserve">Working group to resolve:</w:t>
-      </w:r>
-      <w:r>
-        <w:t xml:space="preserve"> </w:t>
-      </w:r>
-      <w:r>
-        <w:t xml:space="preserve">complete the domain-to-authority mapping for the command’s full organization, and confirm the engineering and quality-assurance codes and Technical Warrant Holder assignments.</w:t>
-      </w:r>
-    </w:p>
-    <w:p>
-      <w:pPr>
         <w:numPr>
           <w:ilvl w:val="0"/>
           <w:numId w:val="1011"/>
@@ -2604,180 +3116,79 @@
           <w:b/>
           <w:bCs/>
         </w:rPr>
-        <w:t xml:space="preserve">Each department designates an authoritative AI content evaluator.</w:t>
-      </w:r>
-      <w:r>
-        <w:t xml:space="preserve"> </w:t>
-      </w:r>
-      <w:r>
-        <w:t xml:space="preserve">Every department</w:t>
-      </w:r>
-      <w:r>
-        <w:t xml:space="preserve"> </w:t>
-      </w:r>
-      <w:r>
-        <w:t xml:space="preserve">designates, in writing, a qualified person responsible for the authoritative evaluation of</w:t>
-      </w:r>
-      <w:r>
-        <w:t xml:space="preserve"> </w:t>
-      </w:r>
-      <w:r>
-        <w:t xml:space="preserve">AI-produced content used in that department. That evaluator performs the evaluation for</w:t>
-      </w:r>
-      <w:r>
-        <w:t xml:space="preserve"> </w:t>
-      </w:r>
-      <w:r>
-        <w:t xml:space="preserve">content in the department’s own domain and routes content that falls in another domain to</w:t>
-      </w:r>
-      <w:r>
-        <w:t xml:space="preserve"> </w:t>
-      </w:r>
-      <w:r>
-        <w:t xml:space="preserve">the cognizant authority in paragraph (a) — anything technical goes to the CHENG chain. The</w:t>
-      </w:r>
-      <w:r>
-        <w:t xml:space="preserve"> </w:t>
-      </w:r>
-      <w:r>
-        <w:t xml:space="preserve">designated evaluator is recorded with the department’s use cases in the inventory</w:t>
-      </w:r>
-      <w:r>
-        <w:t xml:space="preserve"> </w:t>
-      </w:r>
-      <w:r>
-        <w:t xml:space="preserve">(Section 8).</w:t>
-      </w:r>
-    </w:p>
-    <w:p>
-      <w:pPr>
-        <w:numPr>
-          <w:ilvl w:val="0"/>
-          <w:numId w:val="1011"/>
-        </w:numPr>
-      </w:pPr>
-      <w:r>
-        <w:rPr>
-          <w:b/>
-          <w:bCs/>
-        </w:rPr>
-        <w:t xml:space="preserve">Departures from specification.</w:t>
-      </w:r>
-      <w:r>
-        <w:t xml:space="preserve"> </w:t>
-      </w:r>
-      <w:r>
-        <w:t xml:space="preserve">Any AI suggestion that would depart from a</w:t>
-      </w:r>
-      <w:r>
-        <w:t xml:space="preserve"> </w:t>
-      </w:r>
-      <w:r>
-        <w:t xml:space="preserve">controlling specification (JFMM, NAVSEA Standard Item, technical manual) is processed</w:t>
-      </w:r>
-      <w:r>
-        <w:t xml:space="preserve"> </w:t>
-      </w:r>
-      <w:r>
-        <w:t xml:space="preserve">through the command’s existing Departure-from-Specification (DFS) process. AI does not</w:t>
-      </w:r>
-      <w:r>
-        <w:t xml:space="preserve"> </w:t>
-      </w:r>
-      <w:r>
-        <w:t xml:space="preserve">create a path around the technical authority chain.</w:t>
-      </w:r>
-    </w:p>
-    <w:p>
-      <w:pPr>
-        <w:numPr>
-          <w:ilvl w:val="0"/>
-          <w:numId w:val="1011"/>
-        </w:numPr>
-      </w:pPr>
-      <w:r>
-        <w:rPr>
-          <w:b/>
-          <w:bCs/>
-        </w:rPr>
-        <w:t xml:space="preserve">Out-of-band verification.</w:t>
-      </w:r>
-      <w:r>
-        <w:t xml:space="preserve"> </w:t>
-      </w:r>
-      <w:r>
-        <w:t xml:space="preserve">AI output that cites a technical requirement is verified</w:t>
-      </w:r>
-      <w:r>
-        <w:t xml:space="preserve"> </w:t>
-      </w:r>
-      <w:r>
-        <w:t xml:space="preserve">against the controlling document through a non-AI authoritative source (the official</w:t>
-      </w:r>
-      <w:r>
-        <w:t xml:space="preserve"> </w:t>
-      </w:r>
-      <w:r>
-        <w:t xml:space="preserve">technical library / source of record), confirming the specific paragraph wording and</w:t>
-      </w:r>
-      <w:r>
-        <w:t xml:space="preserve"> </w:t>
-      </w:r>
-      <w:r>
-        <w:t xml:space="preserve">current change number.</w:t>
-      </w:r>
-      <w:r>
-        <w:t xml:space="preserve"> </w:t>
-      </w:r>
-      <w:r>
-        <w:rPr>
-          <w:b/>
-          <w:bCs/>
-        </w:rPr>
-        <w:t xml:space="preserve">The AI’s own retrieved snippet is not a sufficient verification</w:t>
-      </w:r>
-      <w:r>
-        <w:rPr>
-          <w:b/>
-          <w:bCs/>
-        </w:rPr>
-        <w:t xml:space="preserve"> </w:t>
-      </w:r>
-      <w:r>
-        <w:rPr>
-          <w:b/>
-          <w:bCs/>
-        </w:rPr>
-        <w:t xml:space="preserve">source</w:t>
-      </w:r>
-      <w:r>
-        <w:t xml:space="preserve"> </w:t>
-      </w:r>
-      <w:r>
-        <w:t xml:space="preserve">— relying on it re-introduces the hallucination it is meant to catch.</w:t>
-      </w:r>
-    </w:p>
-    <w:p>
-      <w:pPr>
-        <w:pStyle w:val="BlockText"/>
-      </w:pPr>
-      <w:r>
-        <w:rPr>
-          <w:b/>
-          <w:bCs/>
-        </w:rPr>
-        <w:t xml:space="preserve">Working group to resolve:</w:t>
-      </w:r>
-      <w:r>
-        <w:t xml:space="preserve"> </w:t>
-      </w:r>
-      <w:r>
-        <w:t xml:space="preserve">name the authoritative source-of-record system (the non-AI technical library used for verification).</w:t>
-      </w:r>
-    </w:p>
-    <w:p>
-      <w:pPr>
-        <w:pStyle w:val="Compact"/>
+        <w:t xml:space="preserve">Structured approval (fight confirmation fatigue).</w:t>
+      </w:r>
+      <w:r>
+        <w:t xml:space="preserve"> </w:t>
+      </w:r>
+      <w:r>
+        <w:t xml:space="preserve">Where a human approval is required</w:t>
+      </w:r>
+      <w:r>
+        <w:t xml:space="preserve"> </w:t>
+      </w:r>
+      <w:r>
+        <w:t xml:space="preserve">(this section and Section 7), the approval presents what is being approved — intent, the</w:t>
+      </w:r>
+      <w:r>
+        <w:t xml:space="preserve"> </w:t>
+      </w:r>
+      <w:r>
+        <w:t xml:space="preserve">source(s) relied on, the scope of the action, and how it is reversed — not a bare</w:t>
+      </w:r>
+      <w:r>
+        <w:t xml:space="preserve"> </w:t>
+      </w:r>
+      <w:r>
+        <w:t xml:space="preserve">“Approve.”</w:t>
+      </w:r>
+      <w:r>
+        <w:t xml:space="preserve"> </w:t>
+      </w:r>
+      <w:r>
+        <w:t xml:space="preserve">The risk under click-to-approve is a tired human rubber-stamping agent steps;</w:t>
+      </w:r>
+      <w:r>
+        <w:t xml:space="preserve"> </w:t>
+      </w:r>
+      <w:r>
+        <w:t xml:space="preserve">the structured prompt, plus the requirement that the</w:t>
+      </w:r>
+      <w:r>
+        <w:t xml:space="preserve"> </w:t>
+      </w:r>
+      <w:r>
+        <w:rPr>
+          <w:b/>
+          <w:bCs/>
+        </w:rPr>
+        <w:t xml:space="preserve">right qualified person</w:t>
+      </w:r>
+      <w:r>
+        <w:t xml:space="preserve"> </w:t>
+      </w:r>
+      <w:r>
+        <w:t xml:space="preserve">approve,</w:t>
+      </w:r>
+      <w:r>
+        <w:t xml:space="preserve"> </w:t>
+      </w:r>
+      <w:r>
+        <w:t xml:space="preserve">are the mitigations.</w:t>
+      </w:r>
+    </w:p>
+    <w:bookmarkEnd w:id="19"/>
+    <w:bookmarkStart w:id="20" w:name="agentic-autonomy-controls"/>
+    <w:p>
+      <w:pPr>
+        <w:pStyle w:val="Heading2"/>
+      </w:pPr>
+      <w:r>
+        <w:t xml:space="preserve">7. Agentic autonomy controls</w:t>
+      </w:r>
+    </w:p>
+    <w:p>
+      <w:pPr>
         <w:numPr>
           <w:ilvl w:val="0"/>
           <w:numId w:val="1012"/>
@@ -2788,79 +3199,226 @@
           <w:b/>
           <w:bCs/>
         </w:rPr>
-        <w:t xml:space="preserve">Structured approval (fight confirmation fatigue).</w:t>
-      </w:r>
-      <w:r>
-        <w:t xml:space="preserve"> </w:t>
-      </w:r>
-      <w:r>
-        <w:t xml:space="preserve">Where a human approval is required</w:t>
-      </w:r>
-      <w:r>
-        <w:t xml:space="preserve"> </w:t>
-      </w:r>
-      <w:r>
-        <w:t xml:space="preserve">(this section and Section 7), the approval presents what is being approved — intent, the</w:t>
-      </w:r>
-      <w:r>
-        <w:t xml:space="preserve"> </w:t>
-      </w:r>
-      <w:r>
-        <w:t xml:space="preserve">source(s) relied on, the scope of the action, and how it is reversed — not a bare</w:t>
-      </w:r>
-      <w:r>
-        <w:t xml:space="preserve"> </w:t>
-      </w:r>
-      <w:r>
-        <w:t xml:space="preserve">“Approve.”</w:t>
-      </w:r>
-      <w:r>
-        <w:t xml:space="preserve"> </w:t>
-      </w:r>
-      <w:r>
-        <w:t xml:space="preserve">The risk under click-to-approve is a tired human rubber-stamping agent steps;</w:t>
-      </w:r>
-      <w:r>
-        <w:t xml:space="preserve"> </w:t>
-      </w:r>
-      <w:r>
-        <w:t xml:space="preserve">the structured prompt, plus the requirement that the</w:t>
-      </w:r>
-      <w:r>
-        <w:t xml:space="preserve"> </w:t>
-      </w:r>
-      <w:r>
-        <w:rPr>
-          <w:b/>
-          <w:bCs/>
-        </w:rPr>
-        <w:t xml:space="preserve">right qualified person</w:t>
-      </w:r>
-      <w:r>
-        <w:t xml:space="preserve"> </w:t>
-      </w:r>
-      <w:r>
-        <w:t xml:space="preserve">approve,</w:t>
-      </w:r>
-      <w:r>
-        <w:t xml:space="preserve"> </w:t>
-      </w:r>
-      <w:r>
-        <w:t xml:space="preserve">are the mitigations.</w:t>
-      </w:r>
-    </w:p>
-    <w:bookmarkEnd w:id="19"/>
-    <w:bookmarkStart w:id="20" w:name="agentic-autonomy-controls"/>
+        <w:t xml:space="preserve">Read-only by default.</w:t>
+      </w:r>
+      <w:r>
+        <w:t xml:space="preserve"> </w:t>
+      </w:r>
+      <w:r>
+        <w:t xml:space="preserve">Agents operate read-only unless a write capability is</w:t>
+      </w:r>
+      <w:r>
+        <w:t xml:space="preserve"> </w:t>
+      </w:r>
+      <w:r>
+        <w:t xml:space="preserve">specifically approved for a use case.</w:t>
+      </w:r>
+    </w:p>
+    <w:p>
+      <w:pPr>
+        <w:numPr>
+          <w:ilvl w:val="0"/>
+          <w:numId w:val="1012"/>
+        </w:numPr>
+      </w:pPr>
+      <w:r>
+        <w:rPr>
+          <w:b/>
+          <w:bCs/>
+        </w:rPr>
+        <w:t xml:space="preserve">Write-action gating.</w:t>
+      </w:r>
+      <w:r>
+        <w:t xml:space="preserve"> </w:t>
+      </w:r>
+      <w:r>
+        <w:t xml:space="preserve">Any agent action that changes a record, sends official</w:t>
+      </w:r>
+      <w:r>
+        <w:t xml:space="preserve"> </w:t>
+      </w:r>
+      <w:r>
+        <w:t xml:space="preserve">correspondence, modifies a schedule, or otherwise changes the state of a command system</w:t>
+      </w:r>
+      <w:r>
+        <w:t xml:space="preserve"> </w:t>
+      </w:r>
+      <w:r>
+        <w:t xml:space="preserve">requires a structured human approval (Section 6.e) before execution. The AI does not</w:t>
+      </w:r>
+      <w:r>
+        <w:t xml:space="preserve"> </w:t>
+      </w:r>
+      <w:r>
+        <w:t xml:space="preserve">take a final, state-changing action autonomously.</w:t>
+      </w:r>
+    </w:p>
+    <w:p>
+      <w:pPr>
+        <w:numPr>
+          <w:ilvl w:val="0"/>
+          <w:numId w:val="1012"/>
+        </w:numPr>
+      </w:pPr>
+      <w:r>
+        <w:rPr>
+          <w:b/>
+          <w:bCs/>
+        </w:rPr>
+        <w:t xml:space="preserve">Least privilege and permission inheritance.</w:t>
+      </w:r>
+      <w:r>
+        <w:t xml:space="preserve"> </w:t>
+      </w:r>
+      <w:r>
+        <w:t xml:space="preserve">An agent receives only the data and</w:t>
+      </w:r>
+      <w:r>
+        <w:t xml:space="preserve"> </w:t>
+      </w:r>
+      <w:r>
+        <w:t xml:space="preserve">tools its approved use case requires, and an agent acting on a user’s behalf inherits that</w:t>
+      </w:r>
+      <w:r>
+        <w:t xml:space="preserve"> </w:t>
+      </w:r>
+      <w:r>
+        <w:t xml:space="preserve">user’s access and no more. For the Local National workforce this rests on an existing</w:t>
+      </w:r>
+      <w:r>
+        <w:t xml:space="preserve"> </w:t>
+      </w:r>
+      <w:r>
+        <w:t xml:space="preserve">control: the command’s network share is already releasability-screened and NOFORN is</w:t>
+      </w:r>
+      <w:r>
+        <w:t xml:space="preserve"> </w:t>
+      </w:r>
+      <w:r>
+        <w:t xml:space="preserve">excluded from it (Section 5.c), so an agent drawing on the screened corpus for a Local</w:t>
+      </w:r>
+      <w:r>
+        <w:t xml:space="preserve"> </w:t>
+      </w:r>
+      <w:r>
+        <w:t xml:space="preserve">National user is bounded by that user’s already-screened access. The residual control is</w:t>
+      </w:r>
+      <w:r>
+        <w:t xml:space="preserve"> </w:t>
+      </w:r>
+      <w:r>
+        <w:t xml:space="preserve">simply to keep askSage inside that screened corpus and prevent un-screened side-channel</w:t>
+      </w:r>
+      <w:r>
+        <w:t xml:space="preserve"> </w:t>
+      </w:r>
+      <w:r>
+        <w:t xml:space="preserve">uploads (Section 5.c), not to re-adjudicate releasability at the AI layer.</w:t>
+      </w:r>
+    </w:p>
+    <w:p>
+      <w:pPr>
+        <w:numPr>
+          <w:ilvl w:val="0"/>
+          <w:numId w:val="1012"/>
+        </w:numPr>
+      </w:pPr>
+      <w:r>
+        <w:rPr>
+          <w:b/>
+          <w:bCs/>
+        </w:rPr>
+        <w:t xml:space="preserve">Autonomy tiered to existing risk categories.</w:t>
+      </w:r>
+      <w:r>
+        <w:t xml:space="preserve"> </w:t>
+      </w:r>
+      <w:r>
+        <w:t xml:space="preserve">Human-oversight intensity scales with</w:t>
+      </w:r>
+      <w:r>
+        <w:t xml:space="preserve"> </w:t>
+      </w:r>
+      <w:r>
+        <w:t xml:space="preserve">the risk of the use case, mapped to the command’s existing controlled-work risk categories</w:t>
+      </w:r>
+      <w:r>
+        <w:t xml:space="preserve"> </w:t>
+      </w:r>
+      <w:r>
+        <w:t xml:space="preserve">(for example Level I / critical versus non-critical) rather than a new scheme. Higher-risk</w:t>
+      </w:r>
+      <w:r>
+        <w:t xml:space="preserve"> </w:t>
+      </w:r>
+      <w:r>
+        <w:t xml:space="preserve">use cases require closer human control and CHENG-chain concurrence (Section 8).</w:t>
+      </w:r>
+    </w:p>
+    <w:p>
+      <w:pPr>
+        <w:numPr>
+          <w:ilvl w:val="0"/>
+          <w:numId w:val="1012"/>
+        </w:numPr>
+      </w:pPr>
+      <w:r>
+        <w:rPr>
+          <w:b/>
+          <w:bCs/>
+        </w:rPr>
+        <w:t xml:space="preserve">Separation and containment.</w:t>
+      </w:r>
+      <w:r>
+        <w:t xml:space="preserve"> </w:t>
+      </w:r>
+      <w:r>
+        <w:t xml:space="preserve">Where an agent generates and then executes work,</w:t>
+      </w:r>
+      <w:r>
+        <w:t xml:space="preserve"> </w:t>
+      </w:r>
+      <w:r>
+        <w:t xml:space="preserve">generation and execution are separated by an approval gate. A means to halt an agent and</w:t>
+      </w:r>
+      <w:r>
+        <w:t xml:space="preserve"> </w:t>
+      </w:r>
+      <w:r>
+        <w:t xml:space="preserve">revoke its access exists and is exercisable by a designated authority.</w:t>
+      </w:r>
+    </w:p>
+    <w:p>
+      <w:pPr>
+        <w:pStyle w:val="BlockText"/>
+      </w:pPr>
+      <w:r>
+        <w:rPr>
+          <w:b/>
+          <w:bCs/>
+        </w:rPr>
+        <w:t xml:space="preserve">Working group to resolve:</w:t>
+      </w:r>
+      <w:r>
+        <w:t xml:space="preserve"> </w:t>
+      </w:r>
+      <w:r>
+        <w:t xml:space="preserve">name the halt/revoke authority (for example the ISSM or the command duty IT watch).</w:t>
+      </w:r>
+    </w:p>
+    <w:bookmarkEnd w:id="20"/>
+    <w:bookmarkStart w:id="21" w:name="roles-responsibilities-and-governance"/>
     <w:p>
       <w:pPr>
         <w:pStyle w:val="Heading2"/>
       </w:pPr>
       <w:r>
-        <w:t xml:space="preserve">7. Agentic autonomy controls</w:t>
-      </w:r>
-    </w:p>
-    <w:p>
-      <w:pPr>
+        <w:t xml:space="preserve">8. Roles, responsibilities, and governance</w:t>
+      </w:r>
+    </w:p>
+    <w:p>
+      <w:pPr>
+        <w:pStyle w:val="Compact"/>
         <w:numPr>
           <w:ilvl w:val="0"/>
           <w:numId w:val="1013"/>
@@ -2871,193 +3429,47 @@
           <w:b/>
           <w:bCs/>
         </w:rPr>
-        <w:t xml:space="preserve">Read-only by default.</w:t>
-      </w:r>
-      <w:r>
-        <w:t xml:space="preserve"> </w:t>
-      </w:r>
-      <w:r>
-        <w:t xml:space="preserve">Agents operate read-only unless a write capability is</w:t>
-      </w:r>
-      <w:r>
-        <w:t xml:space="preserve"> </w:t>
-      </w:r>
-      <w:r>
-        <w:t xml:space="preserve">specifically approved for a use case.</w:t>
-      </w:r>
-    </w:p>
-    <w:p>
-      <w:pPr>
-        <w:numPr>
-          <w:ilvl w:val="0"/>
-          <w:numId w:val="1013"/>
-        </w:numPr>
-      </w:pPr>
-      <w:r>
-        <w:rPr>
-          <w:b/>
-          <w:bCs/>
-        </w:rPr>
-        <w:t xml:space="preserve">Write-action gating.</w:t>
-      </w:r>
-      <w:r>
-        <w:t xml:space="preserve"> </w:t>
-      </w:r>
-      <w:r>
-        <w:t xml:space="preserve">Any agent action that changes a record, sends official</w:t>
-      </w:r>
-      <w:r>
-        <w:t xml:space="preserve"> </w:t>
-      </w:r>
-      <w:r>
-        <w:t xml:space="preserve">correspondence, modifies a schedule, or otherwise changes the state of a command system</w:t>
-      </w:r>
-      <w:r>
-        <w:t xml:space="preserve"> </w:t>
-      </w:r>
-      <w:r>
-        <w:t xml:space="preserve">requires a structured human approval (Section 6.e) before execution. The AI does not</w:t>
-      </w:r>
-      <w:r>
-        <w:t xml:space="preserve"> </w:t>
-      </w:r>
-      <w:r>
-        <w:t xml:space="preserve">take a final, state-changing action autonomously.</w:t>
-      </w:r>
-    </w:p>
-    <w:p>
-      <w:pPr>
-        <w:numPr>
-          <w:ilvl w:val="0"/>
-          <w:numId w:val="1013"/>
-        </w:numPr>
-      </w:pPr>
-      <w:r>
-        <w:rPr>
-          <w:b/>
-          <w:bCs/>
-        </w:rPr>
-        <w:t xml:space="preserve">Least privilege and permission inheritance.</w:t>
-      </w:r>
-      <w:r>
-        <w:t xml:space="preserve"> </w:t>
-      </w:r>
-      <w:r>
-        <w:t xml:space="preserve">An agent receives only the data and</w:t>
-      </w:r>
-      <w:r>
-        <w:t xml:space="preserve"> </w:t>
-      </w:r>
-      <w:r>
-        <w:t xml:space="preserve">tools its approved use case requires, and an agent acting on a user’s behalf inherits that</w:t>
-      </w:r>
-      <w:r>
-        <w:t xml:space="preserve"> </w:t>
-      </w:r>
-      <w:r>
-        <w:t xml:space="preserve">user’s access and no more. For the Local National workforce this rests on an existing</w:t>
-      </w:r>
-      <w:r>
-        <w:t xml:space="preserve"> </w:t>
-      </w:r>
-      <w:r>
-        <w:t xml:space="preserve">control: the command’s network share is already releasability-screened and NOFORN is</w:t>
-      </w:r>
-      <w:r>
-        <w:t xml:space="preserve"> </w:t>
-      </w:r>
-      <w:r>
-        <w:t xml:space="preserve">excluded from it (Section 5.c), so an agent drawing on the screened corpus for a Local</w:t>
-      </w:r>
-      <w:r>
-        <w:t xml:space="preserve"> </w:t>
-      </w:r>
-      <w:r>
-        <w:t xml:space="preserve">National user is bounded by that user’s already-screened access. The residual control is</w:t>
-      </w:r>
-      <w:r>
-        <w:t xml:space="preserve"> </w:t>
-      </w:r>
-      <w:r>
-        <w:t xml:space="preserve">simply to keep askSage inside that screened corpus and prevent un-screened side-channel</w:t>
-      </w:r>
-      <w:r>
-        <w:t xml:space="preserve"> </w:t>
-      </w:r>
-      <w:r>
-        <w:t xml:space="preserve">uploads (Section 5.c), not to re-adjudicate releasability at the AI layer.</w:t>
-      </w:r>
-    </w:p>
-    <w:p>
-      <w:pPr>
-        <w:numPr>
-          <w:ilvl w:val="0"/>
-          <w:numId w:val="1013"/>
-        </w:numPr>
-      </w:pPr>
-      <w:r>
-        <w:rPr>
-          <w:b/>
-          <w:bCs/>
-        </w:rPr>
-        <w:t xml:space="preserve">Autonomy tiered to existing risk categories.</w:t>
-      </w:r>
-      <w:r>
-        <w:t xml:space="preserve"> </w:t>
-      </w:r>
-      <w:r>
-        <w:t xml:space="preserve">Human-oversight intensity scales with</w:t>
-      </w:r>
-      <w:r>
-        <w:t xml:space="preserve"> </w:t>
-      </w:r>
-      <w:r>
-        <w:t xml:space="preserve">the risk of the use case, mapped to the command’s existing controlled-work risk categories</w:t>
-      </w:r>
-      <w:r>
-        <w:t xml:space="preserve"> </w:t>
-      </w:r>
-      <w:r>
-        <w:t xml:space="preserve">(for example Level I / critical versus non-critical) rather than a new scheme. Higher-risk</w:t>
-      </w:r>
-      <w:r>
-        <w:t xml:space="preserve"> </w:t>
-      </w:r>
-      <w:r>
-        <w:t xml:space="preserve">use cases require closer human control and CHENG-chain concurrence (Section 8).</w:t>
-      </w:r>
-    </w:p>
-    <w:p>
-      <w:pPr>
-        <w:numPr>
-          <w:ilvl w:val="0"/>
-          <w:numId w:val="1013"/>
-        </w:numPr>
-      </w:pPr>
-      <w:r>
-        <w:rPr>
-          <w:b/>
-          <w:bCs/>
-        </w:rPr>
-        <w:t xml:space="preserve">Separation and containment.</w:t>
-      </w:r>
-      <w:r>
-        <w:t xml:space="preserve"> </w:t>
-      </w:r>
-      <w:r>
-        <w:t xml:space="preserve">Where an agent generates and then executes work,</w:t>
-      </w:r>
-      <w:r>
-        <w:t xml:space="preserve"> </w:t>
-      </w:r>
-      <w:r>
-        <w:t xml:space="preserve">generation and execution are separated by an approval gate. A means to halt an agent and</w:t>
-      </w:r>
-      <w:r>
-        <w:t xml:space="preserve"> </w:t>
-      </w:r>
-      <w:r>
-        <w:t xml:space="preserve">revoke its access exists and is exercisable by a designated authority.</w:t>
+        <w:t xml:space="preserve">Accountability.</w:t>
+      </w:r>
+      <w:r>
+        <w:t xml:space="preserve"> </w:t>
+      </w:r>
+      <w:r>
+        <w:t xml:space="preserve">The</w:t>
+      </w:r>
+      <w:r>
+        <w:t xml:space="preserve"> </w:t>
+      </w:r>
+      <w:r>
+        <w:rPr>
+          <w:b/>
+          <w:bCs/>
+        </w:rPr>
+        <w:t xml:space="preserve">Commanding Officer</w:t>
+      </w:r>
+      <w:r>
+        <w:t xml:space="preserve"> </w:t>
+      </w:r>
+      <w:r>
+        <w:t xml:space="preserve">retains overall accountability for</w:t>
+      </w:r>
+      <w:r>
+        <w:t xml:space="preserve"> </w:t>
+      </w:r>
+      <w:r>
+        <w:t xml:space="preserve">AI-augmented command outcomes, as for all command activity. Responsibilities are</w:t>
+      </w:r>
+      <w:r>
+        <w:t xml:space="preserve"> </w:t>
+      </w:r>
+      <w:r>
+        <w:t xml:space="preserve">distributed across the existing roles below; this is a deliberate combination of</w:t>
+      </w:r>
+      <w:r>
+        <w:t xml:space="preserve"> </w:t>
+      </w:r>
+      <w:r>
+        <w:t xml:space="preserve">authorities, not a single new owner and not a new board.</w:t>
       </w:r>
     </w:p>
     <w:p>
@@ -3075,22 +3487,11 @@
         <w:t xml:space="preserve"> </w:t>
       </w:r>
       <w:r>
-        <w:t xml:space="preserve">name the halt/revoke authority (for example the ISSM or the command duty IT watch).</w:t>
-      </w:r>
-    </w:p>
-    <w:bookmarkEnd w:id="20"/>
-    <w:bookmarkStart w:id="21" w:name="roles-responsibilities-and-governance"/>
-    <w:p>
-      <w:pPr>
-        <w:pStyle w:val="Heading2"/>
-      </w:pPr>
-      <w:r>
-        <w:t xml:space="preserve">8. Roles, responsibilities, and governance</w:t>
-      </w:r>
-    </w:p>
-    <w:p>
-      <w:pPr>
-        <w:pStyle w:val="Compact"/>
+        <w:t xml:space="preserve">delegate accountability as appropriate (for example to the Executive Director).</w:t>
+      </w:r>
+    </w:p>
+    <w:p>
+      <w:pPr>
         <w:numPr>
           <w:ilvl w:val="0"/>
           <w:numId w:val="1014"/>
@@ -3101,65 +3502,343 @@
           <w:b/>
           <w:bCs/>
         </w:rPr>
-        <w:t xml:space="preserve">Accountability.</w:t>
-      </w:r>
-      <w:r>
-        <w:t xml:space="preserve"> </w:t>
-      </w:r>
-      <w:r>
-        <w:t xml:space="preserve">The</w:t>
-      </w:r>
-      <w:r>
-        <w:t xml:space="preserve"> </w:t>
-      </w:r>
-      <w:r>
-        <w:rPr>
-          <w:b/>
-          <w:bCs/>
-        </w:rPr>
-        <w:t xml:space="preserve">Commanding Officer</w:t>
-      </w:r>
-      <w:r>
-        <w:t xml:space="preserve"> </w:t>
-      </w:r>
-      <w:r>
-        <w:t xml:space="preserve">retains overall accountability for</w:t>
-      </w:r>
-      <w:r>
-        <w:t xml:space="preserve"> </w:t>
-      </w:r>
-      <w:r>
-        <w:t xml:space="preserve">AI-augmented command outcomes, as for all command activity. Responsibilities are</w:t>
-      </w:r>
-      <w:r>
-        <w:t xml:space="preserve"> </w:t>
-      </w:r>
-      <w:r>
-        <w:t xml:space="preserve">distributed across the existing roles below; this is a deliberate combination of</w:t>
-      </w:r>
-      <w:r>
-        <w:t xml:space="preserve"> </w:t>
-      </w:r>
-      <w:r>
-        <w:t xml:space="preserve">authorities, not a single new owner and not a new board.</w:t>
-      </w:r>
-    </w:p>
-    <w:p>
-      <w:pPr>
-        <w:pStyle w:val="BlockText"/>
-      </w:pPr>
-      <w:r>
-        <w:rPr>
-          <w:b/>
-          <w:bCs/>
-        </w:rPr>
-        <w:t xml:space="preserve">Working group to resolve:</w:t>
-      </w:r>
-      <w:r>
-        <w:t xml:space="preserve"> </w:t>
-      </w:r>
-      <w:r>
-        <w:t xml:space="preserve">delegate accountability as appropriate (for example to the Executive Director).</w:t>
+        <w:t xml:space="preserve">Command Information Officer (CIO) and Information System Security Manager (ISSM).</w:t>
+      </w:r>
+      <w:r>
+        <w:t xml:space="preserve"> </w:t>
+      </w:r>
+      <w:r>
+        <w:t xml:space="preserve">Custodians of the platform, not of department content (Section 5): platform administration,</w:t>
+      </w:r>
+      <w:r>
+        <w:t xml:space="preserve"> </w:t>
+      </w:r>
+      <w:r>
+        <w:t xml:space="preserve">access and identity management, the model/instance and use-case inventory, the registry of</w:t>
+      </w:r>
+      <w:r>
+        <w:t xml:space="preserve"> </w:t>
+      </w:r>
+      <w:r>
+        <w:t xml:space="preserve">repositories connected to askSage, the Continuous Monitoring program (Section 9), the</w:t>
+      </w:r>
+      <w:r>
+        <w:t xml:space="preserve"> </w:t>
+      </w:r>
+      <w:r>
+        <w:t xml:space="preserve">ingress data-loss controls (Section 4.c), and first response to AI security incidents</w:t>
+      </w:r>
+      <w:r>
+        <w:t xml:space="preserve"> </w:t>
+      </w:r>
+      <w:r>
+        <w:t xml:space="preserve">(Section 11). The CIO validates platform and security suitability of proposed use cases.</w:t>
+      </w:r>
+    </w:p>
+    <w:p>
+      <w:pPr>
+        <w:numPr>
+          <w:ilvl w:val="0"/>
+          <w:numId w:val="1014"/>
+        </w:numPr>
+      </w:pPr>
+      <w:r>
+        <w:rPr>
+          <w:b/>
+          <w:bCs/>
+        </w:rPr>
+        <w:t xml:space="preserve">Chief Engineer (CHENG) and chain.</w:t>
+      </w:r>
+      <w:r>
+        <w:t xml:space="preserve"> </w:t>
+      </w:r>
+      <w:r>
+        <w:t xml:space="preserve">Own technical and functional adjudication. The</w:t>
+      </w:r>
+      <w:r>
+        <w:t xml:space="preserve"> </w:t>
+      </w:r>
+      <w:r>
+        <w:t xml:space="preserve">CHENG</w:t>
+      </w:r>
+      <w:r>
+        <w:t xml:space="preserve"> </w:t>
+      </w:r>
+      <w:r>
+        <w:rPr>
+          <w:b/>
+          <w:bCs/>
+        </w:rPr>
+        <w:t xml:space="preserve">concurs</w:t>
+      </w:r>
+      <w:r>
+        <w:t xml:space="preserve"> </w:t>
+      </w:r>
+      <w:r>
+        <w:t xml:space="preserve">on any use case that touches technical specifications, tag-outs, work</w:t>
+      </w:r>
+      <w:r>
+        <w:t xml:space="preserve"> </w:t>
+      </w:r>
+      <w:r>
+        <w:t xml:space="preserve">authorization, quality outcomes, or shipboard systems, and owns the technical</w:t>
+      </w:r>
+      <w:r>
+        <w:t xml:space="preserve"> </w:t>
+      </w:r>
+      <w:r>
+        <w:t xml:space="preserve">human-in-the-loop call (Section 6). A use case is not approved over a CHENG non-concurrence</w:t>
+      </w:r>
+      <w:r>
+        <w:t xml:space="preserve"> </w:t>
+      </w:r>
+      <w:r>
+        <w:t xml:space="preserve">on technical grounds.</w:t>
+      </w:r>
+    </w:p>
+    <w:p>
+      <w:pPr>
+        <w:numPr>
+          <w:ilvl w:val="0"/>
+          <w:numId w:val="1014"/>
+        </w:numPr>
+      </w:pPr>
+      <w:r>
+        <w:rPr>
+          <w:b/>
+          <w:bCs/>
+        </w:rPr>
+        <w:t xml:space="preserve">Staff Judge Advocate / Office of Counsel (Legal).</w:t>
+      </w:r>
+      <w:r>
+        <w:t xml:space="preserve"> </w:t>
+      </w:r>
+      <w:r>
+        <w:t xml:space="preserve">Concurs on records retention,</w:t>
+      </w:r>
+      <w:r>
+        <w:t xml:space="preserve"> </w:t>
+      </w:r>
+      <w:r>
+        <w:t xml:space="preserve">legal hold, spillage records-disposition (Section 11), and host-nation labor and</w:t>
+      </w:r>
+      <w:r>
+        <w:t xml:space="preserve"> </w:t>
+      </w:r>
+      <w:r>
+        <w:t xml:space="preserve">export-control questions before the related provisions take effect.</w:t>
+      </w:r>
+    </w:p>
+    <w:p>
+      <w:pPr>
+        <w:numPr>
+          <w:ilvl w:val="0"/>
+          <w:numId w:val="1014"/>
+        </w:numPr>
+      </w:pPr>
+      <w:r>
+        <w:rPr>
+          <w:b/>
+          <w:bCs/>
+        </w:rPr>
+        <w:t xml:space="preserve">Department Heads.</w:t>
+      </w:r>
+      <w:r>
+        <w:t xml:space="preserve"> </w:t>
+      </w:r>
+      <w:r>
+        <w:rPr>
+          <w:b/>
+          <w:bCs/>
+        </w:rPr>
+        <w:t xml:space="preserve">Own, feed, and control access to their department’s repository</w:t>
+      </w:r>
+      <w:r>
+        <w:rPr>
+          <w:b/>
+          <w:bCs/>
+        </w:rPr>
+        <w:t xml:space="preserve"> </w:t>
+      </w:r>
+      <w:r>
+        <w:rPr>
+          <w:b/>
+          <w:bCs/>
+        </w:rPr>
+        <w:t xml:space="preserve">(Section 5.a)</w:t>
+      </w:r>
+      <w:r>
+        <w:t xml:space="preserve"> </w:t>
+      </w:r>
+      <w:r>
+        <w:t xml:space="preserve">and are responsible for its content and releasability;</w:t>
+      </w:r>
+      <w:r>
+        <w:t xml:space="preserve"> </w:t>
+      </w:r>
+      <w:r>
+        <w:rPr>
+          <w:b/>
+          <w:bCs/>
+        </w:rPr>
+        <w:t xml:space="preserve">propose</w:t>
+      </w:r>
+      <w:r>
+        <w:t xml:space="preserve"> </w:t>
+      </w:r>
+      <w:r>
+        <w:t xml:space="preserve">use cases</w:t>
+      </w:r>
+      <w:r>
+        <w:t xml:space="preserve"> </w:t>
+      </w:r>
+      <w:r>
+        <w:t xml:space="preserve">for their departments (CHENG concurs on technical scope per 8.c; CIO validates</w:t>
+      </w:r>
+      <w:r>
+        <w:t xml:space="preserve"> </w:t>
+      </w:r>
+      <w:r>
+        <w:t xml:space="preserve">platform/security);</w:t>
+      </w:r>
+      <w:r>
+        <w:t xml:space="preserve"> </w:t>
+      </w:r>
+      <w:r>
+        <w:rPr>
+          <w:b/>
+          <w:bCs/>
+        </w:rPr>
+        <w:t xml:space="preserve">designate the department’s authoritative AI content evaluator</w:t>
+      </w:r>
+      <w:r>
+        <w:rPr>
+          <w:b/>
+          <w:bCs/>
+        </w:rPr>
+        <w:t xml:space="preserve"> </w:t>
+      </w:r>
+      <w:r>
+        <w:rPr>
+          <w:b/>
+          <w:bCs/>
+        </w:rPr>
+        <w:t xml:space="preserve">(Section 6.b)</w:t>
+      </w:r>
+      <w:r>
+        <w:t xml:space="preserve"> </w:t>
+      </w:r>
+      <w:r>
+        <w:t xml:space="preserve">and own the authoritative evaluation of their department’s AI content;</w:t>
+      </w:r>
+      <w:r>
+        <w:t xml:space="preserve"> </w:t>
+      </w:r>
+      <w:r>
+        <w:t xml:space="preserve">enforce the human-in-the-loop and least-privilege requirements; and submit their use cases</w:t>
+      </w:r>
+      <w:r>
+        <w:t xml:space="preserve"> </w:t>
+      </w:r>
+      <w:r>
+        <w:t xml:space="preserve">to the inventory.</w:t>
+      </w:r>
+    </w:p>
+    <w:p>
+      <w:pPr>
+        <w:numPr>
+          <w:ilvl w:val="0"/>
+          <w:numId w:val="1014"/>
+        </w:numPr>
+      </w:pPr>
+      <w:r>
+        <w:rPr>
+          <w:b/>
+          <w:bCs/>
+        </w:rPr>
+        <w:t xml:space="preserve">End Users.</w:t>
+      </w:r>
+      <w:r>
+        <w:t xml:space="preserve"> </w:t>
+      </w:r>
+      <w:r>
+        <w:t xml:space="preserve">Verify every AI output against authoritative sources (Section 6.d),</w:t>
+      </w:r>
+      <w:r>
+        <w:t xml:space="preserve"> </w:t>
+      </w:r>
+      <w:r>
+        <w:t xml:space="preserve">apply CUI markings, use only authorized data, and report anomalies and incidents.</w:t>
+      </w:r>
+    </w:p>
+    <w:p>
+      <w:pPr>
+        <w:numPr>
+          <w:ilvl w:val="0"/>
+          <w:numId w:val="1014"/>
+        </w:numPr>
+      </w:pPr>
+      <w:r>
+        <w:rPr>
+          <w:b/>
+          <w:bCs/>
+        </w:rPr>
+        <w:t xml:space="preserve">AI use-case inventory and governance forum.</w:t>
+      </w:r>
+      <w:r>
+        <w:t xml:space="preserve"> </w:t>
+      </w:r>
+      <w:r>
+        <w:t xml:space="preserve">The command maintains an AI use-case</w:t>
+      </w:r>
+      <w:r>
+        <w:t xml:space="preserve"> </w:t>
+      </w:r>
+      <w:r>
+        <w:t xml:space="preserve">inventory, each use case classified by risk (7.d). The</w:t>
+      </w:r>
+      <w:r>
+        <w:t xml:space="preserve"> </w:t>
+      </w:r>
+      <w:r>
+        <w:rPr>
+          <w:b/>
+          <w:bCs/>
+        </w:rPr>
+        <w:t xml:space="preserve">Department Heads review the</w:t>
+      </w:r>
+      <w:r>
+        <w:rPr>
+          <w:b/>
+          <w:bCs/>
+        </w:rPr>
+        <w:t xml:space="preserve"> </w:t>
+      </w:r>
+      <w:r>
+        <w:rPr>
+          <w:b/>
+          <w:bCs/>
+        </w:rPr>
+        <w:t xml:space="preserve">inventory for continuance of approval quarterly</w:t>
+      </w:r>
+      <w:r>
+        <w:t xml:space="preserve">, as the command’s AI governance forum;</w:t>
+      </w:r>
+      <w:r>
+        <w:t xml:space="preserve"> </w:t>
+      </w:r>
+      <w:r>
+        <w:t xml:space="preserve">no new committee is created.</w:t>
+      </w:r>
+    </w:p>
+    <w:bookmarkEnd w:id="21"/>
+    <w:bookmarkStart w:id="22" w:name="monitoring-and-oversight"/>
+    <w:p>
+      <w:pPr>
+        <w:pStyle w:val="Heading2"/>
+      </w:pPr>
+      <w:r>
+        <w:t xml:space="preserve">9. Monitoring and oversight</w:t>
       </w:r>
     </w:p>
     <w:p>
@@ -3174,37 +3853,50 @@
           <w:b/>
           <w:bCs/>
         </w:rPr>
-        <w:t xml:space="preserve">Command Information Officer (CIO) and Information System Security Manager (ISSM).</w:t>
-      </w:r>
-      <w:r>
-        <w:t xml:space="preserve"> </w:t>
-      </w:r>
-      <w:r>
-        <w:t xml:space="preserve">Own the information-technology and information-security side: platform administration,</w:t>
-      </w:r>
-      <w:r>
-        <w:t xml:space="preserve"> </w:t>
-      </w:r>
-      <w:r>
-        <w:t xml:space="preserve">access and identity management, the model/instance and use-case inventory, the central</w:t>
-      </w:r>
-      <w:r>
-        <w:t xml:space="preserve"> </w:t>
-      </w:r>
-      <w:r>
-        <w:t xml:space="preserve">knowledge-base index (Section 5), the Continuous Monitoring program (Section 9), the</w:t>
-      </w:r>
-      <w:r>
-        <w:t xml:space="preserve"> </w:t>
-      </w:r>
-      <w:r>
-        <w:t xml:space="preserve">ingress data-loss controls (Section 4.c), and first response to AI security incidents</w:t>
-      </w:r>
-      <w:r>
-        <w:t xml:space="preserve"> </w:t>
-      </w:r>
-      <w:r>
-        <w:t xml:space="preserve">(Section 11). The CIO validates platform and security suitability of proposed use cases.</w:t>
+        <w:t xml:space="preserve">Continuous Monitoring (ConMon).</w:t>
+      </w:r>
+      <w:r>
+        <w:t xml:space="preserve"> </w:t>
+      </w:r>
+      <w:r>
+        <w:t xml:space="preserve">The ISSM extends the command’s continuous-monitoring</w:t>
+      </w:r>
+      <w:r>
+        <w:t xml:space="preserve"> </w:t>
+      </w:r>
+      <w:r>
+        <w:t xml:space="preserve">program to AI-specific signals: CUI/PII/PHI leakage, prompt injection, model drift,</w:t>
+      </w:r>
+      <w:r>
+        <w:t xml:space="preserve"> </w:t>
+      </w:r>
+      <w:r>
+        <w:t xml:space="preserve">anomalous or unexpected outputs, and shadow (unapproved) AI use. This is independent</w:t>
+      </w:r>
+      <w:r>
+        <w:t xml:space="preserve"> </w:t>
+      </w:r>
+      <w:r>
+        <w:t xml:space="preserve">oversight of AI</w:t>
+      </w:r>
+      <w:r>
+        <w:t xml:space="preserve"> </w:t>
+      </w:r>
+      <w:r>
+        <w:rPr>
+          <w:b/>
+          <w:bCs/>
+        </w:rPr>
+        <w:t xml:space="preserve">system use</w:t>
+      </w:r>
+      <w:r>
+        <w:t xml:space="preserve">, distinct from verifying a work product, and it is the</w:t>
+      </w:r>
+      <w:r>
+        <w:t xml:space="preserve"> </w:t>
+      </w:r>
+      <w:r>
+        <w:t xml:space="preserve">detection layer behind the ingress controls in Section 4.c.</w:t>
       </w:r>
     </w:p>
     <w:p>
@@ -3219,53 +3911,25 @@
           <w:b/>
           <w:bCs/>
         </w:rPr>
-        <w:t xml:space="preserve">Chief Engineer (CHENG) and chain.</w:t>
-      </w:r>
-      <w:r>
-        <w:t xml:space="preserve"> </w:t>
-      </w:r>
-      <w:r>
-        <w:t xml:space="preserve">Own technical and functional adjudication. The</w:t>
-      </w:r>
-      <w:r>
-        <w:t xml:space="preserve"> </w:t>
-      </w:r>
-      <w:r>
-        <w:t xml:space="preserve">CHENG</w:t>
-      </w:r>
-      <w:r>
-        <w:t xml:space="preserve"> </w:t>
-      </w:r>
-      <w:r>
-        <w:rPr>
-          <w:b/>
-          <w:bCs/>
-        </w:rPr>
-        <w:t xml:space="preserve">concurs</w:t>
-      </w:r>
-      <w:r>
-        <w:t xml:space="preserve"> </w:t>
-      </w:r>
-      <w:r>
-        <w:t xml:space="preserve">on any use case that touches technical specifications, tag-outs, work</w:t>
-      </w:r>
-      <w:r>
-        <w:t xml:space="preserve"> </w:t>
-      </w:r>
-      <w:r>
-        <w:t xml:space="preserve">authorization, quality outcomes, or shipboard systems, and owns the technical</w:t>
-      </w:r>
-      <w:r>
-        <w:t xml:space="preserve"> </w:t>
-      </w:r>
-      <w:r>
-        <w:t xml:space="preserve">human-in-the-loop call (Section 6). A use case is not approved over a CHENG non-concurrence</w:t>
-      </w:r>
-      <w:r>
-        <w:t xml:space="preserve"> </w:t>
-      </w:r>
-      <w:r>
-        <w:t xml:space="preserve">on technical grounds.</w:t>
+        <w:t xml:space="preserve">Work-product verification stays in Quality Assurance.</w:t>
+      </w:r>
+      <w:r>
+        <w:t xml:space="preserve"> </w:t>
+      </w:r>
+      <w:r>
+        <w:t xml:space="preserve">Verifying an AI-influenced</w:t>
+      </w:r>
+      <w:r>
+        <w:t xml:space="preserve"> </w:t>
+      </w:r>
+      <w:r>
+        <w:t xml:space="preserve">work product is performed through the command’s existing Quality Assurance checkpoint</w:t>
+      </w:r>
+      <w:r>
+        <w:t xml:space="preserve"> </w:t>
+      </w:r>
+      <w:r>
+        <w:t xml:space="preserve">system and the CHENG chain. The command does not stand up a separate AI audit shop.</w:t>
       </w:r>
     </w:p>
     <w:p>
@@ -3280,25 +3944,25 @@
           <w:b/>
           <w:bCs/>
         </w:rPr>
-        <w:t xml:space="preserve">Staff Judge Advocate / Office of Counsel (Legal).</w:t>
-      </w:r>
-      <w:r>
-        <w:t xml:space="preserve"> </w:t>
-      </w:r>
-      <w:r>
-        <w:t xml:space="preserve">Concurs on records retention,</w:t>
-      </w:r>
-      <w:r>
-        <w:t xml:space="preserve"> </w:t>
-      </w:r>
-      <w:r>
-        <w:t xml:space="preserve">legal hold, spillage records-disposition (Section 11), and host-nation labor and</w:t>
-      </w:r>
-      <w:r>
-        <w:t xml:space="preserve"> </w:t>
-      </w:r>
-      <w:r>
-        <w:t xml:space="preserve">export-control questions before the related provisions take effect.</w:t>
+        <w:t xml:space="preserve">Quality and drift.</w:t>
+      </w:r>
+      <w:r>
+        <w:t xml:space="preserve"> </w:t>
+      </w:r>
+      <w:r>
+        <w:t xml:space="preserve">Monitoring covers output quality and model drift, not only cost</w:t>
+      </w:r>
+      <w:r>
+        <w:t xml:space="preserve"> </w:t>
+      </w:r>
+      <w:r>
+        <w:t xml:space="preserve">(Annex A). Repeated or unexpected outputs, and the prompts that produced them, are reported</w:t>
+      </w:r>
+      <w:r>
+        <w:t xml:space="preserve"> </w:t>
+      </w:r>
+      <w:r>
+        <w:t xml:space="preserve">to the ISSM as possible model or security indicators.</w:t>
       </w:r>
     </w:p>
     <w:p>
@@ -3313,159 +3977,29 @@
           <w:b/>
           <w:bCs/>
         </w:rPr>
-        <w:t xml:space="preserve">Department Heads.</w:t>
-      </w:r>
-      <w:r>
-        <w:t xml:space="preserve"> </w:t>
-      </w:r>
-      <w:r>
-        <w:rPr>
-          <w:b/>
-          <w:bCs/>
-        </w:rPr>
-        <w:t xml:space="preserve">Propose</w:t>
-      </w:r>
-      <w:r>
-        <w:t xml:space="preserve"> </w:t>
-      </w:r>
-      <w:r>
-        <w:t xml:space="preserve">use cases for their departments (CHENG concurs on</w:t>
-      </w:r>
-      <w:r>
-        <w:t xml:space="preserve"> </w:t>
-      </w:r>
-      <w:r>
-        <w:t xml:space="preserve">technical scope per 8.c; CIO validates platform/security),</w:t>
-      </w:r>
-      <w:r>
-        <w:t xml:space="preserve"> </w:t>
-      </w:r>
-      <w:r>
-        <w:rPr>
-          <w:b/>
-          <w:bCs/>
-        </w:rPr>
-        <w:t xml:space="preserve">designate the department’s</w:t>
-      </w:r>
-      <w:r>
-        <w:rPr>
-          <w:b/>
-          <w:bCs/>
-        </w:rPr>
-        <w:t xml:space="preserve"> </w:t>
-      </w:r>
-      <w:r>
-        <w:rPr>
-          <w:b/>
-          <w:bCs/>
-        </w:rPr>
-        <w:t xml:space="preserve">authoritative AI content evaluator (Section 6.b)</w:t>
-      </w:r>
-      <w:r>
-        <w:t xml:space="preserve">, enforce the human-in-the-loop and</w:t>
-      </w:r>
-      <w:r>
-        <w:t xml:space="preserve"> </w:t>
-      </w:r>
-      <w:r>
-        <w:t xml:space="preserve">least-privilege requirements, and submit their use cases to the inventory.</w:t>
-      </w:r>
-    </w:p>
-    <w:p>
-      <w:pPr>
-        <w:numPr>
-          <w:ilvl w:val="0"/>
-          <w:numId w:val="1015"/>
-        </w:numPr>
-      </w:pPr>
-      <w:r>
-        <w:rPr>
-          <w:b/>
-          <w:bCs/>
-        </w:rPr>
-        <w:t xml:space="preserve">End Users.</w:t>
-      </w:r>
-      <w:r>
-        <w:t xml:space="preserve"> </w:t>
-      </w:r>
-      <w:r>
-        <w:t xml:space="preserve">Verify every AI output against authoritative sources (Section 6.c),</w:t>
-      </w:r>
-      <w:r>
-        <w:t xml:space="preserve"> </w:t>
-      </w:r>
-      <w:r>
-        <w:t xml:space="preserve">apply CUI markings, use only authorized data, and report anomalies and incidents.</w:t>
-      </w:r>
-    </w:p>
-    <w:p>
-      <w:pPr>
-        <w:numPr>
-          <w:ilvl w:val="0"/>
-          <w:numId w:val="1015"/>
-        </w:numPr>
-      </w:pPr>
-      <w:r>
-        <w:rPr>
-          <w:b/>
-          <w:bCs/>
-        </w:rPr>
-        <w:t xml:space="preserve">AI use-case inventory and governance forum.</w:t>
-      </w:r>
-      <w:r>
-        <w:t xml:space="preserve"> </w:t>
-      </w:r>
-      <w:r>
-        <w:t xml:space="preserve">The command maintains an AI use-case</w:t>
-      </w:r>
-      <w:r>
-        <w:t xml:space="preserve"> </w:t>
-      </w:r>
-      <w:r>
-        <w:t xml:space="preserve">inventory, each use case classified by risk (7.d). The</w:t>
-      </w:r>
-      <w:r>
-        <w:t xml:space="preserve"> </w:t>
-      </w:r>
-      <w:r>
-        <w:rPr>
-          <w:b/>
-          <w:bCs/>
-        </w:rPr>
-        <w:t xml:space="preserve">Department Heads review the</w:t>
-      </w:r>
-      <w:r>
-        <w:rPr>
-          <w:b/>
-          <w:bCs/>
-        </w:rPr>
-        <w:t xml:space="preserve"> </w:t>
-      </w:r>
-      <w:r>
-        <w:rPr>
-          <w:b/>
-          <w:bCs/>
-        </w:rPr>
-        <w:t xml:space="preserve">inventory for continuance of approval quarterly</w:t>
-      </w:r>
-      <w:r>
-        <w:t xml:space="preserve">, as the command’s AI governance forum;</w:t>
-      </w:r>
-      <w:r>
-        <w:t xml:space="preserve"> </w:t>
-      </w:r>
-      <w:r>
-        <w:t xml:space="preserve">no new committee is created.</w:t>
-      </w:r>
-    </w:p>
-    <w:bookmarkEnd w:id="21"/>
-    <w:bookmarkStart w:id="22" w:name="monitoring-and-oversight"/>
+        <w:t xml:space="preserve">Program metrics.</w:t>
+      </w:r>
+      <w:r>
+        <w:t xml:space="preserve"> </w:t>
+      </w:r>
+      <w:r>
+        <w:t xml:space="preserve">The command tracks whether the governance is working — user</w:t>
+      </w:r>
+      <w:r>
+        <w:t xml:space="preserve"> </w:t>
+      </w:r>
+      <w:r>
+        <w:t xml:space="preserve">awareness, compliance, and incident trend — not only platform usage.</w:t>
+      </w:r>
+    </w:p>
+    <w:bookmarkEnd w:id="22"/>
+    <w:bookmarkStart w:id="23" w:name="records-management-and-legal-hold"/>
     <w:p>
       <w:pPr>
         <w:pStyle w:val="Heading2"/>
       </w:pPr>
       <w:r>
-        <w:t xml:space="preserve">9. Monitoring and oversight</w:t>
+        <w:t xml:space="preserve">10. Records management and legal hold</w:t>
       </w:r>
     </w:p>
     <w:p>
@@ -3480,50 +4014,31 @@
           <w:b/>
           <w:bCs/>
         </w:rPr>
-        <w:t xml:space="preserve">Continuous Monitoring (ConMon).</w:t>
-      </w:r>
-      <w:r>
-        <w:t xml:space="preserve"> </w:t>
-      </w:r>
-      <w:r>
-        <w:t xml:space="preserve">The ISSM extends the command’s continuous-monitoring</w:t>
-      </w:r>
-      <w:r>
-        <w:t xml:space="preserve"> </w:t>
-      </w:r>
-      <w:r>
-        <w:t xml:space="preserve">program to AI-specific signals: CUI/PII/PHI leakage, prompt injection, model drift,</w:t>
-      </w:r>
-      <w:r>
-        <w:t xml:space="preserve"> </w:t>
-      </w:r>
-      <w:r>
-        <w:t xml:space="preserve">anomalous or unexpected outputs, and shadow (unapproved) AI use. This is independent</w:t>
-      </w:r>
-      <w:r>
-        <w:t xml:space="preserve"> </w:t>
-      </w:r>
-      <w:r>
-        <w:t xml:space="preserve">oversight of AI</w:t>
-      </w:r>
-      <w:r>
-        <w:t xml:space="preserve"> </w:t>
-      </w:r>
-      <w:r>
-        <w:rPr>
-          <w:b/>
-          <w:bCs/>
-        </w:rPr>
-        <w:t xml:space="preserve">system use</w:t>
-      </w:r>
-      <w:r>
-        <w:t xml:space="preserve">, distinct from verifying a work product, and it is the</w:t>
-      </w:r>
-      <w:r>
-        <w:t xml:space="preserve"> </w:t>
-      </w:r>
-      <w:r>
-        <w:t xml:space="preserve">detection layer behind the ingress controls in Section 4.c.</w:t>
+        <w:t xml:space="preserve">Agentic logs are Federal Records.</w:t>
+      </w:r>
+      <w:r>
+        <w:t xml:space="preserve"> </w:t>
+      </w:r>
+      <w:r>
+        <w:t xml:space="preserve">An agent’s prompts and chain-of-thought are</w:t>
+      </w:r>
+      <w:r>
+        <w:t xml:space="preserve"> </w:t>
+      </w:r>
+      <w:r>
+        <w:t xml:space="preserve">decision-support artifacts and potential evidence in a Judge Advocate General Manual</w:t>
+      </w:r>
+      <w:r>
+        <w:t xml:space="preserve"> </w:t>
+      </w:r>
+      <w:r>
+        <w:t xml:space="preserve">(JAGMAN) safety or mishap investigation, subject to Freedom of Information Act (FOIA) and</w:t>
+      </w:r>
+      <w:r>
+        <w:t xml:space="preserve"> </w:t>
+      </w:r>
+      <w:r>
+        <w:t xml:space="preserve">records obligations. They are not ephemeral chat.</w:t>
       </w:r>
     </w:p>
     <w:p>
@@ -3538,99 +4053,76 @@
           <w:b/>
           <w:bCs/>
         </w:rPr>
-        <w:t xml:space="preserve">Work-product verification stays in Quality Assurance.</w:t>
-      </w:r>
-      <w:r>
-        <w:t xml:space="preserve"> </w:t>
-      </w:r>
-      <w:r>
-        <w:t xml:space="preserve">Verifying an AI-influenced</w:t>
-      </w:r>
-      <w:r>
-        <w:t xml:space="preserve"> </w:t>
-      </w:r>
-      <w:r>
-        <w:t xml:space="preserve">work product is performed through the command’s existing Quality Assurance checkpoint</w:t>
-      </w:r>
-      <w:r>
-        <w:t xml:space="preserve"> </w:t>
-      </w:r>
-      <w:r>
-        <w:t xml:space="preserve">system and the CHENG chain. The command does not stand up a separate AI audit shop.</w:t>
-      </w:r>
-    </w:p>
-    <w:p>
-      <w:pPr>
-        <w:numPr>
-          <w:ilvl w:val="0"/>
-          <w:numId w:val="1016"/>
-        </w:numPr>
-      </w:pPr>
-      <w:r>
-        <w:rPr>
-          <w:b/>
-          <w:bCs/>
-        </w:rPr>
-        <w:t xml:space="preserve">Quality and drift.</w:t>
-      </w:r>
-      <w:r>
-        <w:t xml:space="preserve"> </w:t>
-      </w:r>
-      <w:r>
-        <w:t xml:space="preserve">Monitoring covers output quality and model drift, not only cost</w:t>
-      </w:r>
-      <w:r>
-        <w:t xml:space="preserve"> </w:t>
-      </w:r>
-      <w:r>
-        <w:t xml:space="preserve">(Annex A). Repeated or unexpected outputs, and the prompts that produced them, are reported</w:t>
-      </w:r>
-      <w:r>
-        <w:t xml:space="preserve"> </w:t>
-      </w:r>
-      <w:r>
-        <w:t xml:space="preserve">to the ISSM as possible model or security indicators.</w:t>
-      </w:r>
-    </w:p>
-    <w:p>
-      <w:pPr>
-        <w:numPr>
-          <w:ilvl w:val="0"/>
-          <w:numId w:val="1016"/>
-        </w:numPr>
-      </w:pPr>
-      <w:r>
-        <w:rPr>
-          <w:b/>
-          <w:bCs/>
-        </w:rPr>
-        <w:t xml:space="preserve">Program metrics.</w:t>
-      </w:r>
-      <w:r>
-        <w:t xml:space="preserve"> </w:t>
-      </w:r>
-      <w:r>
-        <w:t xml:space="preserve">The command tracks whether the governance is working — user</w:t>
-      </w:r>
-      <w:r>
-        <w:t xml:space="preserve"> </w:t>
-      </w:r>
-      <w:r>
-        <w:t xml:space="preserve">awareness, compliance, and incident trend — not only platform usage.</w:t>
-      </w:r>
-    </w:p>
-    <w:bookmarkEnd w:id="22"/>
-    <w:bookmarkStart w:id="23" w:name="records-management-and-legal-hold"/>
+        <w:t xml:space="preserve">Retention and hold.</w:t>
+      </w:r>
+      <w:r>
+        <w:t xml:space="preserve"> </w:t>
+      </w:r>
+      <w:r>
+        <w:t xml:space="preserve">AI interaction logs are retained per the applicable records</w:t>
+      </w:r>
+      <w:r>
+        <w:t xml:space="preserve"> </w:t>
+      </w:r>
+      <w:r>
+        <w:t xml:space="preserve">schedule, with a legal-hold capability, and are managed in accordance with the command’s</w:t>
+      </w:r>
+      <w:r>
+        <w:t xml:space="preserve"> </w:t>
+      </w:r>
+      <w:r>
+        <w:t xml:space="preserve">Standard Organization and Regulations Manual (SORM) and records program. Using AI does not</w:t>
+      </w:r>
+      <w:r>
+        <w:t xml:space="preserve"> </w:t>
+      </w:r>
+      <w:r>
+        <w:t xml:space="preserve">waive any records, FOIA, or privacy obligation.</w:t>
+      </w:r>
+      <w:r>
+        <w:t xml:space="preserve"> </w:t>
+      </w:r>
+      <w:r>
+        <w:rPr>
+          <w:b/>
+          <w:bCs/>
+        </w:rPr>
+        <w:t xml:space="preserve">Legal concurs</w:t>
+      </w:r>
+      <w:r>
+        <w:t xml:space="preserve"> </w:t>
+      </w:r>
+      <w:r>
+        <w:t xml:space="preserve">on retention and hold.</w:t>
+      </w:r>
+      <w:r>
+        <w:t xml:space="preserve"> </w:t>
+      </w:r>
+      <w:r>
+        <w:t xml:space="preserve">(For the spillage exception to ordinary retention, see Section 11.a.)</w:t>
+      </w:r>
+    </w:p>
+    <w:bookmarkEnd w:id="23"/>
+    <w:bookmarkStart w:id="24" w:name="incident-reporting"/>
     <w:p>
       <w:pPr>
         <w:pStyle w:val="Heading2"/>
       </w:pPr>
       <w:r>
-        <w:t xml:space="preserve">10. Records management and legal hold</w:t>
-      </w:r>
-    </w:p>
-    <w:p>
-      <w:pPr>
+        <w:t xml:space="preserve">11. Incident reporting</w:t>
+      </w:r>
+    </w:p>
+    <w:p>
+      <w:pPr>
+        <w:pStyle w:val="FirstParagraph"/>
+      </w:pPr>
+      <w:r>
+        <w:t xml:space="preserve">The reporting chain depends on the type of incident:</w:t>
+      </w:r>
+    </w:p>
+    <w:p>
+      <w:pPr>
+        <w:pStyle w:val="Compact"/>
         <w:numPr>
           <w:ilvl w:val="0"/>
           <w:numId w:val="1017"/>
@@ -3641,109 +4133,153 @@
           <w:b/>
           <w:bCs/>
         </w:rPr>
-        <w:t xml:space="preserve">Agentic logs are Federal Records.</w:t>
-      </w:r>
-      <w:r>
-        <w:t xml:space="preserve"> </w:t>
-      </w:r>
-      <w:r>
-        <w:t xml:space="preserve">An agent’s prompts and chain-of-thought are</w:t>
-      </w:r>
-      <w:r>
-        <w:t xml:space="preserve"> </w:t>
-      </w:r>
-      <w:r>
-        <w:t xml:space="preserve">decision-support artifacts and potential evidence in a Judge Advocate General Manual</w:t>
-      </w:r>
-      <w:r>
-        <w:t xml:space="preserve"> </w:t>
-      </w:r>
-      <w:r>
-        <w:t xml:space="preserve">(JAGMAN) safety or mishap investigation, subject to Freedom of Information Act (FOIA) and</w:t>
-      </w:r>
-      <w:r>
-        <w:t xml:space="preserve"> </w:t>
-      </w:r>
-      <w:r>
-        <w:t xml:space="preserve">records obligations. They are not ephemeral chat.</w:t>
-      </w:r>
-    </w:p>
-    <w:p>
-      <w:pPr>
-        <w:numPr>
-          <w:ilvl w:val="0"/>
-          <w:numId w:val="1017"/>
-        </w:numPr>
-      </w:pPr>
-      <w:r>
-        <w:rPr>
-          <w:b/>
-          <w:bCs/>
-        </w:rPr>
-        <w:t xml:space="preserve">Retention and hold.</w:t>
-      </w:r>
-      <w:r>
-        <w:t xml:space="preserve"> </w:t>
-      </w:r>
-      <w:r>
-        <w:t xml:space="preserve">AI interaction logs are retained per the applicable records</w:t>
-      </w:r>
-      <w:r>
-        <w:t xml:space="preserve"> </w:t>
-      </w:r>
-      <w:r>
-        <w:t xml:space="preserve">schedule, with a legal-hold capability. Using AI does not waive any records, FOIA, or</w:t>
-      </w:r>
-      <w:r>
-        <w:t xml:space="preserve"> </w:t>
-      </w:r>
-      <w:r>
-        <w:t xml:space="preserve">privacy obligation.</w:t>
-      </w:r>
-      <w:r>
-        <w:t xml:space="preserve"> </w:t>
-      </w:r>
-      <w:r>
-        <w:rPr>
-          <w:b/>
-          <w:bCs/>
-        </w:rPr>
-        <w:t xml:space="preserve">Legal concurs</w:t>
-      </w:r>
-      <w:r>
-        <w:t xml:space="preserve"> </w:t>
-      </w:r>
-      <w:r>
-        <w:t xml:space="preserve">on retention and hold. (For the spillage exception</w:t>
-      </w:r>
-      <w:r>
-        <w:t xml:space="preserve"> </w:t>
-      </w:r>
-      <w:r>
-        <w:t xml:space="preserve">to ordinary retention, see Section 11.a.)</w:t>
-      </w:r>
-    </w:p>
-    <w:bookmarkEnd w:id="23"/>
-    <w:bookmarkStart w:id="24" w:name="incident-reporting"/>
-    <w:p>
-      <w:pPr>
-        <w:pStyle w:val="Heading2"/>
-      </w:pPr>
-      <w:r>
-        <w:t xml:space="preserve">11. Incident reporting</w:t>
-      </w:r>
-    </w:p>
-    <w:p>
-      <w:pPr>
-        <w:pStyle w:val="FirstParagraph"/>
-      </w:pPr>
-      <w:r>
-        <w:t xml:space="preserve">The reporting chain depends on the type of incident:</w:t>
-      </w:r>
-    </w:p>
-    <w:p>
-      <w:pPr>
-        <w:pStyle w:val="Compact"/>
+        <w:t xml:space="preserve">Spillage (security).</w:t>
+      </w:r>
+      <w:r>
+        <w:t xml:space="preserve"> </w:t>
+      </w:r>
+      <w:r>
+        <w:t xml:space="preserve">If classified information or NNPI is entered into askSage, or</w:t>
+      </w:r>
+      <w:r>
+        <w:t xml:space="preserve"> </w:t>
+      </w:r>
+      <w:r>
+        <w:t xml:space="preserve">the AI outputs apparent classified material through aggregation, the user immediately</w:t>
+      </w:r>
+      <w:r>
+        <w:t xml:space="preserve"> </w:t>
+      </w:r>
+      <w:r>
+        <w:t xml:space="preserve">stops the session and</w:t>
+      </w:r>
+      <w:r>
+        <w:t xml:space="preserve"> </w:t>
+      </w:r>
+      <w:r>
+        <w:rPr>
+          <w:b/>
+          <w:bCs/>
+        </w:rPr>
+        <w:t xml:space="preserve">does not delete the prompt</w:t>
+      </w:r>
+      <w:r>
+        <w:t xml:space="preserve"> </w:t>
+      </w:r>
+      <w:r>
+        <w:t xml:space="preserve">(preserve it for forensics), and</w:t>
+      </w:r>
+      <w:r>
+        <w:t xml:space="preserve"> </w:t>
+      </w:r>
+      <w:r>
+        <w:t xml:space="preserve">notifies the Security Manager and ISSM. The spilled material is then</w:t>
+      </w:r>
+      <w:r>
+        <w:t xml:space="preserve"> </w:t>
+      </w:r>
+      <w:r>
+        <w:rPr>
+          <w:b/>
+          <w:bCs/>
+        </w:rPr>
+        <w:t xml:space="preserve">isolated and routed</w:t>
+      </w:r>
+      <w:r>
+        <w:rPr>
+          <w:b/>
+          <w:bCs/>
+        </w:rPr>
+        <w:t xml:space="preserve"> </w:t>
+      </w:r>
+      <w:r>
+        <w:rPr>
+          <w:b/>
+          <w:bCs/>
+        </w:rPr>
+        <w:t xml:space="preserve">to the formal security spillage-cleanup and records-disposition process</w:t>
+      </w:r>
+      <w:r>
+        <w:t xml:space="preserve"> </w:t>
+      </w:r>
+      <w:r>
+        <w:t xml:space="preserve">— including</w:t>
+      </w:r>
+      <w:r>
+        <w:t xml:space="preserve"> </w:t>
+      </w:r>
+      <w:r>
+        <w:t xml:space="preserve">emergency destruction of the affected records where authorized —</w:t>
+      </w:r>
+      <w:r>
+        <w:t xml:space="preserve"> </w:t>
+      </w:r>
+      <w:r>
+        <w:rPr>
+          <w:b/>
+          <w:bCs/>
+        </w:rPr>
+        <w:t xml:space="preserve">only after Security</w:t>
+      </w:r>
+      <w:r>
+        <w:rPr>
+          <w:b/>
+          <w:bCs/>
+        </w:rPr>
+        <w:t xml:space="preserve"> </w:t>
+      </w:r>
+      <w:r>
+        <w:rPr>
+          <w:b/>
+          <w:bCs/>
+        </w:rPr>
+        <w:t xml:space="preserve">Manager and Legal adjudication.</w:t>
+      </w:r>
+      <w:r>
+        <w:t xml:space="preserve"> </w:t>
+      </w:r>
+      <w:r>
+        <w:t xml:space="preserve">This is the deliberate exception to ordinary records</w:t>
+      </w:r>
+      <w:r>
+        <w:t xml:space="preserve"> </w:t>
+      </w:r>
+      <w:r>
+        <w:t xml:space="preserve">retention (Section 10): a spilled classified record is not preserved as a permanent record</w:t>
+      </w:r>
+      <w:r>
+        <w:t xml:space="preserve"> </w:t>
+      </w:r>
+      <w:r>
+        <w:t xml:space="preserve">inside the CUI/IL5 store. Report through security channels, including the Naval Criminal</w:t>
+      </w:r>
+      <w:r>
+        <w:t xml:space="preserve"> </w:t>
+      </w:r>
+      <w:r>
+        <w:t xml:space="preserve">Investigative Service (NCIS) as required.</w:t>
+      </w:r>
+    </w:p>
+    <w:p>
+      <w:pPr>
+        <w:pStyle w:val="BlockText"/>
+      </w:pPr>
+      <w:r>
+        <w:rPr>
+          <w:b/>
+          <w:bCs/>
+        </w:rPr>
+        <w:t xml:space="preserve">Working group to resolve:</w:t>
+      </w:r>
+      <w:r>
+        <w:t xml:space="preserve"> </w:t>
+      </w:r>
+      <w:r>
+        <w:t xml:space="preserve">align this flow with the command’s security spillage procedures and records-destruction authority (ref (j)).</w:t>
+      </w:r>
+    </w:p>
+    <w:p>
+      <w:pPr>
         <w:numPr>
           <w:ilvl w:val="0"/>
           <w:numId w:val="1018"/>
@@ -3754,149 +4290,68 @@
           <w:b/>
           <w:bCs/>
         </w:rPr>
-        <w:t xml:space="preserve">Spillage (security).</w:t>
-      </w:r>
-      <w:r>
-        <w:t xml:space="preserve"> </w:t>
-      </w:r>
-      <w:r>
-        <w:t xml:space="preserve">If classified information or NNPI is entered into askSage, or</w:t>
-      </w:r>
-      <w:r>
-        <w:t xml:space="preserve"> </w:t>
-      </w:r>
-      <w:r>
-        <w:t xml:space="preserve">the AI outputs apparent classified material through aggregation, the user immediately</w:t>
-      </w:r>
-      <w:r>
-        <w:t xml:space="preserve"> </w:t>
-      </w:r>
-      <w:r>
-        <w:t xml:space="preserve">stops the session and</w:t>
-      </w:r>
-      <w:r>
-        <w:t xml:space="preserve"> </w:t>
-      </w:r>
-      <w:r>
-        <w:rPr>
-          <w:b/>
-          <w:bCs/>
-        </w:rPr>
-        <w:t xml:space="preserve">does not delete the prompt</w:t>
-      </w:r>
-      <w:r>
-        <w:t xml:space="preserve"> </w:t>
-      </w:r>
-      <w:r>
-        <w:t xml:space="preserve">(preserve it for forensics), and</w:t>
-      </w:r>
-      <w:r>
-        <w:t xml:space="preserve"> </w:t>
-      </w:r>
-      <w:r>
-        <w:t xml:space="preserve">notifies the Security Manager and ISSM. The spilled material is then</w:t>
-      </w:r>
-      <w:r>
-        <w:t xml:space="preserve"> </w:t>
-      </w:r>
-      <w:r>
-        <w:rPr>
-          <w:b/>
-          <w:bCs/>
-        </w:rPr>
-        <w:t xml:space="preserve">isolated and routed</w:t>
-      </w:r>
-      <w:r>
-        <w:rPr>
-          <w:b/>
-          <w:bCs/>
-        </w:rPr>
-        <w:t xml:space="preserve"> </w:t>
-      </w:r>
-      <w:r>
-        <w:rPr>
-          <w:b/>
-          <w:bCs/>
-        </w:rPr>
-        <w:t xml:space="preserve">to the formal security spillage-cleanup and records-disposition process</w:t>
-      </w:r>
-      <w:r>
-        <w:t xml:space="preserve"> </w:t>
-      </w:r>
-      <w:r>
-        <w:t xml:space="preserve">— including</w:t>
-      </w:r>
-      <w:r>
-        <w:t xml:space="preserve"> </w:t>
-      </w:r>
-      <w:r>
-        <w:t xml:space="preserve">emergency destruction of the affected records where authorized —</w:t>
-      </w:r>
-      <w:r>
-        <w:t xml:space="preserve"> </w:t>
-      </w:r>
-      <w:r>
-        <w:rPr>
-          <w:b/>
-          <w:bCs/>
-        </w:rPr>
-        <w:t xml:space="preserve">only after Security</w:t>
-      </w:r>
-      <w:r>
-        <w:rPr>
-          <w:b/>
-          <w:bCs/>
-        </w:rPr>
-        <w:t xml:space="preserve"> </w:t>
-      </w:r>
-      <w:r>
-        <w:rPr>
-          <w:b/>
-          <w:bCs/>
-        </w:rPr>
-        <w:t xml:space="preserve">Manager and Legal adjudication.</w:t>
-      </w:r>
-      <w:r>
-        <w:t xml:space="preserve"> </w:t>
-      </w:r>
-      <w:r>
-        <w:t xml:space="preserve">This is the deliberate exception to ordinary records</w:t>
-      </w:r>
-      <w:r>
-        <w:t xml:space="preserve"> </w:t>
-      </w:r>
-      <w:r>
-        <w:t xml:space="preserve">retention (Section 10): a spilled classified record is not preserved as a permanent record</w:t>
-      </w:r>
-      <w:r>
-        <w:t xml:space="preserve"> </w:t>
-      </w:r>
-      <w:r>
-        <w:t xml:space="preserve">inside the CUI/IL5 store. Report through security channels, including the Naval Criminal</w:t>
-      </w:r>
-      <w:r>
-        <w:t xml:space="preserve"> </w:t>
-      </w:r>
-      <w:r>
-        <w:t xml:space="preserve">Investigative Service (NCIS) as required.</w:t>
-      </w:r>
-    </w:p>
-    <w:p>
-      <w:pPr>
-        <w:pStyle w:val="BlockText"/>
-      </w:pPr>
-      <w:r>
-        <w:rPr>
-          <w:b/>
-          <w:bCs/>
-        </w:rPr>
-        <w:t xml:space="preserve">Working group to resolve:</w:t>
-      </w:r>
-      <w:r>
-        <w:t xml:space="preserve"> </w:t>
-      </w:r>
-      <w:r>
-        <w:t xml:space="preserve">align this flow with the command’s security spillage procedures and records-destruction authority (ref (j)).</w:t>
+        <w:t xml:space="preserve">Safety mishap (hallucination-driven).</w:t>
+      </w:r>
+      <w:r>
+        <w:t xml:space="preserve"> </w:t>
+      </w:r>
+      <w:r>
+        <w:t xml:space="preserve">If an AI error contributes to a safety or</w:t>
+      </w:r>
+      <w:r>
+        <w:t xml:space="preserve"> </w:t>
+      </w:r>
+      <w:r>
+        <w:t xml:space="preserve">quality mishap, it is reported and investigated through the command’s safety and JAGMAN</w:t>
+      </w:r>
+      <w:r>
+        <w:t xml:space="preserve"> </w:t>
+      </w:r>
+      <w:r>
+        <w:t xml:space="preserve">channels.</w:t>
+      </w:r>
+    </w:p>
+    <w:p>
+      <w:pPr>
+        <w:numPr>
+          <w:ilvl w:val="0"/>
+          <w:numId w:val="1018"/>
+        </w:numPr>
+      </w:pPr>
+      <w:r>
+        <w:rPr>
+          <w:b/>
+          <w:bCs/>
+        </w:rPr>
+        <w:t xml:space="preserve">Rogue or anomalous agent behavior.</w:t>
+      </w:r>
+      <w:r>
+        <w:t xml:space="preserve"> </w:t>
+      </w:r>
+      <w:r>
+        <w:t xml:space="preserve">If an agent loops, behaves erratically, or</w:t>
+      </w:r>
+      <w:r>
+        <w:t xml:space="preserve"> </w:t>
+      </w:r>
+      <w:r>
+        <w:t xml:space="preserve">attempts unauthorized access, the user halts it (Section 7.e) and reports to the IT help</w:t>
+      </w:r>
+      <w:r>
+        <w:t xml:space="preserve"> </w:t>
+      </w:r>
+      <w:r>
+        <w:t xml:space="preserve">desk and ISSM.</w:t>
+      </w:r>
+    </w:p>
+    <w:bookmarkEnd w:id="24"/>
+    <w:bookmarkStart w:id="25" w:name="operational-resiliency-ddil"/>
+    <w:p>
+      <w:pPr>
+        <w:pStyle w:val="Heading2"/>
+      </w:pPr>
+      <w:r>
+        <w:t xml:space="preserve">12. Operational resiliency (DDIL)</w:t>
       </w:r>
     </w:p>
     <w:p>
@@ -3907,29 +4362,44 @@
         </w:numPr>
       </w:pPr>
       <w:r>
-        <w:rPr>
-          <w:b/>
-          <w:bCs/>
-        </w:rPr>
-        <w:t xml:space="preserve">Safety mishap (hallucination-driven).</w:t>
-      </w:r>
-      <w:r>
-        <w:t xml:space="preserve"> </w:t>
-      </w:r>
-      <w:r>
-        <w:t xml:space="preserve">If an AI error contributes to a safety or</w:t>
-      </w:r>
-      <w:r>
-        <w:t xml:space="preserve"> </w:t>
-      </w:r>
-      <w:r>
-        <w:t xml:space="preserve">quality mishap, it is reported and investigated through the command’s safety and JAGMAN</w:t>
-      </w:r>
-      <w:r>
-        <w:t xml:space="preserve"> </w:t>
-      </w:r>
-      <w:r>
-        <w:t xml:space="preserve">channels.</w:t>
+        <w:t xml:space="preserve">Ship repair occurs in connectivity-degraded spaces (Disconnected, Degraded,</w:t>
+      </w:r>
+      <w:r>
+        <w:t xml:space="preserve"> </w:t>
+      </w:r>
+      <w:r>
+        <w:t xml:space="preserve">Intermittent, Low-bandwidth, DDIL). No work center shall adopt an askSage-dependent</w:t>
+      </w:r>
+      <w:r>
+        <w:t xml:space="preserve"> </w:t>
+      </w:r>
+      <w:r>
+        <w:t xml:space="preserve">workflow that cannot be reverted to a manual procedure</w:t>
+      </w:r>
+      <w:r>
+        <w:t xml:space="preserve"> </w:t>
+      </w:r>
+      <w:r>
+        <w:rPr>
+          <w:b/>
+          <w:bCs/>
+        </w:rPr>
+        <w:t xml:space="preserve">immediately</w:t>
+      </w:r>
+      <w:r>
+        <w:t xml:space="preserve">. Every AI-enabled</w:t>
+      </w:r>
+      <w:r>
+        <w:t xml:space="preserve"> </w:t>
+      </w:r>
+      <w:r>
+        <w:t xml:space="preserve">workflow must have an immediately-available manual fallback; production never depends on</w:t>
+      </w:r>
+      <w:r>
+        <w:t xml:space="preserve"> </w:t>
+      </w:r>
+      <w:r>
+        <w:t xml:space="preserve">AI-system availability.</w:t>
       </w:r>
     </w:p>
     <w:p>
@@ -3944,35 +4414,41 @@
           <w:b/>
           <w:bCs/>
         </w:rPr>
-        <w:t xml:space="preserve">Rogue or anomalous agent behavior.</w:t>
-      </w:r>
-      <w:r>
-        <w:t xml:space="preserve"> </w:t>
-      </w:r>
-      <w:r>
-        <w:t xml:space="preserve">If an agent loops, behaves erratically, or</w:t>
-      </w:r>
-      <w:r>
-        <w:t xml:space="preserve"> </w:t>
-      </w:r>
-      <w:r>
-        <w:t xml:space="preserve">attempts unauthorized access, the user halts it (Section 7.e) and reports to the IT help</w:t>
-      </w:r>
-      <w:r>
-        <w:t xml:space="preserve"> </w:t>
-      </w:r>
-      <w:r>
-        <w:t xml:space="preserve">desk and ISSM.</w:t>
-      </w:r>
-    </w:p>
-    <w:bookmarkEnd w:id="24"/>
-    <w:bookmarkStart w:id="25" w:name="operational-resiliency-ddil"/>
+        <w:t xml:space="preserve">Manual-reversion certification.</w:t>
+      </w:r>
+      <w:r>
+        <w:t xml:space="preserve"> </w:t>
+      </w:r>
+      <w:r>
+        <w:t xml:space="preserve">On a set cadence (recommend quarterly), Department</w:t>
+      </w:r>
+      <w:r>
+        <w:t xml:space="preserve"> </w:t>
+      </w:r>
+      <w:r>
+        <w:t xml:space="preserve">Heads certify that each AI-enhanced workflow in their department can be executed on the</w:t>
+      </w:r>
+      <w:r>
+        <w:t xml:space="preserve"> </w:t>
+      </w:r>
+      <w:r>
+        <w:t xml:space="preserve">minimum baseline (manual or legacy IT) if the platform or off-island connectivity is lost.</w:t>
+      </w:r>
+      <w:r>
+        <w:t xml:space="preserve"> </w:t>
+      </w:r>
+      <w:r>
+        <w:t xml:space="preserve">AI-generated templates and scripts must be maintainable by human staff offline.</w:t>
+      </w:r>
+    </w:p>
+    <w:bookmarkEnd w:id="25"/>
+    <w:bookmarkStart w:id="26" w:name="training"/>
     <w:p>
       <w:pPr>
         <w:pStyle w:val="Heading2"/>
       </w:pPr>
       <w:r>
-        <w:t xml:space="preserve">12. Operational resiliency (DDIL)</w:t>
+        <w:t xml:space="preserve">13. Training</w:t>
       </w:r>
     </w:p>
     <w:p>
@@ -3983,44 +4459,37 @@
         </w:numPr>
       </w:pPr>
       <w:r>
-        <w:t xml:space="preserve">Ship repair occurs in connectivity-degraded spaces (Disconnected, Degraded,</w:t>
-      </w:r>
-      <w:r>
-        <w:t xml:space="preserve"> </w:t>
-      </w:r>
-      <w:r>
-        <w:t xml:space="preserve">Intermittent, Low-bandwidth, DDIL). No work center shall adopt an askSage-dependent</w:t>
-      </w:r>
-      <w:r>
-        <w:t xml:space="preserve"> </w:t>
-      </w:r>
-      <w:r>
-        <w:t xml:space="preserve">workflow that cannot be reverted to a manual procedure</w:t>
-      </w:r>
-      <w:r>
-        <w:t xml:space="preserve"> </w:t>
-      </w:r>
-      <w:r>
-        <w:rPr>
-          <w:b/>
-          <w:bCs/>
-        </w:rPr>
-        <w:t xml:space="preserve">immediately</w:t>
-      </w:r>
-      <w:r>
-        <w:t xml:space="preserve">. Every AI-enabled</w:t>
-      </w:r>
-      <w:r>
-        <w:t xml:space="preserve"> </w:t>
-      </w:r>
-      <w:r>
-        <w:t xml:space="preserve">workflow must have an immediately-available manual fallback; production never depends on</w:t>
-      </w:r>
-      <w:r>
-        <w:t xml:space="preserve"> </w:t>
-      </w:r>
-      <w:r>
-        <w:t xml:space="preserve">AI-system availability.</w:t>
+        <w:t xml:space="preserve">No account is issued before the user completes the command</w:t>
+      </w:r>
+      <w:r>
+        <w:t xml:space="preserve"> </w:t>
+      </w:r>
+      <w:r>
+        <w:t xml:space="preserve">“Responsible AI and Use”</w:t>
+      </w:r>
+      <w:r>
+        <w:t xml:space="preserve"> </w:t>
+      </w:r>
+      <w:r>
+        <w:t xml:space="preserve">training: authorized vs. prohibited data (Section 4), recognizing classification by</w:t>
+      </w:r>
+      <w:r>
+        <w:t xml:space="preserve"> </w:t>
+      </w:r>
+      <w:r>
+        <w:t xml:space="preserve">compilation in AI output (Section 4.e), the human-in-the-loop and technical-authority</w:t>
+      </w:r>
+      <w:r>
+        <w:t xml:space="preserve"> </w:t>
+      </w:r>
+      <w:r>
+        <w:t xml:space="preserve">rules (Section 6), recognizing AI errors (hallucinations), incident reporting</w:t>
+      </w:r>
+      <w:r>
+        <w:t xml:space="preserve"> </w:t>
+      </w:r>
+      <w:r>
+        <w:t xml:space="preserve">(Section 11), and efficient use.</w:t>
       </w:r>
     </w:p>
     <w:p>
@@ -4031,45 +4500,46 @@
         </w:numPr>
       </w:pPr>
       <w:r>
-        <w:rPr>
-          <w:b/>
-          <w:bCs/>
-        </w:rPr>
-        <w:t xml:space="preserve">Manual-reversion certification.</w:t>
-      </w:r>
-      <w:r>
-        <w:t xml:space="preserve"> </w:t>
-      </w:r>
-      <w:r>
-        <w:t xml:space="preserve">On a set cadence (recommend quarterly), Department</w:t>
-      </w:r>
-      <w:r>
-        <w:t xml:space="preserve"> </w:t>
-      </w:r>
-      <w:r>
-        <w:t xml:space="preserve">Heads certify that each AI-enhanced workflow in their department can be executed on the</w:t>
-      </w:r>
-      <w:r>
-        <w:t xml:space="preserve"> </w:t>
-      </w:r>
-      <w:r>
-        <w:t xml:space="preserve">minimum baseline (manual or legacy IT) if the platform or off-island connectivity is lost.</w:t>
-      </w:r>
-      <w:r>
-        <w:t xml:space="preserve"> </w:t>
-      </w:r>
-      <w:r>
-        <w:t xml:space="preserve">AI-generated templates and scripts must be maintainable by human staff offline.</w:t>
-      </w:r>
-    </w:p>
-    <w:bookmarkEnd w:id="25"/>
-    <w:bookmarkStart w:id="26" w:name="training"/>
+        <w:t xml:space="preserve">Training is role-aware and not limited to end users. The oversight roles (CIO/ISSM,</w:t>
+      </w:r>
+      <w:r>
+        <w:t xml:space="preserve"> </w:t>
+      </w:r>
+      <w:r>
+        <w:t xml:space="preserve">CHENG-chain approvers, Department Heads) are trained for their governance</w:t>
+      </w:r>
+      <w:r>
+        <w:t xml:space="preserve"> </w:t>
+      </w:r>
+      <w:r>
+        <w:t xml:space="preserve">responsibilities. Training recurs; it is not one-and-done.</w:t>
+      </w:r>
+    </w:p>
+    <w:p>
+      <w:pPr>
+        <w:numPr>
+          <w:ilvl w:val="0"/>
+          <w:numId w:val="1020"/>
+        </w:numPr>
+      </w:pPr>
+      <w:r>
+        <w:t xml:space="preserve">Recommended technique: demonstrate a real AI error (for example a fabricated torque</w:t>
+      </w:r>
+      <w:r>
+        <w:t xml:space="preserve"> </w:t>
+      </w:r>
+      <w:r>
+        <w:t xml:space="preserve">value or a non-existent reference) during onboarding to inoculate against automation bias.</w:t>
+      </w:r>
+    </w:p>
+    <w:bookmarkEnd w:id="26"/>
+    <w:bookmarkStart w:id="27" w:name="implementation"/>
     <w:p>
       <w:pPr>
         <w:pStyle w:val="Heading2"/>
       </w:pPr>
       <w:r>
-        <w:t xml:space="preserve">13. Training</w:t>
+        <w:t xml:space="preserve">14. Implementation</w:t>
       </w:r>
     </w:p>
     <w:p>
@@ -4080,37 +4550,29 @@
         </w:numPr>
       </w:pPr>
       <w:r>
-        <w:t xml:space="preserve">No account is issued before the user completes the command</w:t>
-      </w:r>
-      <w:r>
-        <w:t xml:space="preserve"> </w:t>
-      </w:r>
-      <w:r>
-        <w:t xml:space="preserve">“Responsible AI and Use”</w:t>
-      </w:r>
-      <w:r>
-        <w:t xml:space="preserve"> </w:t>
-      </w:r>
-      <w:r>
-        <w:t xml:space="preserve">training: authorized vs. prohibited data (Section 4), recognizing classification by</w:t>
-      </w:r>
-      <w:r>
-        <w:t xml:space="preserve"> </w:t>
-      </w:r>
-      <w:r>
-        <w:t xml:space="preserve">compilation in AI output (Section 4.e), the human-in-the-loop and technical-authority</w:t>
-      </w:r>
-      <w:r>
-        <w:t xml:space="preserve"> </w:t>
-      </w:r>
-      <w:r>
-        <w:t xml:space="preserve">rules (Section 6), recognizing AI errors (hallucinations), incident reporting</w:t>
-      </w:r>
-      <w:r>
-        <w:t xml:space="preserve"> </w:t>
-      </w:r>
-      <w:r>
-        <w:t xml:space="preserve">(Section 11), and efficient use.</w:t>
+        <w:rPr>
+          <w:b/>
+          <w:bCs/>
+        </w:rPr>
+        <w:t xml:space="preserve">Design first, then phase.</w:t>
+      </w:r>
+      <w:r>
+        <w:t xml:space="preserve"> </w:t>
+      </w:r>
+      <w:r>
+        <w:t xml:space="preserve">This instruction is the full design. Roll it out in</w:t>
+      </w:r>
+      <w:r>
+        <w:t xml:space="preserve"> </w:t>
+      </w:r>
+      <w:r>
+        <w:t xml:space="preserve">phases by use case and department, not by shipping a partial policy and adding controls</w:t>
+      </w:r>
+      <w:r>
+        <w:t xml:space="preserve"> </w:t>
+      </w:r>
+      <w:r>
+        <w:t xml:space="preserve">later.</w:t>
       </w:r>
     </w:p>
     <w:p>
@@ -4121,19 +4583,23 @@
         </w:numPr>
       </w:pPr>
       <w:r>
-        <w:t xml:space="preserve">Training is role-aware and not limited to end users. The oversight roles (CIO/ISSM,</w:t>
-      </w:r>
-      <w:r>
-        <w:t xml:space="preserve"> </w:t>
-      </w:r>
-      <w:r>
-        <w:t xml:space="preserve">CHENG-chain approvers, Department Heads) are trained for their governance</w:t>
-      </w:r>
-      <w:r>
-        <w:t xml:space="preserve"> </w:t>
-      </w:r>
-      <w:r>
-        <w:t xml:space="preserve">responsibilities. Training recurs; it is not one-and-done.</w:t>
+        <w:rPr>
+          <w:b/>
+          <w:bCs/>
+        </w:rPr>
+        <w:t xml:space="preserve">Pilot.</w:t>
+      </w:r>
+      <w:r>
+        <w:t xml:space="preserve"> </w:t>
+      </w:r>
+      <w:r>
+        <w:t xml:space="preserve">Begin with a small set of low-risk, high-value, read-only use cases to</w:t>
+      </w:r>
+      <w:r>
+        <w:t xml:space="preserve"> </w:t>
+      </w:r>
+      <w:r>
+        <w:t xml:space="preserve">exercise the governance before extending to write-enabled or higher-risk uses.</w:t>
       </w:r>
     </w:p>
     <w:p>
@@ -4144,141 +4610,54 @@
         </w:numPr>
       </w:pPr>
       <w:r>
-        <w:t xml:space="preserve">Recommended technique: demonstrate a real AI error (for example a fabricated torque</w:t>
-      </w:r>
-      <w:r>
-        <w:t xml:space="preserve"> </w:t>
-      </w:r>
-      <w:r>
-        <w:t xml:space="preserve">value or a non-existent reference) during onboarding to inoculate against automation bias.</w:t>
-      </w:r>
-    </w:p>
-    <w:bookmarkEnd w:id="26"/>
-    <w:bookmarkStart w:id="27" w:name="implementation"/>
-    <w:p>
-      <w:pPr>
-        <w:pStyle w:val="Heading2"/>
-      </w:pPr>
-      <w:r>
-        <w:t xml:space="preserve">14. Implementation</w:t>
+        <w:rPr>
+          <w:b/>
+          <w:bCs/>
+        </w:rPr>
+        <w:t xml:space="preserve">Maturity target: best-in-class.</w:t>
+      </w:r>
+      <w:r>
+        <w:t xml:space="preserve"> </w:t>
+      </w:r>
+      <w:r>
+        <w:t xml:space="preserve">The command’s intent is a best-in-class posture,</w:t>
+      </w:r>
+      <w:r>
+        <w:t xml:space="preserve"> </w:t>
+      </w:r>
+      <w:r>
+        <w:t xml:space="preserve">not a compliance minimum. Accordingly this instruction is mapped to recognized frameworks</w:t>
+      </w:r>
+      <w:r>
+        <w:t xml:space="preserve"> </w:t>
+      </w:r>
+      <w:r>
+        <w:t xml:space="preserve">for defensibility — the DoD AI Ethical Principles and the NIST AI Risk Management</w:t>
+      </w:r>
+      <w:r>
+        <w:t xml:space="preserve"> </w:t>
+      </w:r>
+      <w:r>
+        <w:t xml:space="preserve">Framework functions (Govern, Map, Measure, Manage) — and it is reviewed and updated at</w:t>
+      </w:r>
+      <w:r>
+        <w:t xml:space="preserve"> </w:t>
+      </w:r>
+      <w:r>
+        <w:t xml:space="preserve">least annually and upon any significant change (a new use-case class, a platform change,</w:t>
+      </w:r>
+      <w:r>
+        <w:t xml:space="preserve"> </w:t>
+      </w:r>
+      <w:r>
+        <w:t xml:space="preserve">or a change in governing policy). The CIO, with the CHENG and Legal, owns the review.</w:t>
       </w:r>
     </w:p>
     <w:p>
       <w:pPr>
         <w:numPr>
           <w:ilvl w:val="0"/>
-          <w:numId w:val="1022"/>
-        </w:numPr>
-      </w:pPr>
-      <w:r>
-        <w:rPr>
-          <w:b/>
-          <w:bCs/>
-        </w:rPr>
-        <w:t xml:space="preserve">Design first, then phase.</w:t>
-      </w:r>
-      <w:r>
-        <w:t xml:space="preserve"> </w:t>
-      </w:r>
-      <w:r>
-        <w:t xml:space="preserve">This instruction is the full design. Roll it out in</w:t>
-      </w:r>
-      <w:r>
-        <w:t xml:space="preserve"> </w:t>
-      </w:r>
-      <w:r>
-        <w:t xml:space="preserve">phases by use case and department, not by shipping a partial policy and adding controls</w:t>
-      </w:r>
-      <w:r>
-        <w:t xml:space="preserve"> </w:t>
-      </w:r>
-      <w:r>
-        <w:t xml:space="preserve">later.</w:t>
-      </w:r>
-    </w:p>
-    <w:p>
-      <w:pPr>
-        <w:numPr>
-          <w:ilvl w:val="0"/>
-          <w:numId w:val="1022"/>
-        </w:numPr>
-      </w:pPr>
-      <w:r>
-        <w:rPr>
-          <w:b/>
-          <w:bCs/>
-        </w:rPr>
-        <w:t xml:space="preserve">Pilot.</w:t>
-      </w:r>
-      <w:r>
-        <w:t xml:space="preserve"> </w:t>
-      </w:r>
-      <w:r>
-        <w:t xml:space="preserve">Begin with a small set of low-risk, high-value, read-only use cases to</w:t>
-      </w:r>
-      <w:r>
-        <w:t xml:space="preserve"> </w:t>
-      </w:r>
-      <w:r>
-        <w:t xml:space="preserve">exercise the governance before extending to write-enabled or higher-risk uses.</w:t>
-      </w:r>
-    </w:p>
-    <w:p>
-      <w:pPr>
-        <w:numPr>
-          <w:ilvl w:val="0"/>
-          <w:numId w:val="1022"/>
-        </w:numPr>
-      </w:pPr>
-      <w:r>
-        <w:rPr>
-          <w:b/>
-          <w:bCs/>
-        </w:rPr>
-        <w:t xml:space="preserve">Maturity target: best-in-class.</w:t>
-      </w:r>
-      <w:r>
-        <w:t xml:space="preserve"> </w:t>
-      </w:r>
-      <w:r>
-        <w:t xml:space="preserve">The command’s intent is a best-in-class posture,</w:t>
-      </w:r>
-      <w:r>
-        <w:t xml:space="preserve"> </w:t>
-      </w:r>
-      <w:r>
-        <w:t xml:space="preserve">not a compliance minimum. Accordingly this instruction is mapped to recognized frameworks</w:t>
-      </w:r>
-      <w:r>
-        <w:t xml:space="preserve"> </w:t>
-      </w:r>
-      <w:r>
-        <w:t xml:space="preserve">for defensibility — the DoD AI Ethical Principles and the NIST AI Risk Management</w:t>
-      </w:r>
-      <w:r>
-        <w:t xml:space="preserve"> </w:t>
-      </w:r>
-      <w:r>
-        <w:t xml:space="preserve">Framework functions (Govern, Map, Measure, Manage) — and it is reviewed and updated at</w:t>
-      </w:r>
-      <w:r>
-        <w:t xml:space="preserve"> </w:t>
-      </w:r>
-      <w:r>
-        <w:t xml:space="preserve">least annually and upon any significant change (a new use-case class, a platform change,</w:t>
-      </w:r>
-      <w:r>
-        <w:t xml:space="preserve"> </w:t>
-      </w:r>
-      <w:r>
-        <w:t xml:space="preserve">or a change in governing policy). The CIO, with the CHENG and Legal, owns the review.</w:t>
-      </w:r>
-    </w:p>
-    <w:p>
-      <w:pPr>
-        <w:numPr>
-          <w:ilvl w:val="0"/>
-          <w:numId w:val="1022"/>
+          <w:numId w:val="1021"/>
         </w:numPr>
       </w:pPr>
       <w:r>
@@ -4379,7 +4758,7 @@
         <w:pStyle w:val="Compact"/>
         <w:numPr>
           <w:ilvl w:val="0"/>
-          <w:numId w:val="1023"/>
+          <w:numId w:val="1022"/>
         </w:numPr>
       </w:pPr>
       <w:r>
@@ -4407,7 +4786,7 @@
         <w:pStyle w:val="Compact"/>
         <w:numPr>
           <w:ilvl w:val="0"/>
-          <w:numId w:val="1023"/>
+          <w:numId w:val="1022"/>
         </w:numPr>
       </w:pPr>
       <w:r>
@@ -4435,7 +4814,7 @@
         <w:pStyle w:val="Compact"/>
         <w:numPr>
           <w:ilvl w:val="0"/>
-          <w:numId w:val="1023"/>
+          <w:numId w:val="1022"/>
         </w:numPr>
       </w:pPr>
       <w:r>
@@ -4475,7 +4854,7 @@
         <w:pStyle w:val="Compact"/>
         <w:numPr>
           <w:ilvl w:val="0"/>
-          <w:numId w:val="1023"/>
+          <w:numId w:val="1022"/>
         </w:numPr>
       </w:pPr>
       <w:r>
@@ -4489,13 +4868,13 @@
         <w:t xml:space="preserve"> </w:t>
       </w:r>
       <w:r>
-        <w:t xml:space="preserve">Centralized indexing of large references (Section 5) and a shared, vetted</w:t>
-      </w:r>
-      <w:r>
-        <w:t xml:space="preserve"> </w:t>
-      </w:r>
-      <w:r>
-        <w:t xml:space="preserve">prompt library reduce waste.</w:t>
+        <w:t xml:space="preserve">Indexing large references once at the repository level (Section 5) and a</w:t>
+      </w:r>
+      <w:r>
+        <w:t xml:space="preserve"> </w:t>
+      </w:r>
+      <w:r>
+        <w:t xml:space="preserve">shared, vetted prompt library reduce waste.</w:t>
       </w:r>
     </w:p>
     <w:bookmarkEnd w:id="28"/>
@@ -4968,91 +5347,6 @@
       </w:pPr>
     </w:lvl>
   </w:abstractNum>
-  <w:abstractNum w:abstractNumId="99713">
-    <w:nsid w:val="00A99713"/>
-    <w:multiLevelType w:val="multilevel"/>
-    <w:lvl w:ilvl="0">
-      <w:start w:val="3"/>
-      <w:numFmt w:val="lowerLetter"/>
-      <w:lvlText w:val="%1."/>
-      <w:lvlJc w:val="left"/>
-      <w:pPr>
-        <w:ind w:left="720" w:hanging="360"/>
-      </w:pPr>
-    </w:lvl>
-    <w:lvl w:ilvl="1">
-      <w:start w:val="3"/>
-      <w:numFmt w:val="lowerLetter"/>
-      <w:lvlText w:val="%2."/>
-      <w:lvlJc w:val="left"/>
-      <w:pPr>
-        <w:ind w:left="1440" w:hanging="360"/>
-      </w:pPr>
-    </w:lvl>
-    <w:lvl w:ilvl="2">
-      <w:start w:val="3"/>
-      <w:numFmt w:val="lowerLetter"/>
-      <w:lvlText w:val="%3."/>
-      <w:lvlJc w:val="left"/>
-      <w:pPr>
-        <w:ind w:left="2160" w:hanging="360"/>
-      </w:pPr>
-    </w:lvl>
-    <w:lvl w:ilvl="3">
-      <w:start w:val="3"/>
-      <w:numFmt w:val="lowerLetter"/>
-      <w:lvlText w:val="%4."/>
-      <w:lvlJc w:val="left"/>
-      <w:pPr>
-        <w:ind w:left="2880" w:hanging="360"/>
-      </w:pPr>
-    </w:lvl>
-    <w:lvl w:ilvl="4">
-      <w:start w:val="3"/>
-      <w:numFmt w:val="lowerLetter"/>
-      <w:lvlText w:val="%5."/>
-      <w:lvlJc w:val="left"/>
-      <w:pPr>
-        <w:ind w:left="3600" w:hanging="360"/>
-      </w:pPr>
-    </w:lvl>
-    <w:lvl w:ilvl="5">
-      <w:start w:val="3"/>
-      <w:numFmt w:val="lowerLetter"/>
-      <w:lvlText w:val="%6."/>
-      <w:lvlJc w:val="left"/>
-      <w:pPr>
-        <w:ind w:left="4320" w:hanging="360"/>
-      </w:pPr>
-    </w:lvl>
-    <w:lvl w:ilvl="6">
-      <w:start w:val="3"/>
-      <w:numFmt w:val="lowerLetter"/>
-      <w:lvlText w:val="%7."/>
-      <w:lvlJc w:val="left"/>
-      <w:pPr>
-        <w:ind w:left="5040" w:hanging="360"/>
-      </w:pPr>
-    </w:lvl>
-    <w:lvl w:ilvl="7">
-      <w:start w:val="3"/>
-      <w:numFmt w:val="lowerLetter"/>
-      <w:lvlText w:val="%8."/>
-      <w:lvlJc w:val="left"/>
-      <w:pPr>
-        <w:ind w:left="5760" w:hanging="360"/>
-      </w:pPr>
-    </w:lvl>
-    <w:lvl w:ilvl="8">
-      <w:start w:val="3"/>
-      <w:numFmt w:val="lowerLetter"/>
-      <w:lvlText w:val="%9."/>
-      <w:lvlJc w:val="left"/>
-      <w:pPr>
-        <w:ind w:left="6480" w:hanging="360"/>
-      </w:pPr>
-    </w:lvl>
-  </w:abstractNum>
   <w:abstractNum w:abstractNumId="99712">
     <w:nsid w:val="00A99712"/>
     <w:multiLevelType w:val="multilevel"/>
@@ -5410,33 +5704,33 @@
     </w:lvlOverride>
   </w:num>
   <w:num w:numId="1008">
-    <w:abstractNumId w:val="99713"/>
+    <w:abstractNumId w:val="99712"/>
     <w:lvlOverride w:ilvl="0">
-      <w:startOverride w:val="3"/>
+      <w:startOverride w:val="2"/>
     </w:lvlOverride>
     <w:lvlOverride w:ilvl="1">
-      <w:startOverride w:val="3"/>
+      <w:startOverride w:val="2"/>
     </w:lvlOverride>
     <w:lvlOverride w:ilvl="2">
-      <w:startOverride w:val="3"/>
+      <w:startOverride w:val="2"/>
     </w:lvlOverride>
     <w:lvlOverride w:ilvl="3">
-      <w:startOverride w:val="3"/>
+      <w:startOverride w:val="2"/>
     </w:lvlOverride>
     <w:lvlOverride w:ilvl="4">
-      <w:startOverride w:val="3"/>
+      <w:startOverride w:val="2"/>
     </w:lvlOverride>
     <w:lvlOverride w:ilvl="5">
-      <w:startOverride w:val="3"/>
+      <w:startOverride w:val="2"/>
     </w:lvlOverride>
     <w:lvlOverride w:ilvl="6">
-      <w:startOverride w:val="3"/>
+      <w:startOverride w:val="2"/>
     </w:lvlOverride>
     <w:lvlOverride w:ilvl="7">
-      <w:startOverride w:val="3"/>
+      <w:startOverride w:val="2"/>
     </w:lvlOverride>
     <w:lvlOverride w:ilvl="8">
-      <w:startOverride w:val="3"/>
+      <w:startOverride w:val="2"/>
     </w:lvlOverride>
   </w:num>
   <w:num w:numId="1009">
@@ -5470,9 +5764,6 @@
     </w:lvlOverride>
   </w:num>
   <w:num w:numId="1010">
-    <w:abstractNumId w:val="991"/>
-  </w:num>
-  <w:num w:numId="1011">
     <w:abstractNumId w:val="99712"/>
     <w:lvlOverride w:ilvl="0">
       <w:startOverride w:val="2"/>
@@ -5502,7 +5793,7 @@
       <w:startOverride w:val="2"/>
     </w:lvlOverride>
   </w:num>
-  <w:num w:numId="1012">
+  <w:num w:numId="1011">
     <w:abstractNumId w:val="99715"/>
     <w:lvlOverride w:ilvl="0">
       <w:startOverride w:val="5"/>
@@ -5530,6 +5821,36 @@
     </w:lvlOverride>
     <w:lvlOverride w:ilvl="8">
       <w:startOverride w:val="5"/>
+    </w:lvlOverride>
+  </w:num>
+  <w:num w:numId="1012">
+    <w:abstractNumId w:val="99711"/>
+    <w:lvlOverride w:ilvl="0">
+      <w:startOverride w:val="1"/>
+    </w:lvlOverride>
+    <w:lvlOverride w:ilvl="1">
+      <w:startOverride w:val="1"/>
+    </w:lvlOverride>
+    <w:lvlOverride w:ilvl="2">
+      <w:startOverride w:val="1"/>
+    </w:lvlOverride>
+    <w:lvlOverride w:ilvl="3">
+      <w:startOverride w:val="1"/>
+    </w:lvlOverride>
+    <w:lvlOverride w:ilvl="4">
+      <w:startOverride w:val="1"/>
+    </w:lvlOverride>
+    <w:lvlOverride w:ilvl="5">
+      <w:startOverride w:val="1"/>
+    </w:lvlOverride>
+    <w:lvlOverride w:ilvl="6">
+      <w:startOverride w:val="1"/>
+    </w:lvlOverride>
+    <w:lvlOverride w:ilvl="7">
+      <w:startOverride w:val="1"/>
+    </w:lvlOverride>
+    <w:lvlOverride w:ilvl="8">
+      <w:startOverride w:val="1"/>
     </w:lvlOverride>
   </w:num>
   <w:num w:numId="1013">
@@ -5563,36 +5884,6 @@
     </w:lvlOverride>
   </w:num>
   <w:num w:numId="1014">
-    <w:abstractNumId w:val="99711"/>
-    <w:lvlOverride w:ilvl="0">
-      <w:startOverride w:val="1"/>
-    </w:lvlOverride>
-    <w:lvlOverride w:ilvl="1">
-      <w:startOverride w:val="1"/>
-    </w:lvlOverride>
-    <w:lvlOverride w:ilvl="2">
-      <w:startOverride w:val="1"/>
-    </w:lvlOverride>
-    <w:lvlOverride w:ilvl="3">
-      <w:startOverride w:val="1"/>
-    </w:lvlOverride>
-    <w:lvlOverride w:ilvl="4">
-      <w:startOverride w:val="1"/>
-    </w:lvlOverride>
-    <w:lvlOverride w:ilvl="5">
-      <w:startOverride w:val="1"/>
-    </w:lvlOverride>
-    <w:lvlOverride w:ilvl="6">
-      <w:startOverride w:val="1"/>
-    </w:lvlOverride>
-    <w:lvlOverride w:ilvl="7">
-      <w:startOverride w:val="1"/>
-    </w:lvlOverride>
-    <w:lvlOverride w:ilvl="8">
-      <w:startOverride w:val="1"/>
-    </w:lvlOverride>
-  </w:num>
-  <w:num w:numId="1015">
     <w:abstractNumId w:val="99712"/>
     <w:lvlOverride w:ilvl="0">
       <w:startOverride w:val="2"/>
@@ -5620,6 +5911,36 @@
     </w:lvlOverride>
     <w:lvlOverride w:ilvl="8">
       <w:startOverride w:val="2"/>
+    </w:lvlOverride>
+  </w:num>
+  <w:num w:numId="1015">
+    <w:abstractNumId w:val="99711"/>
+    <w:lvlOverride w:ilvl="0">
+      <w:startOverride w:val="1"/>
+    </w:lvlOverride>
+    <w:lvlOverride w:ilvl="1">
+      <w:startOverride w:val="1"/>
+    </w:lvlOverride>
+    <w:lvlOverride w:ilvl="2">
+      <w:startOverride w:val="1"/>
+    </w:lvlOverride>
+    <w:lvlOverride w:ilvl="3">
+      <w:startOverride w:val="1"/>
+    </w:lvlOverride>
+    <w:lvlOverride w:ilvl="4">
+      <w:startOverride w:val="1"/>
+    </w:lvlOverride>
+    <w:lvlOverride w:ilvl="5">
+      <w:startOverride w:val="1"/>
+    </w:lvlOverride>
+    <w:lvlOverride w:ilvl="6">
+      <w:startOverride w:val="1"/>
+    </w:lvlOverride>
+    <w:lvlOverride w:ilvl="7">
+      <w:startOverride w:val="1"/>
+    </w:lvlOverride>
+    <w:lvlOverride w:ilvl="8">
+      <w:startOverride w:val="1"/>
     </w:lvlOverride>
   </w:num>
   <w:num w:numId="1016">
@@ -5683,36 +6004,6 @@
     </w:lvlOverride>
   </w:num>
   <w:num w:numId="1018">
-    <w:abstractNumId w:val="99711"/>
-    <w:lvlOverride w:ilvl="0">
-      <w:startOverride w:val="1"/>
-    </w:lvlOverride>
-    <w:lvlOverride w:ilvl="1">
-      <w:startOverride w:val="1"/>
-    </w:lvlOverride>
-    <w:lvlOverride w:ilvl="2">
-      <w:startOverride w:val="1"/>
-    </w:lvlOverride>
-    <w:lvlOverride w:ilvl="3">
-      <w:startOverride w:val="1"/>
-    </w:lvlOverride>
-    <w:lvlOverride w:ilvl="4">
-      <w:startOverride w:val="1"/>
-    </w:lvlOverride>
-    <w:lvlOverride w:ilvl="5">
-      <w:startOverride w:val="1"/>
-    </w:lvlOverride>
-    <w:lvlOverride w:ilvl="6">
-      <w:startOverride w:val="1"/>
-    </w:lvlOverride>
-    <w:lvlOverride w:ilvl="7">
-      <w:startOverride w:val="1"/>
-    </w:lvlOverride>
-    <w:lvlOverride w:ilvl="8">
-      <w:startOverride w:val="1"/>
-    </w:lvlOverride>
-  </w:num>
-  <w:num w:numId="1019">
     <w:abstractNumId w:val="99712"/>
     <w:lvlOverride w:ilvl="0">
       <w:startOverride w:val="2"/>
@@ -5740,6 +6031,36 @@
     </w:lvlOverride>
     <w:lvlOverride w:ilvl="8">
       <w:startOverride w:val="2"/>
+    </w:lvlOverride>
+  </w:num>
+  <w:num w:numId="1019">
+    <w:abstractNumId w:val="99711"/>
+    <w:lvlOverride w:ilvl="0">
+      <w:startOverride w:val="1"/>
+    </w:lvlOverride>
+    <w:lvlOverride w:ilvl="1">
+      <w:startOverride w:val="1"/>
+    </w:lvlOverride>
+    <w:lvlOverride w:ilvl="2">
+      <w:startOverride w:val="1"/>
+    </w:lvlOverride>
+    <w:lvlOverride w:ilvl="3">
+      <w:startOverride w:val="1"/>
+    </w:lvlOverride>
+    <w:lvlOverride w:ilvl="4">
+      <w:startOverride w:val="1"/>
+    </w:lvlOverride>
+    <w:lvlOverride w:ilvl="5">
+      <w:startOverride w:val="1"/>
+    </w:lvlOverride>
+    <w:lvlOverride w:ilvl="6">
+      <w:startOverride w:val="1"/>
+    </w:lvlOverride>
+    <w:lvlOverride w:ilvl="7">
+      <w:startOverride w:val="1"/>
+    </w:lvlOverride>
+    <w:lvlOverride w:ilvl="8">
+      <w:startOverride w:val="1"/>
     </w:lvlOverride>
   </w:num>
   <w:num w:numId="1020">
@@ -5803,36 +6124,6 @@
     </w:lvlOverride>
   </w:num>
   <w:num w:numId="1022">
-    <w:abstractNumId w:val="99711"/>
-    <w:lvlOverride w:ilvl="0">
-      <w:startOverride w:val="1"/>
-    </w:lvlOverride>
-    <w:lvlOverride w:ilvl="1">
-      <w:startOverride w:val="1"/>
-    </w:lvlOverride>
-    <w:lvlOverride w:ilvl="2">
-      <w:startOverride w:val="1"/>
-    </w:lvlOverride>
-    <w:lvlOverride w:ilvl="3">
-      <w:startOverride w:val="1"/>
-    </w:lvlOverride>
-    <w:lvlOverride w:ilvl="4">
-      <w:startOverride w:val="1"/>
-    </w:lvlOverride>
-    <w:lvlOverride w:ilvl="5">
-      <w:startOverride w:val="1"/>
-    </w:lvlOverride>
-    <w:lvlOverride w:ilvl="6">
-      <w:startOverride w:val="1"/>
-    </w:lvlOverride>
-    <w:lvlOverride w:ilvl="7">
-      <w:startOverride w:val="1"/>
-    </w:lvlOverride>
-    <w:lvlOverride w:ilvl="8">
-      <w:startOverride w:val="1"/>
-    </w:lvlOverride>
-  </w:num>
-  <w:num w:numId="1023">
     <w:abstractNumId w:val="991"/>
   </w:num>
 </w:numbering>

</xml_diff>

<commit_message>
studies/ai-governance: v0.6 — dual-platform (askSage + GenAI.mil); trim S2 scope
Per operator: (1) the command uses BOTH askSage and GenAI.mil (not standalone) with a recommended split (GenAI.mil for general questions; askSage for agentic work; prototype on GenAI.mil to save askSage tokens); instruction stays askSage-specific, GenAI.mil under enterprise governance. (2) Removed the entire S2 'out of scope' block (wordy/redundant - data in S4, authority principle in S3/S6; digital supervision dropped). Routing package + cover sheet rebuilt from v0.6; decisions items 17-18; memory updated.

Co-Authored-By: Claude Opus 4.8 (1M context) <noreply@anthropic.com>
</commit_message>
<xml_diff>
--- a/studies/ai-governance/03_instruction/routing/SRF-JRMC-INST-5239.1-DRAFT-working-group.docx
+++ b/studies/ai-governance/03_instruction/routing/SRF-JRMC-INST-5239.1-DRAFT-working-group.docx
@@ -215,35 +215,60 @@
           <w:b/>
           <w:bCs/>
         </w:rPr>
-        <w:t xml:space="preserve">Platform:</w:t>
-      </w:r>
-      <w:r>
-        <w:t xml:space="preserve"> </w:t>
-      </w:r>
-      <w:r>
-        <w:t xml:space="preserve">command-standalone</w:t>
-      </w:r>
-      <w:r>
-        <w:t xml:space="preserve"> </w:t>
-      </w:r>
-      <w:r>
-        <w:rPr>
-          <w:b/>
-          <w:bCs/>
-        </w:rPr>
-        <w:t xml:space="preserve">askSage</w:t>
-      </w:r>
-      <w:r>
-        <w:t xml:space="preserve"> </w:t>
-      </w:r>
-      <w:r>
-        <w:t xml:space="preserve">(not GenAI.mil); askSage is ATO’d at IL5</w:t>
-      </w:r>
-      <w:r>
-        <w:t xml:space="preserve"> </w:t>
-      </w:r>
-      <w:r>
-        <w:t xml:space="preserve">and connects to Flank Speed. Convergence to GenAI.mil stays a future option.</w:t>
+        <w:t xml:space="preserve">Platforms:</w:t>
+      </w:r>
+      <w:r>
+        <w:t xml:space="preserve"> </w:t>
+      </w:r>
+      <w:r>
+        <w:t xml:space="preserve">the command uses</w:t>
+      </w:r>
+      <w:r>
+        <w:t xml:space="preserve"> </w:t>
+      </w:r>
+      <w:r>
+        <w:rPr>
+          <w:b/>
+          <w:bCs/>
+        </w:rPr>
+        <w:t xml:space="preserve">both askSage and GenAI.mil</w:t>
+      </w:r>
+      <w:r>
+        <w:t xml:space="preserve">. Recommended split:</w:t>
+      </w:r>
+      <w:r>
+        <w:t xml:space="preserve"> </w:t>
+      </w:r>
+      <w:r>
+        <w:t xml:space="preserve">GenAI.mil for general questions,</w:t>
+      </w:r>
+      <w:r>
+        <w:t xml:space="preserve"> </w:t>
+      </w:r>
+      <w:r>
+        <w:rPr>
+          <w:b/>
+          <w:bCs/>
+        </w:rPr>
+        <w:t xml:space="preserve">askSage for agentic work</w:t>
+      </w:r>
+      <w:r>
+        <w:t xml:space="preserve"> </w:t>
+      </w:r>
+      <w:r>
+        <w:t xml:space="preserve">(prototype agents/prompts on</w:t>
+      </w:r>
+      <w:r>
+        <w:t xml:space="preserve"> </w:t>
+      </w:r>
+      <w:r>
+        <w:t xml:space="preserve">GenAI.mil first to save askSage tokens). askSage is ATO’d at IL5 and connects to Flank</w:t>
+      </w:r>
+      <w:r>
+        <w:t xml:space="preserve"> </w:t>
+      </w:r>
+      <w:r>
+        <w:t xml:space="preserve">Speed; this instruction governs askSage, GenAI.mil runs under its DoD enterprise governance.</w:t>
       </w:r>
     </w:p>
     <w:p>
@@ -497,34 +522,6 @@
       </w:r>
       <w:r>
         <w:t xml:space="preserve">Records and directives are managed per the command SORM.</w:t>
-      </w:r>
-    </w:p>
-    <w:p>
-      <w:pPr>
-        <w:pStyle w:val="Compact"/>
-        <w:numPr>
-          <w:ilvl w:val="0"/>
-          <w:numId w:val="1001"/>
-        </w:numPr>
-      </w:pPr>
-      <w:r>
-        <w:rPr>
-          <w:b/>
-          <w:bCs/>
-        </w:rPr>
-        <w:t xml:space="preserve">Out of scope:</w:t>
-      </w:r>
-      <w:r>
-        <w:t xml:space="preserve"> </w:t>
-      </w:r>
-      <w:r>
-        <w:t xml:space="preserve">digital supervision of any person; final technical/quality/contractual</w:t>
-      </w:r>
-      <w:r>
-        <w:t xml:space="preserve"> </w:t>
-      </w:r>
-      <w:r>
-        <w:t xml:space="preserve">authority.</w:t>
       </w:r>
     </w:p>
     <w:p>
@@ -1366,187 +1363,137 @@
           <w:b/>
           <w:bCs/>
         </w:rPr>
-        <w:t xml:space="preserve">Explicitly out of scope (the command will not use askSage for these):</w:t>
-      </w:r>
-      <w:r>
-        <w:t xml:space="preserve"> </w:t>
-      </w:r>
-      <w:r>
-        <w:t xml:space="preserve">-</w:t>
-      </w:r>
-      <w:r>
-        <w:t xml:space="preserve"> </w:t>
-      </w:r>
-      <w:r>
-        <w:rPr>
-          <w:b/>
-          <w:bCs/>
-        </w:rPr>
-        <w:t xml:space="preserve">Digital supervision.</w:t>
-      </w:r>
-      <w:r>
-        <w:t xml:space="preserve"> </w:t>
-      </w:r>
-      <w:r>
-        <w:t xml:space="preserve">askSage will not act as a supervisory or evaluative authority</w:t>
-      </w:r>
-      <w:r>
-        <w:t xml:space="preserve"> </w:t>
-      </w:r>
-      <w:r>
-        <w:t xml:space="preserve">over any person. This also keeps the command clear of Master Labor Agreement and</w:t>
-      </w:r>
-      <w:r>
-        <w:t xml:space="preserve"> </w:t>
-      </w:r>
-      <w:r>
-        <w:t xml:space="preserve">Status of Forces Agreement labor concerns.</w:t>
-      </w:r>
-      <w:r>
-        <w:t xml:space="preserve"> </w:t>
-      </w:r>
-      <w:r>
-        <w:t xml:space="preserve">-</w:t>
-      </w:r>
-      <w:r>
-        <w:t xml:space="preserve"> </w:t>
-      </w:r>
-      <w:r>
-        <w:rPr>
-          <w:b/>
-          <w:bCs/>
-        </w:rPr>
-        <w:t xml:space="preserve">Prohibited data</w:t>
-      </w:r>
-      <w:r>
-        <w:t xml:space="preserve"> </w:t>
-      </w:r>
-      <w:r>
-        <w:t xml:space="preserve">(Section 4): classified information, Naval Nuclear Propulsion</w:t>
-      </w:r>
-      <w:r>
-        <w:t xml:space="preserve"> </w:t>
-      </w:r>
-      <w:r>
-        <w:t xml:space="preserve">Information, Personally Identifiable Information, Protected Health Information.</w:t>
-      </w:r>
-      <w:r>
-        <w:t xml:space="preserve"> </w:t>
-      </w:r>
-      <w:r>
-        <w:t xml:space="preserve">-</w:t>
-      </w:r>
-      <w:r>
-        <w:t xml:space="preserve"> </w:t>
-      </w:r>
-      <w:r>
-        <w:rPr>
-          <w:b/>
-          <w:bCs/>
-        </w:rPr>
-        <w:t xml:space="preserve">Final technical, quality, contractual, or disbursement authority.</w:t>
-      </w:r>
-      <w:r>
-        <w:t xml:space="preserve"> </w:t>
-      </w:r>
-      <w:r>
-        <w:t xml:space="preserve">AI output is</w:t>
-      </w:r>
-      <w:r>
-        <w:t xml:space="preserve"> </w:t>
-      </w:r>
-      <w:r>
-        <w:t xml:space="preserve">always a draft for a qualified human to adjudicate (Sections 6 and 7).</w:t>
-      </w:r>
-    </w:p>
-    <w:p>
-      <w:pPr>
-        <w:pStyle w:val="BodyText"/>
-      </w:pPr>
-      <w:r>
-        <w:rPr>
-          <w:b/>
-          <w:bCs/>
-        </w:rPr>
-        <w:t xml:space="preserve">Instance basis: the command uses askSage, not the DoD enterprise platform</w:t>
-      </w:r>
-      <w:r>
-        <w:rPr>
-          <w:b/>
-          <w:bCs/>
-        </w:rPr>
-        <w:t xml:space="preserve"> </w:t>
-      </w:r>
-      <w:r>
-        <w:rPr>
-          <w:b/>
-          <w:bCs/>
-        </w:rPr>
-        <w:t xml:space="preserve">(GenAI.mil).</w:t>
-      </w:r>
-      <w:r>
-        <w:t xml:space="preserve"> </w:t>
-      </w:r>
-      <w:r>
-        <w:t xml:space="preserve">askSage already provides Authority-to-Operate (ATO) functionality at</w:t>
-      </w:r>
-      <w:r>
-        <w:t xml:space="preserve"> </w:t>
-      </w:r>
-      <w:r>
-        <w:t xml:space="preserve">Impact Level 5 (IL5) and connects to the Navy’s Flank Speed shares, so it delivers an</w:t>
-      </w:r>
-      <w:r>
-        <w:t xml:space="preserve"> </w:t>
-      </w:r>
-      <w:r>
-        <w:t xml:space="preserve">accredited, integrated capability today; GenAI.mil is not yet mature enough to merit</w:t>
-      </w:r>
-      <w:r>
-        <w:t xml:space="preserve"> </w:t>
-      </w:r>
-      <w:r>
-        <w:t xml:space="preserve">convergence. Convergence to GenAI.mil remains a future option, and any process built in</w:t>
-      </w:r>
-      <w:r>
-        <w:t xml:space="preserve"> </w:t>
-      </w:r>
-      <w:r>
-        <w:t xml:space="preserve">askSage is intended to be transferable to GenAI.mil when that is warranted. The command</w:t>
-      </w:r>
-      <w:r>
-        <w:t xml:space="preserve"> </w:t>
-      </w:r>
-      <w:r>
-        <w:t xml:space="preserve">operates</w:t>
-      </w:r>
-      <w:r>
-        <w:t xml:space="preserve"> </w:t>
-      </w:r>
-      <w:r>
-        <w:rPr>
-          <w:b/>
-          <w:bCs/>
-        </w:rPr>
-        <w:t xml:space="preserve">under askSage’s IL5 ATO</w:t>
-      </w:r>
-      <w:r>
-        <w:t xml:space="preserve"> </w:t>
-      </w:r>
-      <w:r>
-        <w:t xml:space="preserve">and owns the governance layer — use-case approval,</w:t>
-      </w:r>
-      <w:r>
-        <w:t xml:space="preserve"> </w:t>
-      </w:r>
-      <w:r>
-        <w:t xml:space="preserve">data controls, monitoring configuration, and the controls in this instruction — within</w:t>
-      </w:r>
-      <w:r>
-        <w:t xml:space="preserve"> </w:t>
-      </w:r>
-      <w:r>
-        <w:t xml:space="preserve">the platform’s accredited capabilities.</w:t>
+        <w:t xml:space="preserve">Two platforms, with a recommended division of labor.</w:t>
+      </w:r>
+      <w:r>
+        <w:t xml:space="preserve"> </w:t>
+      </w:r>
+      <w:r>
+        <w:t xml:space="preserve">The command uses both askSage and</w:t>
+      </w:r>
+      <w:r>
+        <w:t xml:space="preserve"> </w:t>
+      </w:r>
+      <w:r>
+        <w:t xml:space="preserve">the DoD enterprise platform</w:t>
+      </w:r>
+      <w:r>
+        <w:t xml:space="preserve"> </w:t>
+      </w:r>
+      <w:r>
+        <w:rPr>
+          <w:b/>
+          <w:bCs/>
+        </w:rPr>
+        <w:t xml:space="preserve">GenAI.mil</w:t>
+      </w:r>
+      <w:r>
+        <w:t xml:space="preserve">. Recommended use:</w:t>
+      </w:r>
+      <w:r>
+        <w:t xml:space="preserve"> </w:t>
+      </w:r>
+      <w:r>
+        <w:rPr>
+          <w:b/>
+          <w:bCs/>
+        </w:rPr>
+        <w:t xml:space="preserve">GenAI.mil for general</w:t>
+      </w:r>
+      <w:r>
+        <w:rPr>
+          <w:b/>
+          <w:bCs/>
+        </w:rPr>
+        <w:t xml:space="preserve"> </w:t>
+      </w:r>
+      <w:r>
+        <w:rPr>
+          <w:b/>
+          <w:bCs/>
+        </w:rPr>
+        <w:t xml:space="preserve">questions; askSage for agentic work</w:t>
+      </w:r>
+      <w:r>
+        <w:t xml:space="preserve"> </w:t>
+      </w:r>
+      <w:r>
+        <w:t xml:space="preserve">(its agentic capability is why this instruction</w:t>
+      </w:r>
+      <w:r>
+        <w:t xml:space="preserve"> </w:t>
+      </w:r>
+      <w:r>
+        <w:t xml:space="preserve">exists). GenAI.mil may also be used to develop and refine agents and agentic-workflow</w:t>
+      </w:r>
+      <w:r>
+        <w:t xml:space="preserve"> </w:t>
+      </w:r>
+      <w:r>
+        <w:t xml:space="preserve">prompts before expending askSage tokens. GenAI.mil is not yet mature enough to host the</w:t>
+      </w:r>
+      <w:r>
+        <w:t xml:space="preserve"> </w:t>
+      </w:r>
+      <w:r>
+        <w:t xml:space="preserve">command’s agentic work, so askSage carries that load for now; the command intends to</w:t>
+      </w:r>
+      <w:r>
+        <w:t xml:space="preserve"> </w:t>
+      </w:r>
+      <w:r>
+        <w:t xml:space="preserve">transfer agentic work to GenAI.mil when it can support it.</w:t>
+      </w:r>
+      <w:r>
+        <w:t xml:space="preserve"> </w:t>
+      </w:r>
+      <w:r>
+        <w:rPr>
+          <w:b/>
+          <w:bCs/>
+        </w:rPr>
+        <w:t xml:space="preserve">This instruction governs the</w:t>
+      </w:r>
+      <w:r>
+        <w:rPr>
+          <w:b/>
+          <w:bCs/>
+        </w:rPr>
+        <w:t xml:space="preserve"> </w:t>
+      </w:r>
+      <w:r>
+        <w:rPr>
+          <w:b/>
+          <w:bCs/>
+        </w:rPr>
+        <w:t xml:space="preserve">command’s use of askSage</w:t>
+      </w:r>
+      <w:r>
+        <w:t xml:space="preserve">; GenAI.mil is used under its DoD enterprise governance. askSage</w:t>
+      </w:r>
+      <w:r>
+        <w:t xml:space="preserve"> </w:t>
+      </w:r>
+      <w:r>
+        <w:t xml:space="preserve">operates under its Authority-to-Operate (ATO) at Impact Level 5 (IL5), connected to the</w:t>
+      </w:r>
+      <w:r>
+        <w:t xml:space="preserve"> </w:t>
+      </w:r>
+      <w:r>
+        <w:t xml:space="preserve">Navy’s Flank Speed shares, and the command owns the askSage governance layer — use-case</w:t>
+      </w:r>
+      <w:r>
+        <w:t xml:space="preserve"> </w:t>
+      </w:r>
+      <w:r>
+        <w:t xml:space="preserve">approval, data controls, monitoring configuration, and the controls in this instruction —</w:t>
+      </w:r>
+      <w:r>
+        <w:t xml:space="preserve"> </w:t>
+      </w:r>
+      <w:r>
+        <w:t xml:space="preserve">within the platform’s accredited capabilities.</w:t>
       </w:r>
     </w:p>
     <w:p>
@@ -4874,7 +4821,19 @@
         <w:t xml:space="preserve"> </w:t>
       </w:r>
       <w:r>
-        <w:t xml:space="preserve">shared, vetted prompt library reduce waste.</w:t>
+        <w:t xml:space="preserve">shared, vetted prompt library reduce waste. Develop and test agents and agentic-workflow</w:t>
+      </w:r>
+      <w:r>
+        <w:t xml:space="preserve"> </w:t>
+      </w:r>
+      <w:r>
+        <w:t xml:space="preserve">prompts on GenAI.mil first, then run the finished workflow on askSage, to conserve askSage</w:t>
+      </w:r>
+      <w:r>
+        <w:t xml:space="preserve"> </w:t>
+      </w:r>
+      <w:r>
+        <w:t xml:space="preserve">tokens (Section 2).</w:t>
       </w:r>
     </w:p>
     <w:bookmarkEnd w:id="28"/>

</xml_diff>

<commit_message>
studies/ai-governance: v0.7 — fold concrete askSage authority/acquisition basis into S2
From the USASpending check: GenAI.mil is the enterprise default not an exclusive bar; askSage holds its own IL5 authorization, acquired DoD-wide as decentralized task orders against the Army Ask Sage IDIQ (W9128Z25DA001) - the vehicle NSWC Corona and NRL already use. S2 [CONFIRM] now asks for the command's own task-order PIID + IL5 ATO + Flank Speed authority. Routing package + cover sheet rebuilt; decisions item 19; memory updated.

Co-Authored-By: Claude Opus 4.8 (1M context) <noreply@anthropic.com>
</commit_message>
<xml_diff>
--- a/studies/ai-governance/03_instruction/routing/SRF-JRMC-INST-5239.1-DRAFT-working-group.docx
+++ b/studies/ai-governance/03_instruction/routing/SRF-JRMC-INST-5239.1-DRAFT-working-group.docx
@@ -270,6 +270,58 @@
       <w:r>
         <w:t xml:space="preserve">Speed; this instruction governs askSage, GenAI.mil runs under its DoD enterprise governance.</w:t>
       </w:r>
+      <w:r>
+        <w:t xml:space="preserve"> </w:t>
+      </w:r>
+      <w:r>
+        <w:t xml:space="preserve">GenAI.mil is the enterprise</w:t>
+      </w:r>
+      <w:r>
+        <w:t xml:space="preserve"> </w:t>
+      </w:r>
+      <w:r>
+        <w:rPr>
+          <w:i/>
+          <w:iCs/>
+        </w:rPr>
+        <w:t xml:space="preserve">default</w:t>
+      </w:r>
+      <w:r>
+        <w:t xml:space="preserve">, not an exclusive bar — askSage is separately</w:t>
+      </w:r>
+      <w:r>
+        <w:t xml:space="preserve"> </w:t>
+      </w:r>
+      <w:r>
+        <w:t xml:space="preserve">authorized and acquired via decentralized task orders against the</w:t>
+      </w:r>
+      <w:r>
+        <w:t xml:space="preserve"> </w:t>
+      </w:r>
+      <w:r>
+        <w:rPr>
+          <w:b/>
+          <w:bCs/>
+        </w:rPr>
+        <w:t xml:space="preserve">Army Ask Sage IDIQ</w:t>
+      </w:r>
+      <w:r>
+        <w:rPr>
+          <w:b/>
+          <w:bCs/>
+        </w:rPr>
+        <w:t xml:space="preserve"> </w:t>
+      </w:r>
+      <w:r>
+        <w:rPr>
+          <w:b/>
+          <w:bCs/>
+        </w:rPr>
+        <w:t xml:space="preserve">(W9128Z25DA001)</w:t>
+      </w:r>
+      <w:r>
+        <w:t xml:space="preserve">, the same vehicle other Navy activities (NSWC Corona, NRL) already use.</w:t>
+      </w:r>
     </w:p>
     <w:p>
       <w:pPr>
@@ -625,7 +677,19 @@
         </w:numPr>
       </w:pPr>
       <w:r>
-        <w:t xml:space="preserve">Record the specific askSage ATO reference and the Flank Speed connection authority (§2).</w:t>
+        <w:t xml:space="preserve">Record the command’s askSage acquisition instrument — its task-order PIID off the Army Ask</w:t>
+      </w:r>
+      <w:r>
+        <w:t xml:space="preserve"> </w:t>
+      </w:r>
+      <w:r>
+        <w:t xml:space="preserve">Sage Decentralized IDIQ (W9128Z25DA001) — plus the IL5 ATO reference and the Flank Speed</w:t>
+      </w:r>
+      <w:r>
+        <w:t xml:space="preserve"> </w:t>
+      </w:r>
+      <w:r>
+        <w:t xml:space="preserve">connection authority (§2).</w:t>
       </w:r>
     </w:p>
     <w:p>
@@ -1498,6 +1562,67 @@
     </w:p>
     <w:p>
       <w:pPr>
+        <w:pStyle w:val="BodyText"/>
+      </w:pPr>
+      <w:r>
+        <w:rPr>
+          <w:b/>
+          <w:bCs/>
+        </w:rPr>
+        <w:t xml:space="preserve">Authority and acquisition basis.</w:t>
+      </w:r>
+      <w:r>
+        <w:t xml:space="preserve"> </w:t>
+      </w:r>
+      <w:r>
+        <w:t xml:space="preserve">Running askSage alongside GenAI.mil is consistent with</w:t>
+      </w:r>
+      <w:r>
+        <w:t xml:space="preserve"> </w:t>
+      </w:r>
+      <w:r>
+        <w:t xml:space="preserve">Department direction: GenAI.mil is the enterprise</w:t>
+      </w:r>
+      <w:r>
+        <w:t xml:space="preserve"> </w:t>
+      </w:r>
+      <w:r>
+        <w:rPr>
+          <w:i/>
+          <w:iCs/>
+        </w:rPr>
+        <w:t xml:space="preserve">default</w:t>
+      </w:r>
+      <w:r>
+        <w:t xml:space="preserve">, not an exclusive bar, and service</w:t>
+      </w:r>
+      <w:r>
+        <w:t xml:space="preserve"> </w:t>
+      </w:r>
+      <w:r>
+        <w:t xml:space="preserve">guidance permits separately-authorized tools. askSage holds its own IL5 authorization and is</w:t>
+      </w:r>
+      <w:r>
+        <w:t xml:space="preserve"> </w:t>
+      </w:r>
+      <w:r>
+        <w:t xml:space="preserve">acquired across the Department as decentralized task orders against the Army’s Ask Sage</w:t>
+      </w:r>
+      <w:r>
+        <w:t xml:space="preserve"> </w:t>
+      </w:r>
+      <w:r>
+        <w:t xml:space="preserve">Indefinite-Delivery/Indefinite-Quantity (IDIQ) vehicle, PIID W9128Z25DA001 — the same vehicle</w:t>
+      </w:r>
+      <w:r>
+        <w:t xml:space="preserve"> </w:t>
+      </w:r>
+      <w:r>
+        <w:t xml:space="preserve">other Navy activities already use to buy askSage.</w:t>
+      </w:r>
+    </w:p>
+    <w:p>
+      <w:pPr>
         <w:pStyle w:val="BlockText"/>
       </w:pPr>
       <w:r>
@@ -1511,7 +1636,7 @@
         <w:t xml:space="preserve"> </w:t>
       </w:r>
       <w:r>
-        <w:t xml:space="preserve">record the specific askSage ATO reference and the Flank Speed connection authority.</w:t>
+        <w:t xml:space="preserve">record the command’s own askSage acquisition instrument (its task-order PIID off the Army Ask Sage Decentralized IDIQ, W9128Z25DA001), the underlying IL5 ATO reference, and the Flank Speed connection authority.</w:t>
       </w:r>
     </w:p>
     <w:bookmarkEnd w:id="15"/>

</xml_diff>

<commit_message>
studies/ai-governance: v0.8 — keep volatile contract PIIDs out of the instruction
Operator: a command instruction shouldn't embed a contract number (ends/renews/changes -> would force instruction updates). S2 now states the durable mechanism only (askSage separately IL5-authorized; acquired via a Department contract vehicle, e.g. the Army-managed Ask Sage IDIQ); specific ATO/PIID held in command cybersecurity/contracting records. S2 [CONFIRM] asks to confirm-current, not embed-a-PIID. PIIDs remain only in the dated research source pack / decision log. Routing package + cover sheet rebuilt; decisions item 20; memory records the general principle.

Co-Authored-By: Claude Opus 4.8 (1M context) <noreply@anthropic.com>
</commit_message>
<xml_diff>
--- a/studies/ai-governance/03_instruction/routing/SRF-JRMC-INST-5239.1-DRAFT-working-group.docx
+++ b/studies/ai-governance/03_instruction/routing/SRF-JRMC-INST-5239.1-DRAFT-working-group.docx
@@ -293,34 +293,25 @@
         <w:t xml:space="preserve"> </w:t>
       </w:r>
       <w:r>
-        <w:t xml:space="preserve">authorized and acquired via decentralized task orders against the</w:t>
-      </w:r>
-      <w:r>
-        <w:t xml:space="preserve"> </w:t>
-      </w:r>
-      <w:r>
-        <w:rPr>
-          <w:b/>
-          <w:bCs/>
-        </w:rPr>
-        <w:t xml:space="preserve">Army Ask Sage IDIQ</w:t>
-      </w:r>
-      <w:r>
-        <w:rPr>
-          <w:b/>
-          <w:bCs/>
-        </w:rPr>
-        <w:t xml:space="preserve"> </w:t>
-      </w:r>
-      <w:r>
-        <w:rPr>
-          <w:b/>
-          <w:bCs/>
-        </w:rPr>
-        <w:t xml:space="preserve">(W9128Z25DA001)</w:t>
-      </w:r>
-      <w:r>
-        <w:t xml:space="preserve">, the same vehicle other Navy activities (NSWC Corona, NRL) already use.</w:t>
+        <w:t xml:space="preserve">authorized at IL5 and acquired through a Department contract vehicle for askSage (e.g., the</w:t>
+      </w:r>
+      <w:r>
+        <w:t xml:space="preserve"> </w:t>
+      </w:r>
+      <w:r>
+        <w:t xml:space="preserve">Army-managed Ask Sage IDIQ that NSWC Corona and NRL already use). The specific ATO and</w:t>
+      </w:r>
+      <w:r>
+        <w:t xml:space="preserve"> </w:t>
+      </w:r>
+      <w:r>
+        <w:t xml:space="preserve">contract are held in command records, not in the instruction (which stays stable as contracts</w:t>
+      </w:r>
+      <w:r>
+        <w:t xml:space="preserve"> </w:t>
+      </w:r>
+      <w:r>
+        <w:t xml:space="preserve">renew).</w:t>
       </w:r>
     </w:p>
     <w:p>
@@ -677,19 +668,19 @@
         </w:numPr>
       </w:pPr>
       <w:r>
-        <w:t xml:space="preserve">Record the command’s askSage acquisition instrument — its task-order PIID off the Army Ask</w:t>
-      </w:r>
-      <w:r>
-        <w:t xml:space="preserve"> </w:t>
-      </w:r>
-      <w:r>
-        <w:t xml:space="preserve">Sage Decentralized IDIQ (W9128Z25DA001) — plus the IL5 ATO reference and the Flank Speed</w:t>
-      </w:r>
-      <w:r>
-        <w:t xml:space="preserve"> </w:t>
-      </w:r>
-      <w:r>
-        <w:t xml:space="preserve">connection authority (§2).</w:t>
+        <w:t xml:space="preserve">Confirm askSage’s IL5 authorization (ATO) and the command’s acquisition instrument are</w:t>
+      </w:r>
+      <w:r>
+        <w:t xml:space="preserve"> </w:t>
+      </w:r>
+      <w:r>
+        <w:t xml:space="preserve">current and valid — held in the command’s cybersecurity and contracting records, not in the</w:t>
+      </w:r>
+      <w:r>
+        <w:t xml:space="preserve"> </w:t>
+      </w:r>
+      <w:r>
+        <w:t xml:space="preserve">instruction — and confirm the Flank Speed connection authority (§2).</w:t>
       </w:r>
     </w:p>
     <w:p>
@@ -1600,25 +1591,43 @@
         <w:t xml:space="preserve"> </w:t>
       </w:r>
       <w:r>
-        <w:t xml:space="preserve">guidance permits separately-authorized tools. askSage holds its own IL5 authorization and is</w:t>
-      </w:r>
-      <w:r>
-        <w:t xml:space="preserve"> </w:t>
-      </w:r>
-      <w:r>
-        <w:t xml:space="preserve">acquired across the Department as decentralized task orders against the Army’s Ask Sage</w:t>
-      </w:r>
-      <w:r>
-        <w:t xml:space="preserve"> </w:t>
-      </w:r>
-      <w:r>
-        <w:t xml:space="preserve">Indefinite-Delivery/Indefinite-Quantity (IDIQ) vehicle, PIID W9128Z25DA001 — the same vehicle</w:t>
-      </w:r>
-      <w:r>
-        <w:t xml:space="preserve"> </w:t>
-      </w:r>
-      <w:r>
-        <w:t xml:space="preserve">other Navy activities already use to buy askSage.</w:t>
+        <w:t xml:space="preserve">guidance permits separately-authorized tools. askSage is separately authorized at IL5 and is</w:t>
+      </w:r>
+      <w:r>
+        <w:t xml:space="preserve"> </w:t>
+      </w:r>
+      <w:r>
+        <w:t xml:space="preserve">acquired through a Department contract vehicle for askSage — for example, decentralized task</w:t>
+      </w:r>
+      <w:r>
+        <w:t xml:space="preserve"> </w:t>
+      </w:r>
+      <w:r>
+        <w:t xml:space="preserve">orders against the Army-managed Ask Sage Indefinite-Delivery/Indefinite-Quantity (IDIQ) vehicle</w:t>
+      </w:r>
+      <w:r>
+        <w:t xml:space="preserve"> </w:t>
+      </w:r>
+      <w:r>
+        <w:t xml:space="preserve">that other Navy activities already use. The specific current authorization (the IL5 ATO) and</w:t>
+      </w:r>
+      <w:r>
+        <w:t xml:space="preserve"> </w:t>
+      </w:r>
+      <w:r>
+        <w:t xml:space="preserve">acquisition instrument are kept in the command’s cybersecurity and contracting records, not</w:t>
+      </w:r>
+      <w:r>
+        <w:t xml:space="preserve"> </w:t>
+      </w:r>
+      <w:r>
+        <w:t xml:space="preserve">restated in this instruction, so a contract renewal or replacement does not require changing</w:t>
+      </w:r>
+      <w:r>
+        <w:t xml:space="preserve"> </w:t>
+      </w:r>
+      <w:r>
+        <w:t xml:space="preserve">this instruction.</w:t>
       </w:r>
     </w:p>
     <w:p>
@@ -1636,7 +1645,7 @@
         <w:t xml:space="preserve"> </w:t>
       </w:r>
       <w:r>
-        <w:t xml:space="preserve">record the command’s own askSage acquisition instrument (its task-order PIID off the Army Ask Sage Decentralized IDIQ, W9128Z25DA001), the underlying IL5 ATO reference, and the Flank Speed connection authority.</w:t>
+        <w:t xml:space="preserve">the cognizant cybersecurity and contracting authorities confirm askSage’s IL5 authorization and the command’s acquisition instrument are current and valid (held in command records, not in this instruction).</w:t>
       </w:r>
     </w:p>
     <w:bookmarkEnd w:id="15"/>

</xml_diff>

<commit_message>
studies/ai-governance: v0.9 — S15 departmental information-governance plans (pre-access gate)
Per operator: each code gets high-level information-governance expectations (best practices from industry + DoW: NIST AI RMF + DoD AI Ethical Principles) and must generate its own departmental AI-use/information-governance plan before its personnel receive askSage access - a department-level gate alongside individual training (S13). S8.e updated; [MAP TO COMMAND] for a one-page departmental-plan template. Routing package + cover sheet rebuilt; decisions item 21; memory updated.

Co-Authored-By: Claude Opus 4.8 (1M context) <noreply@anthropic.com>
</commit_message>
<xml_diff>
--- a/studies/ai-governance/03_instruction/routing/SRF-JRMC-INST-5239.1-DRAFT-working-group.docx
+++ b/studies/ai-governance/03_instruction/routing/SRF-JRMC-INST-5239.1-DRAFT-working-group.docx
@@ -580,6 +580,40 @@
           <w:b/>
           <w:bCs/>
         </w:rPr>
+        <w:t xml:space="preserve">Each department stands up its own information-governance plan before askSage access</w:t>
+      </w:r>
+      <w:r>
+        <w:t xml:space="preserve"> </w:t>
+      </w:r>
+      <w:r>
+        <w:t xml:space="preserve">(§15)</w:t>
+      </w:r>
+      <w:r>
+        <w:t xml:space="preserve"> </w:t>
+      </w:r>
+      <w:r>
+        <w:t xml:space="preserve">— common high-level expectations (grounded in the NIST AI RMF + the DoD AI Ethical Principles),</w:t>
+      </w:r>
+      <w:r>
+        <w:t xml:space="preserve"> </w:t>
+      </w:r>
+      <w:r>
+        <w:t xml:space="preserve">tailored by each code; a department-level access gate alongside individual training.</w:t>
+      </w:r>
+    </w:p>
+    <w:p>
+      <w:pPr>
+        <w:pStyle w:val="Compact"/>
+        <w:numPr>
+          <w:ilvl w:val="0"/>
+          <w:numId w:val="1001"/>
+        </w:numPr>
+      </w:pPr>
+      <w:r>
+        <w:rPr>
+          <w:b/>
+          <w:bCs/>
+        </w:rPr>
         <w:t xml:space="preserve">Other settled calls:</w:t>
       </w:r>
       <w:r>
@@ -807,6 +841,24 @@
       </w:pPr>
       <w:r>
         <w:t xml:space="preserve">Verify the data-residency and encryption posture with the cognizant authority (§14.d).</w:t>
+      </w:r>
+    </w:p>
+    <w:p>
+      <w:pPr>
+        <w:pStyle w:val="Compact"/>
+        <w:numPr>
+          <w:ilvl w:val="0"/>
+          <w:numId w:val="1002"/>
+        </w:numPr>
+      </w:pPr>
+      <w:r>
+        <w:t xml:space="preserve">Provide a one-page departmental information-governance plan template so the codes’ plans</w:t>
+      </w:r>
+      <w:r>
+        <w:t xml:space="preserve"> </w:t>
+      </w:r>
+      <w:r>
+        <w:t xml:space="preserve">are consistent (§15.c).</w:t>
       </w:r>
     </w:p>
     <w:p>
@@ -1059,7 +1111,7 @@
     </w:p>
     <w:bookmarkEnd w:id="12"/>
     <w:bookmarkEnd w:id="13"/>
-    <w:bookmarkStart w:id="29" w:name="department-of-the-navy"/>
+    <w:bookmarkStart w:id="30" w:name="department-of-the-navy"/>
     <w:p>
       <w:pPr>
         <w:pStyle w:val="Heading1"/>
@@ -3816,13 +3868,40 @@
         <w:t xml:space="preserve"> </w:t>
       </w:r>
       <w:r>
-        <w:t xml:space="preserve">enforce the human-in-the-loop and least-privilege requirements; and submit their use cases</w:t>
-      </w:r>
-      <w:r>
-        <w:t xml:space="preserve"> </w:t>
-      </w:r>
-      <w:r>
-        <w:t xml:space="preserve">to the inventory.</w:t>
+        <w:t xml:space="preserve">enforce the human-in-the-loop and least-privilege requirements; submit their use cases</w:t>
+      </w:r>
+      <w:r>
+        <w:t xml:space="preserve"> </w:t>
+      </w:r>
+      <w:r>
+        <w:t xml:space="preserve">to the inventory; and</w:t>
+      </w:r>
+      <w:r>
+        <w:t xml:space="preserve"> </w:t>
+      </w:r>
+      <w:r>
+        <w:rPr>
+          <w:b/>
+          <w:bCs/>
+        </w:rPr>
+        <w:t xml:space="preserve">develop and maintain the department’s information-governance plan</w:t>
+      </w:r>
+      <w:r>
+        <w:rPr>
+          <w:b/>
+          <w:bCs/>
+        </w:rPr>
+        <w:t xml:space="preserve"> </w:t>
+      </w:r>
+      <w:r>
+        <w:rPr>
+          <w:b/>
+          <w:bCs/>
+        </w:rPr>
+        <w:t xml:space="preserve">before access (Section 15)</w:t>
+      </w:r>
+      <w:r>
+        <w:t xml:space="preserve">.</w:t>
       </w:r>
     </w:p>
     <w:p>
@@ -4799,12 +4878,361 @@
       </w:r>
     </w:p>
     <w:bookmarkEnd w:id="27"/>
-    <w:bookmarkStart w:id="28" w:name="Xd40d045629625ce263b52cca08926d0495efa12"/>
+    <w:bookmarkStart w:id="28" w:name="X77895dd4303a196b1e7b47b31465cf66a1a934c"/>
     <w:p>
       <w:pPr>
         <w:pStyle w:val="Heading2"/>
       </w:pPr>
       <w:r>
+        <w:t xml:space="preserve">15. Departmental information-governance plans</w:t>
+      </w:r>
+    </w:p>
+    <w:p>
+      <w:pPr>
+        <w:pStyle w:val="FirstParagraph"/>
+      </w:pPr>
+      <w:r>
+        <w:t xml:space="preserve">Each department stands up its own short information-governance plan for askSage, reflecting</w:t>
+      </w:r>
+      <w:r>
+        <w:t xml:space="preserve"> </w:t>
+      </w:r>
+      <w:r>
+        <w:t xml:space="preserve">common command expectations, before its people receive access. This instruction sets the</w:t>
+      </w:r>
+      <w:r>
+        <w:t xml:space="preserve"> </w:t>
+      </w:r>
+      <w:r>
+        <w:t xml:space="preserve">common floor; each code tailors it to its own work.</w:t>
+      </w:r>
+    </w:p>
+    <w:p>
+      <w:pPr>
+        <w:numPr>
+          <w:ilvl w:val="0"/>
+          <w:numId w:val="1022"/>
+        </w:numPr>
+      </w:pPr>
+      <w:r>
+        <w:rPr>
+          <w:b/>
+          <w:bCs/>
+        </w:rPr>
+        <w:t xml:space="preserve">Access prerequisite.</w:t>
+      </w:r>
+      <w:r>
+        <w:t xml:space="preserve"> </w:t>
+      </w:r>
+      <w:r>
+        <w:t xml:space="preserve">Before a department’s personnel are granted askSage access, the</w:t>
+      </w:r>
+      <w:r>
+        <w:t xml:space="preserve"> </w:t>
+      </w:r>
+      <w:r>
+        <w:t xml:space="preserve">department develops a departmental information-governance plan for askSage, approved by the</w:t>
+      </w:r>
+      <w:r>
+        <w:t xml:space="preserve"> </w:t>
+      </w:r>
+      <w:r>
+        <w:t xml:space="preserve">Department Head. This complements individual training (Section 13): training qualifies the</w:t>
+      </w:r>
+      <w:r>
+        <w:t xml:space="preserve"> </w:t>
+      </w:r>
+      <w:r>
+        <w:rPr>
+          <w:i/>
+          <w:iCs/>
+        </w:rPr>
+        <w:t xml:space="preserve">user</w:t>
+      </w:r>
+      <w:r>
+        <w:t xml:space="preserve">; the plan qualifies the</w:t>
+      </w:r>
+      <w:r>
+        <w:t xml:space="preserve"> </w:t>
+      </w:r>
+      <w:r>
+        <w:rPr>
+          <w:i/>
+          <w:iCs/>
+        </w:rPr>
+        <w:t xml:space="preserve">department</w:t>
+      </w:r>
+      <w:r>
+        <w:t xml:space="preserve">.</w:t>
+      </w:r>
+    </w:p>
+    <w:p>
+      <w:pPr>
+        <w:numPr>
+          <w:ilvl w:val="0"/>
+          <w:numId w:val="1022"/>
+        </w:numPr>
+      </w:pPr>
+      <w:r>
+        <w:rPr>
+          <w:b/>
+          <w:bCs/>
+        </w:rPr>
+        <w:t xml:space="preserve">High-level expectations the plan reflects.</w:t>
+      </w:r>
+      <w:r>
+        <w:t xml:space="preserve"> </w:t>
+      </w:r>
+      <w:r>
+        <w:t xml:space="preserve">The plan is the department’s local</w:t>
+      </w:r>
+      <w:r>
+        <w:t xml:space="preserve"> </w:t>
+      </w:r>
+      <w:r>
+        <w:t xml:space="preserve">implementation of this instruction, grounded in industry best practice (the NIST AI Risk</w:t>
+      </w:r>
+      <w:r>
+        <w:t xml:space="preserve"> </w:t>
+      </w:r>
+      <w:r>
+        <w:t xml:space="preserve">Management Framework — Govern, Map, Measure, Manage) and Department practice (the DoD AI</w:t>
+      </w:r>
+      <w:r>
+        <w:t xml:space="preserve"> </w:t>
+      </w:r>
+      <w:r>
+        <w:t xml:space="preserve">Ethical Principles). At a minimum it addresses:</w:t>
+      </w:r>
+    </w:p>
+    <w:p>
+      <w:pPr>
+        <w:pStyle w:val="Compact"/>
+        <w:numPr>
+          <w:ilvl w:val="0"/>
+          <w:numId w:val="1023"/>
+        </w:numPr>
+      </w:pPr>
+      <w:r>
+        <w:rPr>
+          <w:b/>
+          <w:bCs/>
+        </w:rPr>
+        <w:t xml:space="preserve">Accountability and evaluation</w:t>
+      </w:r>
+      <w:r>
+        <w:t xml:space="preserve"> </w:t>
+      </w:r>
+      <w:r>
+        <w:t xml:space="preserve">— the department’s accountable owner and its designated</w:t>
+      </w:r>
+      <w:r>
+        <w:t xml:space="preserve"> </w:t>
+      </w:r>
+      <w:r>
+        <w:t xml:space="preserve">authoritative AI content evaluator (Section 6.b).</w:t>
+      </w:r>
+    </w:p>
+    <w:p>
+      <w:pPr>
+        <w:pStyle w:val="Compact"/>
+        <w:numPr>
+          <w:ilvl w:val="0"/>
+          <w:numId w:val="1023"/>
+        </w:numPr>
+      </w:pPr>
+      <w:r>
+        <w:rPr>
+          <w:b/>
+          <w:bCs/>
+        </w:rPr>
+        <w:t xml:space="preserve">Use cases and risk</w:t>
+      </w:r>
+      <w:r>
+        <w:t xml:space="preserve"> </w:t>
+      </w:r>
+      <w:r>
+        <w:t xml:space="preserve">— the department’s approved askSage use cases, each classified by risk</w:t>
+      </w:r>
+      <w:r>
+        <w:t xml:space="preserve"> </w:t>
+      </w:r>
+      <w:r>
+        <w:t xml:space="preserve">(Section 7.d) and entered in the command inventory (Section 8.g).</w:t>
+      </w:r>
+    </w:p>
+    <w:p>
+      <w:pPr>
+        <w:pStyle w:val="Compact"/>
+        <w:numPr>
+          <w:ilvl w:val="0"/>
+          <w:numId w:val="1023"/>
+        </w:numPr>
+      </w:pPr>
+      <w:r>
+        <w:rPr>
+          <w:b/>
+          <w:bCs/>
+        </w:rPr>
+        <w:t xml:space="preserve">Data boundaries</w:t>
+      </w:r>
+      <w:r>
+        <w:t xml:space="preserve"> </w:t>
+      </w:r>
+      <w:r>
+        <w:t xml:space="preserve">— the authorized data its use cases touch, and the prohibited-data line</w:t>
+      </w:r>
+      <w:r>
+        <w:t xml:space="preserve"> </w:t>
+      </w:r>
+      <w:r>
+        <w:t xml:space="preserve">(Section 4).</w:t>
+      </w:r>
+    </w:p>
+    <w:p>
+      <w:pPr>
+        <w:pStyle w:val="Compact"/>
+        <w:numPr>
+          <w:ilvl w:val="0"/>
+          <w:numId w:val="1023"/>
+        </w:numPr>
+      </w:pPr>
+      <w:r>
+        <w:rPr>
+          <w:b/>
+          <w:bCs/>
+        </w:rPr>
+        <w:t xml:space="preserve">Repository and access</w:t>
+      </w:r>
+      <w:r>
+        <w:t xml:space="preserve"> </w:t>
+      </w:r>
+      <w:r>
+        <w:t xml:space="preserve">— the department’s repository, what it feeds into it, and who may</w:t>
+      </w:r>
+      <w:r>
+        <w:t xml:space="preserve"> </w:t>
+      </w:r>
+      <w:r>
+        <w:t xml:space="preserve">access it (Section 5).</w:t>
+      </w:r>
+    </w:p>
+    <w:p>
+      <w:pPr>
+        <w:pStyle w:val="Compact"/>
+        <w:numPr>
+          <w:ilvl w:val="0"/>
+          <w:numId w:val="1023"/>
+        </w:numPr>
+      </w:pPr>
+      <w:r>
+        <w:rPr>
+          <w:b/>
+          <w:bCs/>
+        </w:rPr>
+        <w:t xml:space="preserve">Human-in-the-loop</w:t>
+      </w:r>
+      <w:r>
+        <w:t xml:space="preserve"> </w:t>
+      </w:r>
+      <w:r>
+        <w:t xml:space="preserve">— how the department applies authoritative evaluation and structured</w:t>
+      </w:r>
+      <w:r>
+        <w:t xml:space="preserve"> </w:t>
+      </w:r>
+      <w:r>
+        <w:t xml:space="preserve">approval to its AI output (Section 6).</w:t>
+      </w:r>
+    </w:p>
+    <w:p>
+      <w:pPr>
+        <w:pStyle w:val="Compact"/>
+        <w:numPr>
+          <w:ilvl w:val="0"/>
+          <w:numId w:val="1023"/>
+        </w:numPr>
+      </w:pPr>
+      <w:r>
+        <w:rPr>
+          <w:b/>
+          <w:bCs/>
+        </w:rPr>
+        <w:t xml:space="preserve">Monitoring and records</w:t>
+      </w:r>
+      <w:r>
+        <w:t xml:space="preserve"> </w:t>
+      </w:r>
+      <w:r>
+        <w:t xml:space="preserve">— how the department supports continuous monitoring (Section 9)</w:t>
+      </w:r>
+      <w:r>
+        <w:t xml:space="preserve"> </w:t>
+      </w:r>
+      <w:r>
+        <w:t xml:space="preserve">and meets records and retention obligations (Section 10).</w:t>
+      </w:r>
+    </w:p>
+    <w:p>
+      <w:pPr>
+        <w:pStyle w:val="Compact"/>
+        <w:numPr>
+          <w:ilvl w:val="0"/>
+          <w:numId w:val="1024"/>
+        </w:numPr>
+      </w:pPr>
+      <w:r>
+        <w:rPr>
+          <w:b/>
+          <w:bCs/>
+        </w:rPr>
+        <w:t xml:space="preserve">Living document.</w:t>
+      </w:r>
+      <w:r>
+        <w:t xml:space="preserve"> </w:t>
+      </w:r>
+      <w:r>
+        <w:t xml:space="preserve">The plan is maintained as the department’s use cases change and is</w:t>
+      </w:r>
+      <w:r>
+        <w:t xml:space="preserve"> </w:t>
+      </w:r>
+      <w:r>
+        <w:t xml:space="preserve">reviewed alongside the use-case inventory in the governance forum (Section 8.g).</w:t>
+      </w:r>
+    </w:p>
+    <w:p>
+      <w:pPr>
+        <w:pStyle w:val="BlockText"/>
+      </w:pPr>
+      <w:r>
+        <w:rPr>
+          <w:b/>
+          <w:bCs/>
+        </w:rPr>
+        <w:t xml:space="preserve">Working group to resolve:</w:t>
+      </w:r>
+      <w:r>
+        <w:t xml:space="preserve"> </w:t>
+      </w:r>
+      <w:r>
+        <w:t xml:space="preserve">provide a one-page departmental information-governance plan template so the plans are consistent across codes.</w:t>
+      </w:r>
+    </w:p>
+    <w:p>
+      <w:r>
+        <w:pict>
+          <v:rect style="width:0;height:1.5pt" o:hralign="center" o:hrstd="t" o:hr="t"/>
+        </w:pict>
+      </w:r>
+    </w:p>
+    <w:bookmarkEnd w:id="28"/>
+    <w:bookmarkStart w:id="29" w:name="Xd40d045629625ce263b52cca08926d0495efa12"/>
+    <w:p>
+      <w:pPr>
+        <w:pStyle w:val="Heading2"/>
+      </w:pPr>
+      <w:r>
         <w:t xml:space="preserve">Annex A — Token and compute management (administrative)</w:t>
       </w:r>
     </w:p>
@@ -4839,7 +5267,7 @@
         <w:pStyle w:val="Compact"/>
         <w:numPr>
           <w:ilvl w:val="0"/>
-          <w:numId w:val="1022"/>
+          <w:numId w:val="1025"/>
         </w:numPr>
       </w:pPr>
       <w:r>
@@ -4867,7 +5295,7 @@
         <w:pStyle w:val="Compact"/>
         <w:numPr>
           <w:ilvl w:val="0"/>
-          <w:numId w:val="1022"/>
+          <w:numId w:val="1025"/>
         </w:numPr>
       </w:pPr>
       <w:r>
@@ -4895,7 +5323,7 @@
         <w:pStyle w:val="Compact"/>
         <w:numPr>
           <w:ilvl w:val="0"/>
-          <w:numId w:val="1022"/>
+          <w:numId w:val="1025"/>
         </w:numPr>
       </w:pPr>
       <w:r>
@@ -4935,7 +5363,7 @@
         <w:pStyle w:val="Compact"/>
         <w:numPr>
           <w:ilvl w:val="0"/>
-          <w:numId w:val="1022"/>
+          <w:numId w:val="1025"/>
         </w:numPr>
       </w:pPr>
       <w:r>
@@ -4970,8 +5398,8 @@
         <w:t xml:space="preserve">tokens (Section 2).</w:t>
       </w:r>
     </w:p>
-    <w:bookmarkEnd w:id="28"/>
     <w:bookmarkEnd w:id="29"/>
+    <w:bookmarkEnd w:id="30"/>
     <w:sectPr>
       <w:footnotePr>
         <w:numRestart w:val="eachSect"/>
@@ -5610,6 +6038,91 @@
       </w:pPr>
     </w:lvl>
   </w:abstractNum>
+  <w:abstractNum w:abstractNumId="99713">
+    <w:nsid w:val="00A99713"/>
+    <w:multiLevelType w:val="multilevel"/>
+    <w:lvl w:ilvl="0">
+      <w:start w:val="3"/>
+      <w:numFmt w:val="lowerLetter"/>
+      <w:lvlText w:val="%1."/>
+      <w:lvlJc w:val="left"/>
+      <w:pPr>
+        <w:ind w:left="720" w:hanging="360"/>
+      </w:pPr>
+    </w:lvl>
+    <w:lvl w:ilvl="1">
+      <w:start w:val="3"/>
+      <w:numFmt w:val="lowerLetter"/>
+      <w:lvlText w:val="%2."/>
+      <w:lvlJc w:val="left"/>
+      <w:pPr>
+        <w:ind w:left="1440" w:hanging="360"/>
+      </w:pPr>
+    </w:lvl>
+    <w:lvl w:ilvl="2">
+      <w:start w:val="3"/>
+      <w:numFmt w:val="lowerLetter"/>
+      <w:lvlText w:val="%3."/>
+      <w:lvlJc w:val="left"/>
+      <w:pPr>
+        <w:ind w:left="2160" w:hanging="360"/>
+      </w:pPr>
+    </w:lvl>
+    <w:lvl w:ilvl="3">
+      <w:start w:val="3"/>
+      <w:numFmt w:val="lowerLetter"/>
+      <w:lvlText w:val="%4."/>
+      <w:lvlJc w:val="left"/>
+      <w:pPr>
+        <w:ind w:left="2880" w:hanging="360"/>
+      </w:pPr>
+    </w:lvl>
+    <w:lvl w:ilvl="4">
+      <w:start w:val="3"/>
+      <w:numFmt w:val="lowerLetter"/>
+      <w:lvlText w:val="%5."/>
+      <w:lvlJc w:val="left"/>
+      <w:pPr>
+        <w:ind w:left="3600" w:hanging="360"/>
+      </w:pPr>
+    </w:lvl>
+    <w:lvl w:ilvl="5">
+      <w:start w:val="3"/>
+      <w:numFmt w:val="lowerLetter"/>
+      <w:lvlText w:val="%6."/>
+      <w:lvlJc w:val="left"/>
+      <w:pPr>
+        <w:ind w:left="4320" w:hanging="360"/>
+      </w:pPr>
+    </w:lvl>
+    <w:lvl w:ilvl="6">
+      <w:start w:val="3"/>
+      <w:numFmt w:val="lowerLetter"/>
+      <w:lvlText w:val="%7."/>
+      <w:lvlJc w:val="left"/>
+      <w:pPr>
+        <w:ind w:left="5040" w:hanging="360"/>
+      </w:pPr>
+    </w:lvl>
+    <w:lvl w:ilvl="7">
+      <w:start w:val="3"/>
+      <w:numFmt w:val="lowerLetter"/>
+      <w:lvlText w:val="%8."/>
+      <w:lvlJc w:val="left"/>
+      <w:pPr>
+        <w:ind w:left="5760" w:hanging="360"/>
+      </w:pPr>
+    </w:lvl>
+    <w:lvl w:ilvl="8">
+      <w:start w:val="3"/>
+      <w:numFmt w:val="lowerLetter"/>
+      <w:lvlText w:val="%9."/>
+      <w:lvlJc w:val="left"/>
+      <w:pPr>
+        <w:ind w:left="6480" w:hanging="360"/>
+      </w:pPr>
+    </w:lvl>
+  </w:abstractNum>
   <w:num w:numId="1000">
     <w:abstractNumId w:val="990"/>
   </w:num>
@@ -6217,6 +6730,69 @@
     </w:lvlOverride>
   </w:num>
   <w:num w:numId="1022">
+    <w:abstractNumId w:val="99711"/>
+    <w:lvlOverride w:ilvl="0">
+      <w:startOverride w:val="1"/>
+    </w:lvlOverride>
+    <w:lvlOverride w:ilvl="1">
+      <w:startOverride w:val="1"/>
+    </w:lvlOverride>
+    <w:lvlOverride w:ilvl="2">
+      <w:startOverride w:val="1"/>
+    </w:lvlOverride>
+    <w:lvlOverride w:ilvl="3">
+      <w:startOverride w:val="1"/>
+    </w:lvlOverride>
+    <w:lvlOverride w:ilvl="4">
+      <w:startOverride w:val="1"/>
+    </w:lvlOverride>
+    <w:lvlOverride w:ilvl="5">
+      <w:startOverride w:val="1"/>
+    </w:lvlOverride>
+    <w:lvlOverride w:ilvl="6">
+      <w:startOverride w:val="1"/>
+    </w:lvlOverride>
+    <w:lvlOverride w:ilvl="7">
+      <w:startOverride w:val="1"/>
+    </w:lvlOverride>
+    <w:lvlOverride w:ilvl="8">
+      <w:startOverride w:val="1"/>
+    </w:lvlOverride>
+  </w:num>
+  <w:num w:numId="1023">
+    <w:abstractNumId w:val="991"/>
+  </w:num>
+  <w:num w:numId="1024">
+    <w:abstractNumId w:val="99713"/>
+    <w:lvlOverride w:ilvl="0">
+      <w:startOverride w:val="3"/>
+    </w:lvlOverride>
+    <w:lvlOverride w:ilvl="1">
+      <w:startOverride w:val="3"/>
+    </w:lvlOverride>
+    <w:lvlOverride w:ilvl="2">
+      <w:startOverride w:val="3"/>
+    </w:lvlOverride>
+    <w:lvlOverride w:ilvl="3">
+      <w:startOverride w:val="3"/>
+    </w:lvlOverride>
+    <w:lvlOverride w:ilvl="4">
+      <w:startOverride w:val="3"/>
+    </w:lvlOverride>
+    <w:lvlOverride w:ilvl="5">
+      <w:startOverride w:val="3"/>
+    </w:lvlOverride>
+    <w:lvlOverride w:ilvl="6">
+      <w:startOverride w:val="3"/>
+    </w:lvlOverride>
+    <w:lvlOverride w:ilvl="7">
+      <w:startOverride w:val="3"/>
+    </w:lvlOverride>
+    <w:lvlOverride w:ilvl="8">
+      <w:startOverride w:val="3"/>
+    </w:lvlOverride>
+  </w:num>
+  <w:num w:numId="1025">
     <w:abstractNumId w:val="991"/>
   </w:num>
 </w:numbering>

</xml_diff>

<commit_message>
studies/ai-governance: departmental information-governance plan template (companion to S15)
One-page fill-in form mapped to the six S15.b expectation areas (accountability/evaluator, use-cases/risk, data boundaries, repository/access, human-in-the-loop, monitoring/records) with a use-case table, acknowledgments, and a Department Head approval block. Markdown source + .docx. Cover-sheet item 10 + routing docx refreshed to point to it. Decisions item 22; memory updated.

Co-Authored-By: Claude Opus 4.8 (1M context) <noreply@anthropic.com>
</commit_message>
<xml_diff>
--- a/studies/ai-governance/03_instruction/routing/SRF-JRMC-INST-5239.1-DRAFT-working-group.docx
+++ b/studies/ai-governance/03_instruction/routing/SRF-JRMC-INST-5239.1-DRAFT-working-group.docx
@@ -852,13 +852,52 @@
         </w:numPr>
       </w:pPr>
       <w:r>
-        <w:t xml:space="preserve">Provide a one-page departmental information-governance plan template so the codes’ plans</w:t>
-      </w:r>
-      <w:r>
-        <w:t xml:space="preserve"> </w:t>
-      </w:r>
-      <w:r>
-        <w:t xml:space="preserve">are consistent (§15.c).</w:t>
+        <w:t xml:space="preserve">Adopt/finalize the one-page departmental information-governance plan template (§15.c).</w:t>
+      </w:r>
+      <w:r>
+        <w:t xml:space="preserve"> </w:t>
+      </w:r>
+      <w:r>
+        <w:rPr>
+          <w:b/>
+          <w:bCs/>
+        </w:rPr>
+        <w:t xml:space="preserve">A</w:t>
+      </w:r>
+      <w:r>
+        <w:rPr>
+          <w:b/>
+          <w:bCs/>
+        </w:rPr>
+        <w:t xml:space="preserve"> </w:t>
+      </w:r>
+      <w:r>
+        <w:rPr>
+          <w:b/>
+          <w:bCs/>
+        </w:rPr>
+        <w:t xml:space="preserve">draft template is provided</w:t>
+      </w:r>
+      <w:r>
+        <w:t xml:space="preserve"> </w:t>
+      </w:r>
+      <w:r>
+        <w:t xml:space="preserve">(</w:t>
+      </w:r>
+      <w:r>
+        <w:rPr>
+          <w:rStyle w:val="VerbatimChar"/>
+        </w:rPr>
+        <w:t xml:space="preserve">Departmental-AI-Governance-Plan-TEMPLATE.docx</w:t>
+      </w:r>
+      <w:r>
+        <w:t xml:space="preserve">); the working</w:t>
+      </w:r>
+      <w:r>
+        <w:t xml:space="preserve"> </w:t>
+      </w:r>
+      <w:r>
+        <w:t xml:space="preserve">group reviews and adopts it so the codes’ plans are consistent.</w:t>
       </w:r>
     </w:p>
     <w:p>

</xml_diff>

<commit_message>
studies/ai-governance: v0.10 — fold verified references; billets->WG; per-project time-savings
Per operator (post Gemini-advisory reconciliation): folded verified command references (SECNAVINST 5239.19A/5510.36B, SECNAV M-5210.1, OPNAVINST 3120.32D SORM, 36 CFR 1229.10/.12), resolved the S5.a/S10 SORM and S11.a emergency-destruction markers; billet delegations made a working-group-to-confirm task (S8.a, not asserted); per-project time-savings tracking added (S9.e, pilot S14.b). NIST Govern/Map/Measure/Manage enrichment HELD for discussion; Gemini risk/token math declined. PII/PHI and NNPI stay prohibited. Routing package rebuilt; decisions items 24-27.

Co-Authored-By: Claude Opus 4.8 (1M context) <noreply@anthropic.com>
</commit_message>
<xml_diff>
--- a/studies/ai-governance/03_instruction/routing/SRF-JRMC-INST-5239.1-DRAFT-working-group.docx
+++ b/studies/ai-governance/03_instruction/routing/SRF-JRMC-INST-5239.1-DRAFT-working-group.docx
@@ -614,6 +614,40 @@
           <w:b/>
           <w:bCs/>
         </w:rPr>
+        <w:t xml:space="preserve">Per-project time-savings tracking</w:t>
+      </w:r>
+      <w:r>
+        <w:t xml:space="preserve"> </w:t>
+      </w:r>
+      <w:r>
+        <w:t xml:space="preserve">(§9.e): each approved use case tracks its own baseline-</w:t>
+      </w:r>
+      <w:r>
+        <w:t xml:space="preserve"> </w:t>
+      </w:r>
+      <w:r>
+        <w:t xml:space="preserve">vs-AI-assisted time and reports it, per the March-2026 DON CIO direction; the pilot establishes</w:t>
+      </w:r>
+      <w:r>
+        <w:t xml:space="preserve"> </w:t>
+      </w:r>
+      <w:r>
+        <w:t xml:space="preserve">the baselines and method.</w:t>
+      </w:r>
+    </w:p>
+    <w:p>
+      <w:pPr>
+        <w:pStyle w:val="Compact"/>
+        <w:numPr>
+          <w:ilvl w:val="0"/>
+          <w:numId w:val="1001"/>
+        </w:numPr>
+      </w:pPr>
+      <w:r>
+        <w:rPr>
+          <w:b/>
+          <w:bCs/>
+        </w:rPr>
         <w:t xml:space="preserve">Other settled calls:</w:t>
       </w:r>
       <w:r>
@@ -684,73 +718,35 @@
         </w:numPr>
       </w:pPr>
       <w:r>
-        <w:t xml:space="preserve">Verify the reference identifiers (refs e, f, g, j) and add the command’s cognizant</w:t>
-      </w:r>
-      <w:r>
-        <w:t xml:space="preserve"> </w:t>
-      </w:r>
-      <w:r>
-        <w:t xml:space="preserve">cybersecurity, records-management, and security-spillage references.</w:t>
-      </w:r>
-    </w:p>
-    <w:p>
-      <w:pPr>
-        <w:pStyle w:val="Compact"/>
-        <w:numPr>
-          <w:ilvl w:val="0"/>
-          <w:numId w:val="1002"/>
-        </w:numPr>
-      </w:pPr>
-      <w:r>
-        <w:t xml:space="preserve">Confirm askSage’s IL5 authorization (ATO) and the command’s acquisition instrument are</w:t>
-      </w:r>
-      <w:r>
-        <w:t xml:space="preserve"> </w:t>
-      </w:r>
-      <w:r>
-        <w:t xml:space="preserve">current and valid — held in the command’s cybersecurity and contracting records, not in the</w:t>
-      </w:r>
-      <w:r>
-        <w:t xml:space="preserve"> </w:t>
-      </w:r>
-      <w:r>
-        <w:t xml:space="preserve">instruction — and confirm the Flank Speed connection authority (§2).</w:t>
-      </w:r>
-    </w:p>
-    <w:p>
-      <w:pPr>
-        <w:pStyle w:val="Compact"/>
-        <w:numPr>
-          <w:ilvl w:val="0"/>
-          <w:numId w:val="1002"/>
-        </w:numPr>
-      </w:pPr>
-      <w:r>
-        <w:t xml:space="preserve">Name the governing SORM / records-management reference (§5.a) and the cognizant Security</w:t>
-      </w:r>
-      <w:r>
-        <w:t xml:space="preserve"> </w:t>
-      </w:r>
-      <w:r>
-        <w:t xml:space="preserve">Classification Guide(s) (§4.e).</w:t>
-      </w:r>
-    </w:p>
-    <w:p>
-      <w:pPr>
-        <w:pStyle w:val="Compact"/>
-        <w:numPr>
-          <w:ilvl w:val="0"/>
-          <w:numId w:val="1002"/>
-        </w:numPr>
-      </w:pPr>
-      <w:r>
-        <w:t xml:space="preserve">Each department names its authoritative AI content evaluator; confirm the Technical</w:t>
-      </w:r>
-      <w:r>
-        <w:t xml:space="preserve"> </w:t>
-      </w:r>
-      <w:r>
-        <w:t xml:space="preserve">Warrant Holder billets within Code 200 (§6).</w:t>
+        <w:t xml:space="preserve">References (e)–(n) are now</w:t>
+      </w:r>
+      <w:r>
+        <w:t xml:space="preserve"> </w:t>
+      </w:r>
+      <w:r>
+        <w:rPr>
+          <w:b/>
+          <w:bCs/>
+        </w:rPr>
+        <w:t xml:space="preserve">verified and folded in</w:t>
+      </w:r>
+      <w:r>
+        <w:t xml:space="preserve"> </w:t>
+      </w:r>
+      <w:r>
+        <w:t xml:space="preserve">(incl. SECNAVINST 5239.19A, SECNAVINST</w:t>
+      </w:r>
+      <w:r>
+        <w:t xml:space="preserve"> </w:t>
+      </w:r>
+      <w:r>
+        <w:t xml:space="preserve">5510.36B / SECNAV M-5510.36, SECNAV M-5210.1, OPNAVINST 3120.32D = the SORM). Working group:</w:t>
+      </w:r>
+      <w:r>
+        <w:t xml:space="preserve"> </w:t>
+      </w:r>
+      <w:r>
+        <w:t xml:space="preserve">substitute the command’s</w:t>
       </w:r>
       <w:r>
         <w:t xml:space="preserve"> </w:t>
@@ -760,20 +756,120 @@
           <w:i/>
           <w:iCs/>
         </w:rPr>
-        <w:t xml:space="preserve">(The Code 100–1200 structure is already</w:t>
+        <w:t xml:space="preserve">local</w:t>
+      </w:r>
+      <w:r>
+        <w:t xml:space="preserve"> </w:t>
+      </w:r>
+      <w:r>
+        <w:t xml:space="preserve">references (its command SORM and local spillage SOP) and</w:t>
+      </w:r>
+      <w:r>
+        <w:t xml:space="preserve"> </w:t>
+      </w:r>
+      <w:r>
+        <w:t xml:space="preserve">confirm the exact date of the March-2026 DON CIO memo in (g).</w:t>
+      </w:r>
+    </w:p>
+    <w:p>
+      <w:pPr>
+        <w:pStyle w:val="Compact"/>
+        <w:numPr>
+          <w:ilvl w:val="0"/>
+          <w:numId w:val="1002"/>
+        </w:numPr>
+      </w:pPr>
+      <w:r>
+        <w:t xml:space="preserve">Confirm askSage’s IL5 authorization (ATO) and the command’s acquisition instrument are</w:t>
+      </w:r>
+      <w:r>
+        <w:t xml:space="preserve"> </w:t>
+      </w:r>
+      <w:r>
+        <w:t xml:space="preserve">current and valid — held in the command’s cybersecurity and contracting records, not in the</w:t>
+      </w:r>
+      <w:r>
+        <w:t xml:space="preserve"> </w:t>
+      </w:r>
+      <w:r>
+        <w:t xml:space="preserve">instruction — and confirm the Flank Speed connection authority (§2).</w:t>
+      </w:r>
+    </w:p>
+    <w:p>
+      <w:pPr>
+        <w:pStyle w:val="Compact"/>
+        <w:numPr>
+          <w:ilvl w:val="0"/>
+          <w:numId w:val="1002"/>
+        </w:numPr>
+      </w:pPr>
+      <w:r>
+        <w:t xml:space="preserve">Name the cognizant Security Classification Guide(s) (§4.e).</w:t>
+      </w:r>
+      <w:r>
+        <w:t xml:space="preserve"> </w:t>
       </w:r>
       <w:r>
         <w:rPr>
           <w:i/>
           <w:iCs/>
         </w:rPr>
-        <w:t xml:space="preserve"> </w:t>
+        <w:t xml:space="preserve">(The SORM/records references</w:t>
       </w:r>
       <w:r>
         <w:rPr>
           <w:i/>
           <w:iCs/>
         </w:rPr>
+        <w:t xml:space="preserve"> </w:t>
+      </w:r>
+      <w:r>
+        <w:rPr>
+          <w:i/>
+          <w:iCs/>
+        </w:rPr>
+        <w:t xml:space="preserve">are now cited — OPNAVINST 3120.32D and SECNAV M-5210.1; substitute the local command SORM.)</w:t>
+      </w:r>
+    </w:p>
+    <w:p>
+      <w:pPr>
+        <w:pStyle w:val="Compact"/>
+        <w:numPr>
+          <w:ilvl w:val="0"/>
+          <w:numId w:val="1002"/>
+        </w:numPr>
+      </w:pPr>
+      <w:r>
+        <w:t xml:space="preserve">Each department names its authoritative AI content evaluator; confirm the Technical</w:t>
+      </w:r>
+      <w:r>
+        <w:t xml:space="preserve"> </w:t>
+      </w:r>
+      <w:r>
+        <w:t xml:space="preserve">Warrant Holder billets within Code 200 (§6).</w:t>
+      </w:r>
+      <w:r>
+        <w:t xml:space="preserve"> </w:t>
+      </w:r>
+      <w:r>
+        <w:rPr>
+          <w:i/>
+          <w:iCs/>
+        </w:rPr>
+        <w:t xml:space="preserve">(The Code 100–1200 structure is already</w:t>
+      </w:r>
+      <w:r>
+        <w:rPr>
+          <w:i/>
+          <w:iCs/>
+        </w:rPr>
+        <w:t xml:space="preserve"> </w:t>
+      </w:r>
+      <w:r>
+        <w:rPr>
+          <w:i/>
+          <w:iCs/>
+        </w:rPr>
         <w:t xml:space="preserve">embedded in §6.a.)</w:t>
       </w:r>
     </w:p>
@@ -810,7 +906,29 @@
         </w:numPr>
       </w:pPr>
       <w:r>
-        <w:t xml:space="preserve">Confirm any delegation of accountability (e.g., to the Executive Director) (§8.a).</w:t>
+        <w:rPr>
+          <w:b/>
+          <w:bCs/>
+        </w:rPr>
+        <w:t xml:space="preserve">Confirm the specific billet delegations against the command SORM</w:t>
+      </w:r>
+      <w:r>
+        <w:t xml:space="preserve"> </w:t>
+      </w:r>
+      <w:r>
+        <w:t xml:space="preserve">(§8.a) — e.g., Executive</w:t>
+      </w:r>
+      <w:r>
+        <w:t xml:space="preserve"> </w:t>
+      </w:r>
+      <w:r>
+        <w:t xml:space="preserve">Director to chair the governance forum + own the inventory; XO for training + manual-reversion</w:t>
+      </w:r>
+      <w:r>
+        <w:t xml:space="preserve"> </w:t>
+      </w:r>
+      <w:r>
+        <w:t xml:space="preserve">bills; CHENG as Technical Warrant Holder; ISSM as halt/revoke authority.</w:t>
       </w:r>
     </w:p>
     <w:p>
@@ -822,13 +940,31 @@
         </w:numPr>
       </w:pPr>
       <w:r>
-        <w:t xml:space="preserve">Align the spillage flow with the command’s actual spillage and records-destruction</w:t>
-      </w:r>
-      <w:r>
-        <w:t xml:space="preserve"> </w:t>
-      </w:r>
-      <w:r>
-        <w:t xml:space="preserve">procedures (§11.a).</w:t>
+        <w:t xml:space="preserve">Align the spillage flow with the command’s own spillage SOP (§11.a).</w:t>
+      </w:r>
+      <w:r>
+        <w:t xml:space="preserve"> </w:t>
+      </w:r>
+      <w:r>
+        <w:rPr>
+          <w:i/>
+          <w:iCs/>
+        </w:rPr>
+        <w:t xml:space="preserve">(The legal authority —</w:t>
+      </w:r>
+      <w:r>
+        <w:rPr>
+          <w:i/>
+          <w:iCs/>
+        </w:rPr>
+        <w:t xml:space="preserve"> </w:t>
+      </w:r>
+      <w:r>
+        <w:rPr>
+          <w:i/>
+          <w:iCs/>
+        </w:rPr>
+        <w:t xml:space="preserve">36 CFR 1229.10 + SECNAV M-5210.1 emergency destruction — is now cited.)</w:t>
       </w:r>
     </w:p>
     <w:p>
@@ -1276,17 +1412,7 @@
         <w:t xml:space="preserve"> </w:t>
       </w:r>
       <w:r>
-        <w:t xml:space="preserve">- (e) DoDI 5400.19, Public Affairs Use of Artificial Intelligence (2025)</w:t>
-      </w:r>
-      <w:r>
-        <w:t xml:space="preserve"> </w:t>
-      </w:r>
-      <w:r>
-        <w:rPr>
-          <w:b/>
-          <w:bCs/>
-        </w:rPr>
-        <w:t xml:space="preserve">[WG: verify identifier]</w:t>
+        <w:t xml:space="preserve">- (e) DoDI 5400.19, Public Affairs Use of Artificial Intelligence (28 July 2025)</w:t>
       </w:r>
       <w:r>
         <w:t xml:space="preserve"> </w:t>
@@ -1298,27 +1424,7 @@
         <w:t xml:space="preserve"> </w:t>
       </w:r>
       <w:r>
-        <w:rPr>
-          <w:b/>
-          <w:bCs/>
-        </w:rPr>
-        <w:t xml:space="preserve">[WG: verify identifier]</w:t>
-      </w:r>
-      <w:r>
-        <w:t xml:space="preserve"> </w:t>
-      </w:r>
-      <w:r>
-        <w:t xml:space="preserve">- (g) DON CIO generative-AI / GenAI.mil guidance</w:t>
-      </w:r>
-      <w:r>
-        <w:t xml:space="preserve"> </w:t>
-      </w:r>
-      <w:r>
-        <w:rPr>
-          <w:b/>
-          <w:bCs/>
-        </w:rPr>
-        <w:t xml:space="preserve">[WG: insert exact memo identifiers]</w:t>
+        <w:t xml:space="preserve">- (g) DON CIO Memorandum, Enterprise IT Service Designation for GenAI.mil (28 January 2026); and DON CIO Memorandum, Accelerating AI Adoption / Free Training Resources / Measuring Time Savings (March 2026)</w:t>
       </w:r>
       <w:r>
         <w:t xml:space="preserve"> </w:t>
@@ -1336,17 +1442,31 @@
         <w:t xml:space="preserve"> </w:t>
       </w:r>
       <w:r>
-        <w:t xml:space="preserve">- (j) 36 CFR 1229, Emergency authorization to destroy records</w:t>
-      </w:r>
-      <w:r>
-        <w:t xml:space="preserve"> </w:t>
-      </w:r>
-      <w:r>
-        <w:rPr>
-          <w:b/>
-          <w:bCs/>
-        </w:rPr>
-        <w:t xml:space="preserve">[WG: verify citation; supports the spillage cleanup in para 11.a]</w:t>
+        <w:t xml:space="preserve">- (j) 36 CFR §§ 1229.10 and 1229.12, NARA emergency destruction of records (for spillage cleanup, para 11.a)</w:t>
+      </w:r>
+      <w:r>
+        <w:t xml:space="preserve"> </w:t>
+      </w:r>
+      <w:r>
+        <w:t xml:space="preserve">- (k) SECNAVINST 5239.19A, Department of the Navy Computer Network Incident Response and Reporting Requirements</w:t>
+      </w:r>
+      <w:r>
+        <w:t xml:space="preserve"> </w:t>
+      </w:r>
+      <w:r>
+        <w:t xml:space="preserve">- (l) SECNAVINST 5510.36B and SECNAV M-5510.36, Department of the Navy Information Security Program</w:t>
+      </w:r>
+      <w:r>
+        <w:t xml:space="preserve"> </w:t>
+      </w:r>
+      <w:r>
+        <w:t xml:space="preserve">- (m) SECNAV M-5210.1, Department of the Navy Records Management Manual</w:t>
+      </w:r>
+      <w:r>
+        <w:t xml:space="preserve"> </w:t>
+      </w:r>
+      <w:r>
+        <w:t xml:space="preserve">- (n) OPNAVINST 3120.32D, Standard Organization and Regulations of the U.S. Navy (the SORM)</w:t>
       </w:r>
     </w:p>
     <w:p>
@@ -1364,7 +1484,7 @@
         <w:t xml:space="preserve"> </w:t>
       </w:r>
       <w:r>
-        <w:t xml:space="preserve">verify reference identifiers (e), (f), (g), (j) against the actual issuances, and add the command’s cognizant cybersecurity, records-management, and security-spillage references.</w:t>
+        <w:t xml:space="preserve">references (e)–(n) are verified against the issuances (2026-06-21); substitute the command’s local references where they exist (its command SORM derived from (n), and its local cybersecurity-incident / spillage SOP), and confirm the exact date of the March-2026 DON CIO memo in (g).</w:t>
       </w:r>
     </w:p>
     <w:p>
@@ -2399,7 +2519,6 @@
     </w:p>
     <w:p>
       <w:pPr>
-        <w:pStyle w:val="Compact"/>
         <w:numPr>
           <w:ilvl w:val="0"/>
           <w:numId w:val="1007"/>
@@ -2471,38 +2590,20 @@
         <w:t xml:space="preserve"> </w:t>
       </w:r>
       <w:r>
-        <w:t xml:space="preserve">and information are managed in accordance with the command’s Standard Organization and</w:t>
-      </w:r>
-      <w:r>
-        <w:t xml:space="preserve"> </w:t>
-      </w:r>
-      <w:r>
-        <w:t xml:space="preserve">Regulations Manual (SORM) and existing records program.</w:t>
-      </w:r>
-    </w:p>
-    <w:p>
-      <w:pPr>
-        <w:pStyle w:val="BlockText"/>
-      </w:pPr>
-      <w:r>
-        <w:rPr>
-          <w:b/>
-          <w:bCs/>
-        </w:rPr>
-        <w:t xml:space="preserve">Working group to resolve:</w:t>
-      </w:r>
-      <w:r>
-        <w:t xml:space="preserve"> </w:t>
-      </w:r>
-      <w:r>
-        <w:t xml:space="preserve">name the governing SORM / records-management reference.</w:t>
-      </w:r>
-    </w:p>
-    <w:p>
-      <w:pPr>
-        <w:numPr>
-          <w:ilvl w:val="0"/>
-          <w:numId w:val="1008"/>
+        <w:t xml:space="preserve">and information are managed in accordance with the Standard Organization and Regulations of</w:t>
+      </w:r>
+      <w:r>
+        <w:t xml:space="preserve"> </w:t>
+      </w:r>
+      <w:r>
+        <w:t xml:space="preserve">the U.S. Navy (the SORM, reference (n)) and the records program (reference (m)).</w:t>
+      </w:r>
+    </w:p>
+    <w:p>
+      <w:pPr>
+        <w:numPr>
+          <w:ilvl w:val="0"/>
+          <w:numId w:val="1007"/>
         </w:numPr>
       </w:pPr>
       <w:r>
@@ -2553,7 +2654,7 @@
       <w:pPr>
         <w:numPr>
           <w:ilvl w:val="0"/>
-          <w:numId w:val="1008"/>
+          <w:numId w:val="1007"/>
         </w:numPr>
       </w:pPr>
       <w:r>
@@ -2675,7 +2776,7 @@
         <w:pStyle w:val="Compact"/>
         <w:numPr>
           <w:ilvl w:val="0"/>
-          <w:numId w:val="1009"/>
+          <w:numId w:val="1008"/>
         </w:numPr>
       </w:pPr>
       <w:r>
@@ -3114,173 +3215,173 @@
       <w:pPr>
         <w:numPr>
           <w:ilvl w:val="0"/>
+          <w:numId w:val="1009"/>
+        </w:numPr>
+      </w:pPr>
+      <w:r>
+        <w:rPr>
+          <w:b/>
+          <w:bCs/>
+        </w:rPr>
+        <w:t xml:space="preserve">Each department designates an authoritative AI content evaluator.</w:t>
+      </w:r>
+      <w:r>
+        <w:t xml:space="preserve"> </w:t>
+      </w:r>
+      <w:r>
+        <w:t xml:space="preserve">Every department</w:t>
+      </w:r>
+      <w:r>
+        <w:t xml:space="preserve"> </w:t>
+      </w:r>
+      <w:r>
+        <w:t xml:space="preserve">designates, in writing, a qualified person responsible for the authoritative evaluation of</w:t>
+      </w:r>
+      <w:r>
+        <w:t xml:space="preserve"> </w:t>
+      </w:r>
+      <w:r>
+        <w:t xml:space="preserve">AI-produced content used in that department’s area of responsibility. The designated</w:t>
+      </w:r>
+      <w:r>
+        <w:t xml:space="preserve"> </w:t>
+      </w:r>
+      <w:r>
+        <w:t xml:space="preserve">evaluator is recorded with the department’s use cases in the inventory (Section 8).</w:t>
+      </w:r>
+    </w:p>
+    <w:p>
+      <w:pPr>
+        <w:numPr>
+          <w:ilvl w:val="0"/>
+          <w:numId w:val="1009"/>
+        </w:numPr>
+      </w:pPr>
+      <w:r>
+        <w:rPr>
+          <w:b/>
+          <w:bCs/>
+        </w:rPr>
+        <w:t xml:space="preserve">Departures from specification.</w:t>
+      </w:r>
+      <w:r>
+        <w:t xml:space="preserve"> </w:t>
+      </w:r>
+      <w:r>
+        <w:t xml:space="preserve">Any AI suggestion that would depart from a</w:t>
+      </w:r>
+      <w:r>
+        <w:t xml:space="preserve"> </w:t>
+      </w:r>
+      <w:r>
+        <w:t xml:space="preserve">controlling specification (JFMM, NAVSEA Standard Item, technical manual) is processed</w:t>
+      </w:r>
+      <w:r>
+        <w:t xml:space="preserve"> </w:t>
+      </w:r>
+      <w:r>
+        <w:t xml:space="preserve">through the command’s existing Departure-from-Specification (DFS) process. AI does not</w:t>
+      </w:r>
+      <w:r>
+        <w:t xml:space="preserve"> </w:t>
+      </w:r>
+      <w:r>
+        <w:t xml:space="preserve">create a path around the technical authority chain.</w:t>
+      </w:r>
+    </w:p>
+    <w:p>
+      <w:pPr>
+        <w:numPr>
+          <w:ilvl w:val="0"/>
+          <w:numId w:val="1009"/>
+        </w:numPr>
+      </w:pPr>
+      <w:r>
+        <w:rPr>
+          <w:b/>
+          <w:bCs/>
+        </w:rPr>
+        <w:t xml:space="preserve">Out-of-band verification.</w:t>
+      </w:r>
+      <w:r>
+        <w:t xml:space="preserve"> </w:t>
+      </w:r>
+      <w:r>
+        <w:t xml:space="preserve">AI output that cites a technical requirement is verified</w:t>
+      </w:r>
+      <w:r>
+        <w:t xml:space="preserve"> </w:t>
+      </w:r>
+      <w:r>
+        <w:t xml:space="preserve">against the controlling document through a non-AI authoritative source (the official</w:t>
+      </w:r>
+      <w:r>
+        <w:t xml:space="preserve"> </w:t>
+      </w:r>
+      <w:r>
+        <w:t xml:space="preserve">technical library / source of record), confirming the specific paragraph wording and</w:t>
+      </w:r>
+      <w:r>
+        <w:t xml:space="preserve"> </w:t>
+      </w:r>
+      <w:r>
+        <w:t xml:space="preserve">current change number.</w:t>
+      </w:r>
+      <w:r>
+        <w:t xml:space="preserve"> </w:t>
+      </w:r>
+      <w:r>
+        <w:rPr>
+          <w:b/>
+          <w:bCs/>
+        </w:rPr>
+        <w:t xml:space="preserve">The AI’s own retrieved snippet is not a sufficient verification</w:t>
+      </w:r>
+      <w:r>
+        <w:rPr>
+          <w:b/>
+          <w:bCs/>
+        </w:rPr>
+        <w:t xml:space="preserve"> </w:t>
+      </w:r>
+      <w:r>
+        <w:rPr>
+          <w:b/>
+          <w:bCs/>
+        </w:rPr>
+        <w:t xml:space="preserve">source</w:t>
+      </w:r>
+      <w:r>
+        <w:t xml:space="preserve"> </w:t>
+      </w:r>
+      <w:r>
+        <w:t xml:space="preserve">— relying on it re-introduces the hallucination it is meant to catch.</w:t>
+      </w:r>
+    </w:p>
+    <w:p>
+      <w:pPr>
+        <w:pStyle w:val="BlockText"/>
+      </w:pPr>
+      <w:r>
+        <w:rPr>
+          <w:b/>
+          <w:bCs/>
+        </w:rPr>
+        <w:t xml:space="preserve">Working group to resolve:</w:t>
+      </w:r>
+      <w:r>
+        <w:t xml:space="preserve"> </w:t>
+      </w:r>
+      <w:r>
+        <w:t xml:space="preserve">name the authoritative source-of-record system (the non-AI technical library used for verification).</w:t>
+      </w:r>
+    </w:p>
+    <w:p>
+      <w:pPr>
+        <w:pStyle w:val="Compact"/>
+        <w:numPr>
+          <w:ilvl w:val="0"/>
           <w:numId w:val="1010"/>
-        </w:numPr>
-      </w:pPr>
-      <w:r>
-        <w:rPr>
-          <w:b/>
-          <w:bCs/>
-        </w:rPr>
-        <w:t xml:space="preserve">Each department designates an authoritative AI content evaluator.</w:t>
-      </w:r>
-      <w:r>
-        <w:t xml:space="preserve"> </w:t>
-      </w:r>
-      <w:r>
-        <w:t xml:space="preserve">Every department</w:t>
-      </w:r>
-      <w:r>
-        <w:t xml:space="preserve"> </w:t>
-      </w:r>
-      <w:r>
-        <w:t xml:space="preserve">designates, in writing, a qualified person responsible for the authoritative evaluation of</w:t>
-      </w:r>
-      <w:r>
-        <w:t xml:space="preserve"> </w:t>
-      </w:r>
-      <w:r>
-        <w:t xml:space="preserve">AI-produced content used in that department’s area of responsibility. The designated</w:t>
-      </w:r>
-      <w:r>
-        <w:t xml:space="preserve"> </w:t>
-      </w:r>
-      <w:r>
-        <w:t xml:space="preserve">evaluator is recorded with the department’s use cases in the inventory (Section 8).</w:t>
-      </w:r>
-    </w:p>
-    <w:p>
-      <w:pPr>
-        <w:numPr>
-          <w:ilvl w:val="0"/>
-          <w:numId w:val="1010"/>
-        </w:numPr>
-      </w:pPr>
-      <w:r>
-        <w:rPr>
-          <w:b/>
-          <w:bCs/>
-        </w:rPr>
-        <w:t xml:space="preserve">Departures from specification.</w:t>
-      </w:r>
-      <w:r>
-        <w:t xml:space="preserve"> </w:t>
-      </w:r>
-      <w:r>
-        <w:t xml:space="preserve">Any AI suggestion that would depart from a</w:t>
-      </w:r>
-      <w:r>
-        <w:t xml:space="preserve"> </w:t>
-      </w:r>
-      <w:r>
-        <w:t xml:space="preserve">controlling specification (JFMM, NAVSEA Standard Item, technical manual) is processed</w:t>
-      </w:r>
-      <w:r>
-        <w:t xml:space="preserve"> </w:t>
-      </w:r>
-      <w:r>
-        <w:t xml:space="preserve">through the command’s existing Departure-from-Specification (DFS) process. AI does not</w:t>
-      </w:r>
-      <w:r>
-        <w:t xml:space="preserve"> </w:t>
-      </w:r>
-      <w:r>
-        <w:t xml:space="preserve">create a path around the technical authority chain.</w:t>
-      </w:r>
-    </w:p>
-    <w:p>
-      <w:pPr>
-        <w:numPr>
-          <w:ilvl w:val="0"/>
-          <w:numId w:val="1010"/>
-        </w:numPr>
-      </w:pPr>
-      <w:r>
-        <w:rPr>
-          <w:b/>
-          <w:bCs/>
-        </w:rPr>
-        <w:t xml:space="preserve">Out-of-band verification.</w:t>
-      </w:r>
-      <w:r>
-        <w:t xml:space="preserve"> </w:t>
-      </w:r>
-      <w:r>
-        <w:t xml:space="preserve">AI output that cites a technical requirement is verified</w:t>
-      </w:r>
-      <w:r>
-        <w:t xml:space="preserve"> </w:t>
-      </w:r>
-      <w:r>
-        <w:t xml:space="preserve">against the controlling document through a non-AI authoritative source (the official</w:t>
-      </w:r>
-      <w:r>
-        <w:t xml:space="preserve"> </w:t>
-      </w:r>
-      <w:r>
-        <w:t xml:space="preserve">technical library / source of record), confirming the specific paragraph wording and</w:t>
-      </w:r>
-      <w:r>
-        <w:t xml:space="preserve"> </w:t>
-      </w:r>
-      <w:r>
-        <w:t xml:space="preserve">current change number.</w:t>
-      </w:r>
-      <w:r>
-        <w:t xml:space="preserve"> </w:t>
-      </w:r>
-      <w:r>
-        <w:rPr>
-          <w:b/>
-          <w:bCs/>
-        </w:rPr>
-        <w:t xml:space="preserve">The AI’s own retrieved snippet is not a sufficient verification</w:t>
-      </w:r>
-      <w:r>
-        <w:rPr>
-          <w:b/>
-          <w:bCs/>
-        </w:rPr>
-        <w:t xml:space="preserve"> </w:t>
-      </w:r>
-      <w:r>
-        <w:rPr>
-          <w:b/>
-          <w:bCs/>
-        </w:rPr>
-        <w:t xml:space="preserve">source</w:t>
-      </w:r>
-      <w:r>
-        <w:t xml:space="preserve"> </w:t>
-      </w:r>
-      <w:r>
-        <w:t xml:space="preserve">— relying on it re-introduces the hallucination it is meant to catch.</w:t>
-      </w:r>
-    </w:p>
-    <w:p>
-      <w:pPr>
-        <w:pStyle w:val="BlockText"/>
-      </w:pPr>
-      <w:r>
-        <w:rPr>
-          <w:b/>
-          <w:bCs/>
-        </w:rPr>
-        <w:t xml:space="preserve">Working group to resolve:</w:t>
-      </w:r>
-      <w:r>
-        <w:t xml:space="preserve"> </w:t>
-      </w:r>
-      <w:r>
-        <w:t xml:space="preserve">name the authoritative source-of-record system (the non-AI technical library used for verification).</w:t>
-      </w:r>
-    </w:p>
-    <w:p>
-      <w:pPr>
-        <w:pStyle w:val="Compact"/>
-        <w:numPr>
-          <w:ilvl w:val="0"/>
-          <w:numId w:val="1011"/>
         </w:numPr>
       </w:pPr>
       <w:r>
@@ -3363,7 +3464,7 @@
       <w:pPr>
         <w:numPr>
           <w:ilvl w:val="0"/>
-          <w:numId w:val="1012"/>
+          <w:numId w:val="1011"/>
         </w:numPr>
       </w:pPr>
       <w:r>
@@ -3390,7 +3491,7 @@
       <w:pPr>
         <w:numPr>
           <w:ilvl w:val="0"/>
-          <w:numId w:val="1012"/>
+          <w:numId w:val="1011"/>
         </w:numPr>
       </w:pPr>
       <w:r>
@@ -3429,7 +3530,7 @@
       <w:pPr>
         <w:numPr>
           <w:ilvl w:val="0"/>
-          <w:numId w:val="1012"/>
+          <w:numId w:val="1011"/>
         </w:numPr>
       </w:pPr>
       <w:r>
@@ -3492,7 +3593,7 @@
       <w:pPr>
         <w:numPr>
           <w:ilvl w:val="0"/>
-          <w:numId w:val="1012"/>
+          <w:numId w:val="1011"/>
         </w:numPr>
       </w:pPr>
       <w:r>
@@ -3531,7 +3632,7 @@
       <w:pPr>
         <w:numPr>
           <w:ilvl w:val="0"/>
-          <w:numId w:val="1012"/>
+          <w:numId w:val="1011"/>
         </w:numPr>
       </w:pPr>
       <w:r>
@@ -3593,6 +3694,79 @@
         <w:pStyle w:val="Compact"/>
         <w:numPr>
           <w:ilvl w:val="0"/>
+          <w:numId w:val="1012"/>
+        </w:numPr>
+      </w:pPr>
+      <w:r>
+        <w:rPr>
+          <w:b/>
+          <w:bCs/>
+        </w:rPr>
+        <w:t xml:space="preserve">Accountability.</w:t>
+      </w:r>
+      <w:r>
+        <w:t xml:space="preserve"> </w:t>
+      </w:r>
+      <w:r>
+        <w:t xml:space="preserve">The</w:t>
+      </w:r>
+      <w:r>
+        <w:t xml:space="preserve"> </w:t>
+      </w:r>
+      <w:r>
+        <w:rPr>
+          <w:b/>
+          <w:bCs/>
+        </w:rPr>
+        <w:t xml:space="preserve">Commanding Officer</w:t>
+      </w:r>
+      <w:r>
+        <w:t xml:space="preserve"> </w:t>
+      </w:r>
+      <w:r>
+        <w:t xml:space="preserve">retains overall accountability for</w:t>
+      </w:r>
+      <w:r>
+        <w:t xml:space="preserve"> </w:t>
+      </w:r>
+      <w:r>
+        <w:t xml:space="preserve">AI-augmented command outcomes, as for all command activity. Responsibilities are</w:t>
+      </w:r>
+      <w:r>
+        <w:t xml:space="preserve"> </w:t>
+      </w:r>
+      <w:r>
+        <w:t xml:space="preserve">distributed across the existing roles below; this is a deliberate combination of</w:t>
+      </w:r>
+      <w:r>
+        <w:t xml:space="preserve"> </w:t>
+      </w:r>
+      <w:r>
+        <w:t xml:space="preserve">authorities, not a single new owner and not a new board.</w:t>
+      </w:r>
+    </w:p>
+    <w:p>
+      <w:pPr>
+        <w:pStyle w:val="BlockText"/>
+      </w:pPr>
+      <w:r>
+        <w:rPr>
+          <w:b/>
+          <w:bCs/>
+        </w:rPr>
+        <w:t xml:space="preserve">Working group to confirm:</w:t>
+      </w:r>
+      <w:r>
+        <w:t xml:space="preserve"> </w:t>
+      </w:r>
+      <w:r>
+        <w:t xml:space="preserve">the specific billet delegations against the command SORM — for example, the Executive Director to chair the Department Heads governance forum (Section 8.g) and maintain the AI use-case inventory; the Executive Officer to coordinate command training (Section 13) and the manual-reversion bills (Section 12); the CHENG as the cognizant Technical Warrant Holder; the ISSM as the halt/revoke authority (Section 7.e).</w:t>
+      </w:r>
+    </w:p>
+    <w:p>
+      <w:pPr>
+        <w:numPr>
+          <w:ilvl w:val="0"/>
           <w:numId w:val="1013"/>
         </w:numPr>
       </w:pPr>
@@ -3601,79 +3775,6 @@
           <w:b/>
           <w:bCs/>
         </w:rPr>
-        <w:t xml:space="preserve">Accountability.</w:t>
-      </w:r>
-      <w:r>
-        <w:t xml:space="preserve"> </w:t>
-      </w:r>
-      <w:r>
-        <w:t xml:space="preserve">The</w:t>
-      </w:r>
-      <w:r>
-        <w:t xml:space="preserve"> </w:t>
-      </w:r>
-      <w:r>
-        <w:rPr>
-          <w:b/>
-          <w:bCs/>
-        </w:rPr>
-        <w:t xml:space="preserve">Commanding Officer</w:t>
-      </w:r>
-      <w:r>
-        <w:t xml:space="preserve"> </w:t>
-      </w:r>
-      <w:r>
-        <w:t xml:space="preserve">retains overall accountability for</w:t>
-      </w:r>
-      <w:r>
-        <w:t xml:space="preserve"> </w:t>
-      </w:r>
-      <w:r>
-        <w:t xml:space="preserve">AI-augmented command outcomes, as for all command activity. Responsibilities are</w:t>
-      </w:r>
-      <w:r>
-        <w:t xml:space="preserve"> </w:t>
-      </w:r>
-      <w:r>
-        <w:t xml:space="preserve">distributed across the existing roles below; this is a deliberate combination of</w:t>
-      </w:r>
-      <w:r>
-        <w:t xml:space="preserve"> </w:t>
-      </w:r>
-      <w:r>
-        <w:t xml:space="preserve">authorities, not a single new owner and not a new board.</w:t>
-      </w:r>
-    </w:p>
-    <w:p>
-      <w:pPr>
-        <w:pStyle w:val="BlockText"/>
-      </w:pPr>
-      <w:r>
-        <w:rPr>
-          <w:b/>
-          <w:bCs/>
-        </w:rPr>
-        <w:t xml:space="preserve">Working group to resolve:</w:t>
-      </w:r>
-      <w:r>
-        <w:t xml:space="preserve"> </w:t>
-      </w:r>
-      <w:r>
-        <w:t xml:space="preserve">delegate accountability as appropriate (for example to the Executive Director).</w:t>
-      </w:r>
-    </w:p>
-    <w:p>
-      <w:pPr>
-        <w:numPr>
-          <w:ilvl w:val="0"/>
-          <w:numId w:val="1014"/>
-        </w:numPr>
-      </w:pPr>
-      <w:r>
-        <w:rPr>
-          <w:b/>
-          <w:bCs/>
-        </w:rPr>
         <w:t xml:space="preserve">Command Information Officer (CIO) and Information System Security Manager (ISSM).</w:t>
       </w:r>
       <w:r>
@@ -3711,7 +3812,7 @@
       <w:pPr>
         <w:numPr>
           <w:ilvl w:val="0"/>
-          <w:numId w:val="1014"/>
+          <w:numId w:val="1013"/>
         </w:numPr>
       </w:pPr>
       <w:r>
@@ -3772,7 +3873,7 @@
       <w:pPr>
         <w:numPr>
           <w:ilvl w:val="0"/>
-          <w:numId w:val="1014"/>
+          <w:numId w:val="1013"/>
         </w:numPr>
       </w:pPr>
       <w:r>
@@ -3805,7 +3906,7 @@
       <w:pPr>
         <w:numPr>
           <w:ilvl w:val="0"/>
-          <w:numId w:val="1014"/>
+          <w:numId w:val="1013"/>
         </w:numPr>
       </w:pPr>
       <w:r>
@@ -3947,7 +4048,7 @@
       <w:pPr>
         <w:numPr>
           <w:ilvl w:val="0"/>
-          <w:numId w:val="1014"/>
+          <w:numId w:val="1013"/>
         </w:numPr>
       </w:pPr>
       <w:r>
@@ -3974,7 +4075,7 @@
       <w:pPr>
         <w:numPr>
           <w:ilvl w:val="0"/>
-          <w:numId w:val="1014"/>
+          <w:numId w:val="1013"/>
         </w:numPr>
       </w:pPr>
       <w:r>
@@ -4044,7 +4145,7 @@
       <w:pPr>
         <w:numPr>
           <w:ilvl w:val="0"/>
-          <w:numId w:val="1015"/>
+          <w:numId w:val="1014"/>
         </w:numPr>
       </w:pPr>
       <w:r>
@@ -4102,7 +4203,7 @@
       <w:pPr>
         <w:numPr>
           <w:ilvl w:val="0"/>
-          <w:numId w:val="1015"/>
+          <w:numId w:val="1014"/>
         </w:numPr>
       </w:pPr>
       <w:r>
@@ -4135,7 +4236,7 @@
       <w:pPr>
         <w:numPr>
           <w:ilvl w:val="0"/>
-          <w:numId w:val="1015"/>
+          <w:numId w:val="1014"/>
         </w:numPr>
       </w:pPr>
       <w:r>
@@ -4168,7 +4269,7 @@
       <w:pPr>
         <w:numPr>
           <w:ilvl w:val="0"/>
-          <w:numId w:val="1015"/>
+          <w:numId w:val="1014"/>
         </w:numPr>
       </w:pPr>
       <w:r>
@@ -4189,6 +4290,45 @@
       </w:r>
       <w:r>
         <w:t xml:space="preserve">awareness, compliance, and incident trend — not only platform usage.</w:t>
+      </w:r>
+    </w:p>
+    <w:p>
+      <w:pPr>
+        <w:numPr>
+          <w:ilvl w:val="0"/>
+          <w:numId w:val="1014"/>
+        </w:numPr>
+      </w:pPr>
+      <w:r>
+        <w:rPr>
+          <w:b/>
+          <w:bCs/>
+        </w:rPr>
+        <w:t xml:space="preserve">Time-savings tracking (per project).</w:t>
+      </w:r>
+      <w:r>
+        <w:t xml:space="preserve"> </w:t>
+      </w:r>
+      <w:r>
+        <w:t xml:space="preserve">Consistent with Department of the Navy direction</w:t>
+      </w:r>
+      <w:r>
+        <w:t xml:space="preserve"> </w:t>
+      </w:r>
+      <w:r>
+        <w:t xml:space="preserve">(reference (g)), each approved use case tracks its own baseline (manual) versus AI-assisted</w:t>
+      </w:r>
+      <w:r>
+        <w:t xml:space="preserve"> </w:t>
+      </w:r>
+      <w:r>
+        <w:t xml:space="preserve">task time and reports the result through the department’s plan (Section 15) and the governance</w:t>
+      </w:r>
+      <w:r>
+        <w:t xml:space="preserve"> </w:t>
+      </w:r>
+      <w:r>
+        <w:t xml:space="preserve">forum (Section 8.g). The pilot (Section 14) establishes the baselines and the tracking method.</w:t>
       </w:r>
     </w:p>
     <w:bookmarkEnd w:id="22"/>
@@ -4205,7 +4345,7 @@
       <w:pPr>
         <w:numPr>
           <w:ilvl w:val="0"/>
-          <w:numId w:val="1016"/>
+          <w:numId w:val="1015"/>
         </w:numPr>
       </w:pPr>
       <w:r>
@@ -4244,7 +4384,7 @@
       <w:pPr>
         <w:numPr>
           <w:ilvl w:val="0"/>
-          <w:numId w:val="1016"/>
+          <w:numId w:val="1015"/>
         </w:numPr>
       </w:pPr>
       <w:r>
@@ -4264,19 +4404,19 @@
         <w:t xml:space="preserve"> </w:t>
       </w:r>
       <w:r>
-        <w:t xml:space="preserve">schedule, with a legal-hold capability, and are managed in accordance with the command’s</w:t>
-      </w:r>
-      <w:r>
-        <w:t xml:space="preserve"> </w:t>
-      </w:r>
-      <w:r>
-        <w:t xml:space="preserve">Standard Organization and Regulations Manual (SORM) and records program. Using AI does not</w:t>
-      </w:r>
-      <w:r>
-        <w:t xml:space="preserve"> </w:t>
-      </w:r>
-      <w:r>
-        <w:t xml:space="preserve">waive any records, FOIA, or privacy obligation.</w:t>
+        <w:t xml:space="preserve">schedule, with a legal-hold capability, and are managed in accordance with the records program</w:t>
+      </w:r>
+      <w:r>
+        <w:t xml:space="preserve"> </w:t>
+      </w:r>
+      <w:r>
+        <w:t xml:space="preserve">(reference (m)) and the SORM (reference (n)). Using AI does not waive any records, FOIA, or</w:t>
+      </w:r>
+      <w:r>
+        <w:t xml:space="preserve"> </w:t>
+      </w:r>
+      <w:r>
+        <w:t xml:space="preserve">privacy obligation.</w:t>
       </w:r>
       <w:r>
         <w:t xml:space="preserve"> </w:t>
@@ -4292,13 +4432,13 @@
         <w:t xml:space="preserve"> </w:t>
       </w:r>
       <w:r>
-        <w:t xml:space="preserve">on retention and hold.</w:t>
-      </w:r>
-      <w:r>
-        <w:t xml:space="preserve"> </w:t>
-      </w:r>
-      <w:r>
-        <w:t xml:space="preserve">(For the spillage exception to ordinary retention, see Section 11.a.)</w:t>
+        <w:t xml:space="preserve">on retention and hold. (For the spillage exception to</w:t>
+      </w:r>
+      <w:r>
+        <w:t xml:space="preserve"> </w:t>
+      </w:r>
+      <w:r>
+        <w:t xml:space="preserve">ordinary retention, see Section 11.a.)</w:t>
       </w:r>
     </w:p>
     <w:bookmarkEnd w:id="23"/>
@@ -4324,6 +4464,181 @@
         <w:pStyle w:val="Compact"/>
         <w:numPr>
           <w:ilvl w:val="0"/>
+          <w:numId w:val="1016"/>
+        </w:numPr>
+      </w:pPr>
+      <w:r>
+        <w:rPr>
+          <w:b/>
+          <w:bCs/>
+        </w:rPr>
+        <w:t xml:space="preserve">Spillage (security).</w:t>
+      </w:r>
+      <w:r>
+        <w:t xml:space="preserve"> </w:t>
+      </w:r>
+      <w:r>
+        <w:t xml:space="preserve">If classified information or NNPI is entered into askSage, or</w:t>
+      </w:r>
+      <w:r>
+        <w:t xml:space="preserve"> </w:t>
+      </w:r>
+      <w:r>
+        <w:t xml:space="preserve">the AI outputs apparent classified material through aggregation, the user immediately</w:t>
+      </w:r>
+      <w:r>
+        <w:t xml:space="preserve"> </w:t>
+      </w:r>
+      <w:r>
+        <w:t xml:space="preserve">stops the session and</w:t>
+      </w:r>
+      <w:r>
+        <w:t xml:space="preserve"> </w:t>
+      </w:r>
+      <w:r>
+        <w:rPr>
+          <w:b/>
+          <w:bCs/>
+        </w:rPr>
+        <w:t xml:space="preserve">does not delete the prompt</w:t>
+      </w:r>
+      <w:r>
+        <w:t xml:space="preserve"> </w:t>
+      </w:r>
+      <w:r>
+        <w:t xml:space="preserve">(preserve it for forensics), and</w:t>
+      </w:r>
+      <w:r>
+        <w:t xml:space="preserve"> </w:t>
+      </w:r>
+      <w:r>
+        <w:t xml:space="preserve">notifies the Security Manager and ISSM. The spilled material is then</w:t>
+      </w:r>
+      <w:r>
+        <w:t xml:space="preserve"> </w:t>
+      </w:r>
+      <w:r>
+        <w:rPr>
+          <w:b/>
+          <w:bCs/>
+        </w:rPr>
+        <w:t xml:space="preserve">isolated and routed</w:t>
+      </w:r>
+      <w:r>
+        <w:rPr>
+          <w:b/>
+          <w:bCs/>
+        </w:rPr>
+        <w:t xml:space="preserve"> </w:t>
+      </w:r>
+      <w:r>
+        <w:rPr>
+          <w:b/>
+          <w:bCs/>
+        </w:rPr>
+        <w:t xml:space="preserve">to the formal security spillage-cleanup and records-disposition process</w:t>
+      </w:r>
+      <w:r>
+        <w:t xml:space="preserve"> </w:t>
+      </w:r>
+      <w:r>
+        <w:t xml:space="preserve">— including</w:t>
+      </w:r>
+      <w:r>
+        <w:t xml:space="preserve"> </w:t>
+      </w:r>
+      <w:r>
+        <w:t xml:space="preserve">emergency destruction of the affected records where authorized —</w:t>
+      </w:r>
+      <w:r>
+        <w:t xml:space="preserve"> </w:t>
+      </w:r>
+      <w:r>
+        <w:rPr>
+          <w:b/>
+          <w:bCs/>
+        </w:rPr>
+        <w:t xml:space="preserve">only after Security</w:t>
+      </w:r>
+      <w:r>
+        <w:rPr>
+          <w:b/>
+          <w:bCs/>
+        </w:rPr>
+        <w:t xml:space="preserve"> </w:t>
+      </w:r>
+      <w:r>
+        <w:rPr>
+          <w:b/>
+          <w:bCs/>
+        </w:rPr>
+        <w:t xml:space="preserve">Manager and Legal adjudication.</w:t>
+      </w:r>
+      <w:r>
+        <w:t xml:space="preserve"> </w:t>
+      </w:r>
+      <w:r>
+        <w:t xml:space="preserve">Emergency destruction of a spilled record that is a</w:t>
+      </w:r>
+      <w:r>
+        <w:t xml:space="preserve"> </w:t>
+      </w:r>
+      <w:r>
+        <w:t xml:space="preserve">continuing menace is authorized under 36 CFR § 1229.10 and the emergency-destruction</w:t>
+      </w:r>
+      <w:r>
+        <w:t xml:space="preserve"> </w:t>
+      </w:r>
+      <w:r>
+        <w:t xml:space="preserve">provisions of the records program (references (j) and (m)); cyber-incident reporting follows</w:t>
+      </w:r>
+      <w:r>
+        <w:t xml:space="preserve"> </w:t>
+      </w:r>
+      <w:r>
+        <w:t xml:space="preserve">reference (k). This is the deliberate exception to ordinary records retention (Section 10): a</w:t>
+      </w:r>
+      <w:r>
+        <w:t xml:space="preserve"> </w:t>
+      </w:r>
+      <w:r>
+        <w:t xml:space="preserve">spilled classified record is not preserved as a permanent record inside the CUI/IL5 store.</w:t>
+      </w:r>
+      <w:r>
+        <w:t xml:space="preserve"> </w:t>
+      </w:r>
+      <w:r>
+        <w:t xml:space="preserve">Report through security channels, including the Naval Criminal Investigative Service (NCIS) as</w:t>
+      </w:r>
+      <w:r>
+        <w:t xml:space="preserve"> </w:t>
+      </w:r>
+      <w:r>
+        <w:t xml:space="preserve">required.</w:t>
+      </w:r>
+    </w:p>
+    <w:p>
+      <w:pPr>
+        <w:pStyle w:val="BlockText"/>
+      </w:pPr>
+      <w:r>
+        <w:rPr>
+          <w:b/>
+          <w:bCs/>
+        </w:rPr>
+        <w:t xml:space="preserve">Working group to resolve:</w:t>
+      </w:r>
+      <w:r>
+        <w:t xml:space="preserve"> </w:t>
+      </w:r>
+      <w:r>
+        <w:t xml:space="preserve">align this flow with the command’s own spillage standard operating procedure.</w:t>
+      </w:r>
+    </w:p>
+    <w:p>
+      <w:pPr>
+        <w:numPr>
+          <w:ilvl w:val="0"/>
           <w:numId w:val="1017"/>
         </w:numPr>
       </w:pPr>
@@ -4332,163 +4647,6 @@
           <w:b/>
           <w:bCs/>
         </w:rPr>
-        <w:t xml:space="preserve">Spillage (security).</w:t>
-      </w:r>
-      <w:r>
-        <w:t xml:space="preserve"> </w:t>
-      </w:r>
-      <w:r>
-        <w:t xml:space="preserve">If classified information or NNPI is entered into askSage, or</w:t>
-      </w:r>
-      <w:r>
-        <w:t xml:space="preserve"> </w:t>
-      </w:r>
-      <w:r>
-        <w:t xml:space="preserve">the AI outputs apparent classified material through aggregation, the user immediately</w:t>
-      </w:r>
-      <w:r>
-        <w:t xml:space="preserve"> </w:t>
-      </w:r>
-      <w:r>
-        <w:t xml:space="preserve">stops the session and</w:t>
-      </w:r>
-      <w:r>
-        <w:t xml:space="preserve"> </w:t>
-      </w:r>
-      <w:r>
-        <w:rPr>
-          <w:b/>
-          <w:bCs/>
-        </w:rPr>
-        <w:t xml:space="preserve">does not delete the prompt</w:t>
-      </w:r>
-      <w:r>
-        <w:t xml:space="preserve"> </w:t>
-      </w:r>
-      <w:r>
-        <w:t xml:space="preserve">(preserve it for forensics), and</w:t>
-      </w:r>
-      <w:r>
-        <w:t xml:space="preserve"> </w:t>
-      </w:r>
-      <w:r>
-        <w:t xml:space="preserve">notifies the Security Manager and ISSM. The spilled material is then</w:t>
-      </w:r>
-      <w:r>
-        <w:t xml:space="preserve"> </w:t>
-      </w:r>
-      <w:r>
-        <w:rPr>
-          <w:b/>
-          <w:bCs/>
-        </w:rPr>
-        <w:t xml:space="preserve">isolated and routed</w:t>
-      </w:r>
-      <w:r>
-        <w:rPr>
-          <w:b/>
-          <w:bCs/>
-        </w:rPr>
-        <w:t xml:space="preserve"> </w:t>
-      </w:r>
-      <w:r>
-        <w:rPr>
-          <w:b/>
-          <w:bCs/>
-        </w:rPr>
-        <w:t xml:space="preserve">to the formal security spillage-cleanup and records-disposition process</w:t>
-      </w:r>
-      <w:r>
-        <w:t xml:space="preserve"> </w:t>
-      </w:r>
-      <w:r>
-        <w:t xml:space="preserve">— including</w:t>
-      </w:r>
-      <w:r>
-        <w:t xml:space="preserve"> </w:t>
-      </w:r>
-      <w:r>
-        <w:t xml:space="preserve">emergency destruction of the affected records where authorized —</w:t>
-      </w:r>
-      <w:r>
-        <w:t xml:space="preserve"> </w:t>
-      </w:r>
-      <w:r>
-        <w:rPr>
-          <w:b/>
-          <w:bCs/>
-        </w:rPr>
-        <w:t xml:space="preserve">only after Security</w:t>
-      </w:r>
-      <w:r>
-        <w:rPr>
-          <w:b/>
-          <w:bCs/>
-        </w:rPr>
-        <w:t xml:space="preserve"> </w:t>
-      </w:r>
-      <w:r>
-        <w:rPr>
-          <w:b/>
-          <w:bCs/>
-        </w:rPr>
-        <w:t xml:space="preserve">Manager and Legal adjudication.</w:t>
-      </w:r>
-      <w:r>
-        <w:t xml:space="preserve"> </w:t>
-      </w:r>
-      <w:r>
-        <w:t xml:space="preserve">This is the deliberate exception to ordinary records</w:t>
-      </w:r>
-      <w:r>
-        <w:t xml:space="preserve"> </w:t>
-      </w:r>
-      <w:r>
-        <w:t xml:space="preserve">retention (Section 10): a spilled classified record is not preserved as a permanent record</w:t>
-      </w:r>
-      <w:r>
-        <w:t xml:space="preserve"> </w:t>
-      </w:r>
-      <w:r>
-        <w:t xml:space="preserve">inside the CUI/IL5 store. Report through security channels, including the Naval Criminal</w:t>
-      </w:r>
-      <w:r>
-        <w:t xml:space="preserve"> </w:t>
-      </w:r>
-      <w:r>
-        <w:t xml:space="preserve">Investigative Service (NCIS) as required.</w:t>
-      </w:r>
-    </w:p>
-    <w:p>
-      <w:pPr>
-        <w:pStyle w:val="BlockText"/>
-      </w:pPr>
-      <w:r>
-        <w:rPr>
-          <w:b/>
-          <w:bCs/>
-        </w:rPr>
-        <w:t xml:space="preserve">Working group to resolve:</w:t>
-      </w:r>
-      <w:r>
-        <w:t xml:space="preserve"> </w:t>
-      </w:r>
-      <w:r>
-        <w:t xml:space="preserve">align this flow with the command’s security spillage procedures and records-destruction authority (ref (j)).</w:t>
-      </w:r>
-    </w:p>
-    <w:p>
-      <w:pPr>
-        <w:numPr>
-          <w:ilvl w:val="0"/>
-          <w:numId w:val="1018"/>
-        </w:numPr>
-      </w:pPr>
-      <w:r>
-        <w:rPr>
-          <w:b/>
-          <w:bCs/>
-        </w:rPr>
         <w:t xml:space="preserve">Safety mishap (hallucination-driven).</w:t>
       </w:r>
       <w:r>
@@ -4514,7 +4672,7 @@
       <w:pPr>
         <w:numPr>
           <w:ilvl w:val="0"/>
-          <w:numId w:val="1018"/>
+          <w:numId w:val="1017"/>
         </w:numPr>
       </w:pPr>
       <w:r>
@@ -4557,7 +4715,7 @@
       <w:pPr>
         <w:numPr>
           <w:ilvl w:val="0"/>
-          <w:numId w:val="1019"/>
+          <w:numId w:val="1018"/>
         </w:numPr>
       </w:pPr>
       <w:r>
@@ -4605,7 +4763,7 @@
       <w:pPr>
         <w:numPr>
           <w:ilvl w:val="0"/>
-          <w:numId w:val="1019"/>
+          <w:numId w:val="1018"/>
         </w:numPr>
       </w:pPr>
       <w:r>
@@ -4654,7 +4812,7 @@
       <w:pPr>
         <w:numPr>
           <w:ilvl w:val="0"/>
-          <w:numId w:val="1020"/>
+          <w:numId w:val="1019"/>
         </w:numPr>
       </w:pPr>
       <w:r>
@@ -4695,7 +4853,7 @@
       <w:pPr>
         <w:numPr>
           <w:ilvl w:val="0"/>
-          <w:numId w:val="1020"/>
+          <w:numId w:val="1019"/>
         </w:numPr>
       </w:pPr>
       <w:r>
@@ -4718,7 +4876,7 @@
       <w:pPr>
         <w:numPr>
           <w:ilvl w:val="0"/>
-          <w:numId w:val="1020"/>
+          <w:numId w:val="1019"/>
         </w:numPr>
       </w:pPr>
       <w:r>
@@ -4745,7 +4903,7 @@
       <w:pPr>
         <w:numPr>
           <w:ilvl w:val="0"/>
-          <w:numId w:val="1021"/>
+          <w:numId w:val="1020"/>
         </w:numPr>
       </w:pPr>
       <w:r>
@@ -4778,7 +4936,7 @@
       <w:pPr>
         <w:numPr>
           <w:ilvl w:val="0"/>
-          <w:numId w:val="1021"/>
+          <w:numId w:val="1020"/>
         </w:numPr>
       </w:pPr>
       <w:r>
@@ -4798,14 +4956,20 @@
         <w:t xml:space="preserve"> </w:t>
       </w:r>
       <w:r>
-        <w:t xml:space="preserve">exercise the governance before extending to write-enabled or higher-risk uses.</w:t>
-      </w:r>
-    </w:p>
-    <w:p>
-      <w:pPr>
-        <w:numPr>
-          <w:ilvl w:val="0"/>
-          <w:numId w:val="1021"/>
+        <w:t xml:space="preserve">exercise the governance before extending to write-enabled or higher-risk uses. The pilot</w:t>
+      </w:r>
+      <w:r>
+        <w:t xml:space="preserve"> </w:t>
+      </w:r>
+      <w:r>
+        <w:t xml:space="preserve">establishes task baselines and the per-project time-savings tracking method (Section 9.e).</w:t>
+      </w:r>
+    </w:p>
+    <w:p>
+      <w:pPr>
+        <w:numPr>
+          <w:ilvl w:val="0"/>
+          <w:numId w:val="1020"/>
         </w:numPr>
       </w:pPr>
       <w:r>
@@ -4856,7 +5020,7 @@
       <w:pPr>
         <w:numPr>
           <w:ilvl w:val="0"/>
-          <w:numId w:val="1021"/>
+          <w:numId w:val="1020"/>
         </w:numPr>
       </w:pPr>
       <w:r>
@@ -4950,7 +5114,7 @@
       <w:pPr>
         <w:numPr>
           <w:ilvl w:val="0"/>
-          <w:numId w:val="1022"/>
+          <w:numId w:val="1021"/>
         </w:numPr>
       </w:pPr>
       <w:r>
@@ -5009,6 +5173,46 @@
       <w:pPr>
         <w:numPr>
           <w:ilvl w:val="0"/>
+          <w:numId w:val="1021"/>
+        </w:numPr>
+      </w:pPr>
+      <w:r>
+        <w:rPr>
+          <w:b/>
+          <w:bCs/>
+        </w:rPr>
+        <w:t xml:space="preserve">High-level expectations the plan reflects.</w:t>
+      </w:r>
+      <w:r>
+        <w:t xml:space="preserve"> </w:t>
+      </w:r>
+      <w:r>
+        <w:t xml:space="preserve">The plan is the department’s local</w:t>
+      </w:r>
+      <w:r>
+        <w:t xml:space="preserve"> </w:t>
+      </w:r>
+      <w:r>
+        <w:t xml:space="preserve">implementation of this instruction, grounded in industry best practice (the NIST AI Risk</w:t>
+      </w:r>
+      <w:r>
+        <w:t xml:space="preserve"> </w:t>
+      </w:r>
+      <w:r>
+        <w:t xml:space="preserve">Management Framework — Govern, Map, Measure, Manage) and Department practice (the DoD AI</w:t>
+      </w:r>
+      <w:r>
+        <w:t xml:space="preserve"> </w:t>
+      </w:r>
+      <w:r>
+        <w:t xml:space="preserve">Ethical Principles). At a minimum it addresses:</w:t>
+      </w:r>
+    </w:p>
+    <w:p>
+      <w:pPr>
+        <w:pStyle w:val="Compact"/>
+        <w:numPr>
+          <w:ilvl w:val="0"/>
           <w:numId w:val="1022"/>
         </w:numPr>
       </w:pPr>
@@ -5017,31 +5221,19 @@
           <w:b/>
           <w:bCs/>
         </w:rPr>
-        <w:t xml:space="preserve">High-level expectations the plan reflects.</w:t>
-      </w:r>
-      <w:r>
-        <w:t xml:space="preserve"> </w:t>
-      </w:r>
-      <w:r>
-        <w:t xml:space="preserve">The plan is the department’s local</w:t>
-      </w:r>
-      <w:r>
-        <w:t xml:space="preserve"> </w:t>
-      </w:r>
-      <w:r>
-        <w:t xml:space="preserve">implementation of this instruction, grounded in industry best practice (the NIST AI Risk</w:t>
-      </w:r>
-      <w:r>
-        <w:t xml:space="preserve"> </w:t>
-      </w:r>
-      <w:r>
-        <w:t xml:space="preserve">Management Framework — Govern, Map, Measure, Manage) and Department practice (the DoD AI</w:t>
-      </w:r>
-      <w:r>
-        <w:t xml:space="preserve"> </w:t>
-      </w:r>
-      <w:r>
-        <w:t xml:space="preserve">Ethical Principles). At a minimum it addresses:</w:t>
+        <w:t xml:space="preserve">Accountability and evaluation</w:t>
+      </w:r>
+      <w:r>
+        <w:t xml:space="preserve"> </w:t>
+      </w:r>
+      <w:r>
+        <w:t xml:space="preserve">— the department’s accountable owner and its designated</w:t>
+      </w:r>
+      <w:r>
+        <w:t xml:space="preserve"> </w:t>
+      </w:r>
+      <w:r>
+        <w:t xml:space="preserve">authoritative AI content evaluator (Section 6.b).</w:t>
       </w:r>
     </w:p>
     <w:p>
@@ -5049,175 +5241,147 @@
         <w:pStyle w:val="Compact"/>
         <w:numPr>
           <w:ilvl w:val="0"/>
+          <w:numId w:val="1022"/>
+        </w:numPr>
+      </w:pPr>
+      <w:r>
+        <w:rPr>
+          <w:b/>
+          <w:bCs/>
+        </w:rPr>
+        <w:t xml:space="preserve">Use cases and risk</w:t>
+      </w:r>
+      <w:r>
+        <w:t xml:space="preserve"> </w:t>
+      </w:r>
+      <w:r>
+        <w:t xml:space="preserve">— the department’s approved askSage use cases, each classified by risk</w:t>
+      </w:r>
+      <w:r>
+        <w:t xml:space="preserve"> </w:t>
+      </w:r>
+      <w:r>
+        <w:t xml:space="preserve">(Section 7.d) and entered in the command inventory (Section 8.g).</w:t>
+      </w:r>
+    </w:p>
+    <w:p>
+      <w:pPr>
+        <w:pStyle w:val="Compact"/>
+        <w:numPr>
+          <w:ilvl w:val="0"/>
+          <w:numId w:val="1022"/>
+        </w:numPr>
+      </w:pPr>
+      <w:r>
+        <w:rPr>
+          <w:b/>
+          <w:bCs/>
+        </w:rPr>
+        <w:t xml:space="preserve">Data boundaries</w:t>
+      </w:r>
+      <w:r>
+        <w:t xml:space="preserve"> </w:t>
+      </w:r>
+      <w:r>
+        <w:t xml:space="preserve">— the authorized data its use cases touch, and the prohibited-data line</w:t>
+      </w:r>
+      <w:r>
+        <w:t xml:space="preserve"> </w:t>
+      </w:r>
+      <w:r>
+        <w:t xml:space="preserve">(Section 4).</w:t>
+      </w:r>
+    </w:p>
+    <w:p>
+      <w:pPr>
+        <w:pStyle w:val="Compact"/>
+        <w:numPr>
+          <w:ilvl w:val="0"/>
+          <w:numId w:val="1022"/>
+        </w:numPr>
+      </w:pPr>
+      <w:r>
+        <w:rPr>
+          <w:b/>
+          <w:bCs/>
+        </w:rPr>
+        <w:t xml:space="preserve">Repository and access</w:t>
+      </w:r>
+      <w:r>
+        <w:t xml:space="preserve"> </w:t>
+      </w:r>
+      <w:r>
+        <w:t xml:space="preserve">— the department’s repository, what it feeds into it, and who may</w:t>
+      </w:r>
+      <w:r>
+        <w:t xml:space="preserve"> </w:t>
+      </w:r>
+      <w:r>
+        <w:t xml:space="preserve">access it (Section 5).</w:t>
+      </w:r>
+    </w:p>
+    <w:p>
+      <w:pPr>
+        <w:pStyle w:val="Compact"/>
+        <w:numPr>
+          <w:ilvl w:val="0"/>
+          <w:numId w:val="1022"/>
+        </w:numPr>
+      </w:pPr>
+      <w:r>
+        <w:rPr>
+          <w:b/>
+          <w:bCs/>
+        </w:rPr>
+        <w:t xml:space="preserve">Human-in-the-loop</w:t>
+      </w:r>
+      <w:r>
+        <w:t xml:space="preserve"> </w:t>
+      </w:r>
+      <w:r>
+        <w:t xml:space="preserve">— how the department applies authoritative evaluation and structured</w:t>
+      </w:r>
+      <w:r>
+        <w:t xml:space="preserve"> </w:t>
+      </w:r>
+      <w:r>
+        <w:t xml:space="preserve">approval to its AI output (Section 6).</w:t>
+      </w:r>
+    </w:p>
+    <w:p>
+      <w:pPr>
+        <w:pStyle w:val="Compact"/>
+        <w:numPr>
+          <w:ilvl w:val="0"/>
+          <w:numId w:val="1022"/>
+        </w:numPr>
+      </w:pPr>
+      <w:r>
+        <w:rPr>
+          <w:b/>
+          <w:bCs/>
+        </w:rPr>
+        <w:t xml:space="preserve">Monitoring and records</w:t>
+      </w:r>
+      <w:r>
+        <w:t xml:space="preserve"> </w:t>
+      </w:r>
+      <w:r>
+        <w:t xml:space="preserve">— how the department supports continuous monitoring (Section 9)</w:t>
+      </w:r>
+      <w:r>
+        <w:t xml:space="preserve"> </w:t>
+      </w:r>
+      <w:r>
+        <w:t xml:space="preserve">and meets records and retention obligations (Section 10).</w:t>
+      </w:r>
+    </w:p>
+    <w:p>
+      <w:pPr>
+        <w:pStyle w:val="Compact"/>
+        <w:numPr>
+          <w:ilvl w:val="0"/>
           <w:numId w:val="1023"/>
-        </w:numPr>
-      </w:pPr>
-      <w:r>
-        <w:rPr>
-          <w:b/>
-          <w:bCs/>
-        </w:rPr>
-        <w:t xml:space="preserve">Accountability and evaluation</w:t>
-      </w:r>
-      <w:r>
-        <w:t xml:space="preserve"> </w:t>
-      </w:r>
-      <w:r>
-        <w:t xml:space="preserve">— the department’s accountable owner and its designated</w:t>
-      </w:r>
-      <w:r>
-        <w:t xml:space="preserve"> </w:t>
-      </w:r>
-      <w:r>
-        <w:t xml:space="preserve">authoritative AI content evaluator (Section 6.b).</w:t>
-      </w:r>
-    </w:p>
-    <w:p>
-      <w:pPr>
-        <w:pStyle w:val="Compact"/>
-        <w:numPr>
-          <w:ilvl w:val="0"/>
-          <w:numId w:val="1023"/>
-        </w:numPr>
-      </w:pPr>
-      <w:r>
-        <w:rPr>
-          <w:b/>
-          <w:bCs/>
-        </w:rPr>
-        <w:t xml:space="preserve">Use cases and risk</w:t>
-      </w:r>
-      <w:r>
-        <w:t xml:space="preserve"> </w:t>
-      </w:r>
-      <w:r>
-        <w:t xml:space="preserve">— the department’s approved askSage use cases, each classified by risk</w:t>
-      </w:r>
-      <w:r>
-        <w:t xml:space="preserve"> </w:t>
-      </w:r>
-      <w:r>
-        <w:t xml:space="preserve">(Section 7.d) and entered in the command inventory (Section 8.g).</w:t>
-      </w:r>
-    </w:p>
-    <w:p>
-      <w:pPr>
-        <w:pStyle w:val="Compact"/>
-        <w:numPr>
-          <w:ilvl w:val="0"/>
-          <w:numId w:val="1023"/>
-        </w:numPr>
-      </w:pPr>
-      <w:r>
-        <w:rPr>
-          <w:b/>
-          <w:bCs/>
-        </w:rPr>
-        <w:t xml:space="preserve">Data boundaries</w:t>
-      </w:r>
-      <w:r>
-        <w:t xml:space="preserve"> </w:t>
-      </w:r>
-      <w:r>
-        <w:t xml:space="preserve">— the authorized data its use cases touch, and the prohibited-data line</w:t>
-      </w:r>
-      <w:r>
-        <w:t xml:space="preserve"> </w:t>
-      </w:r>
-      <w:r>
-        <w:t xml:space="preserve">(Section 4).</w:t>
-      </w:r>
-    </w:p>
-    <w:p>
-      <w:pPr>
-        <w:pStyle w:val="Compact"/>
-        <w:numPr>
-          <w:ilvl w:val="0"/>
-          <w:numId w:val="1023"/>
-        </w:numPr>
-      </w:pPr>
-      <w:r>
-        <w:rPr>
-          <w:b/>
-          <w:bCs/>
-        </w:rPr>
-        <w:t xml:space="preserve">Repository and access</w:t>
-      </w:r>
-      <w:r>
-        <w:t xml:space="preserve"> </w:t>
-      </w:r>
-      <w:r>
-        <w:t xml:space="preserve">— the department’s repository, what it feeds into it, and who may</w:t>
-      </w:r>
-      <w:r>
-        <w:t xml:space="preserve"> </w:t>
-      </w:r>
-      <w:r>
-        <w:t xml:space="preserve">access it (Section 5).</w:t>
-      </w:r>
-    </w:p>
-    <w:p>
-      <w:pPr>
-        <w:pStyle w:val="Compact"/>
-        <w:numPr>
-          <w:ilvl w:val="0"/>
-          <w:numId w:val="1023"/>
-        </w:numPr>
-      </w:pPr>
-      <w:r>
-        <w:rPr>
-          <w:b/>
-          <w:bCs/>
-        </w:rPr>
-        <w:t xml:space="preserve">Human-in-the-loop</w:t>
-      </w:r>
-      <w:r>
-        <w:t xml:space="preserve"> </w:t>
-      </w:r>
-      <w:r>
-        <w:t xml:space="preserve">— how the department applies authoritative evaluation and structured</w:t>
-      </w:r>
-      <w:r>
-        <w:t xml:space="preserve"> </w:t>
-      </w:r>
-      <w:r>
-        <w:t xml:space="preserve">approval to its AI output (Section 6).</w:t>
-      </w:r>
-    </w:p>
-    <w:p>
-      <w:pPr>
-        <w:pStyle w:val="Compact"/>
-        <w:numPr>
-          <w:ilvl w:val="0"/>
-          <w:numId w:val="1023"/>
-        </w:numPr>
-      </w:pPr>
-      <w:r>
-        <w:rPr>
-          <w:b/>
-          <w:bCs/>
-        </w:rPr>
-        <w:t xml:space="preserve">Monitoring and records</w:t>
-      </w:r>
-      <w:r>
-        <w:t xml:space="preserve"> </w:t>
-      </w:r>
-      <w:r>
-        <w:t xml:space="preserve">— how the department supports continuous monitoring (Section 9)</w:t>
-      </w:r>
-      <w:r>
-        <w:t xml:space="preserve"> </w:t>
-      </w:r>
-      <w:r>
-        <w:t xml:space="preserve">and meets records and retention obligations (Section 10).</w:t>
-      </w:r>
-    </w:p>
-    <w:p>
-      <w:pPr>
-        <w:pStyle w:val="Compact"/>
-        <w:numPr>
-          <w:ilvl w:val="0"/>
-          <w:numId w:val="1024"/>
         </w:numPr>
       </w:pPr>
       <w:r>
@@ -5306,7 +5470,7 @@
         <w:pStyle w:val="Compact"/>
         <w:numPr>
           <w:ilvl w:val="0"/>
-          <w:numId w:val="1025"/>
+          <w:numId w:val="1024"/>
         </w:numPr>
       </w:pPr>
       <w:r>
@@ -5334,7 +5498,7 @@
         <w:pStyle w:val="Compact"/>
         <w:numPr>
           <w:ilvl w:val="0"/>
-          <w:numId w:val="1025"/>
+          <w:numId w:val="1024"/>
         </w:numPr>
       </w:pPr>
       <w:r>
@@ -5362,7 +5526,7 @@
         <w:pStyle w:val="Compact"/>
         <w:numPr>
           <w:ilvl w:val="0"/>
-          <w:numId w:val="1025"/>
+          <w:numId w:val="1024"/>
         </w:numPr>
       </w:pPr>
       <w:r>
@@ -5402,7 +5566,7 @@
         <w:pStyle w:val="Compact"/>
         <w:numPr>
           <w:ilvl w:val="0"/>
-          <w:numId w:val="1025"/>
+          <w:numId w:val="1024"/>
         </w:numPr>
       </w:pPr>
       <w:r>
@@ -6349,6 +6513,36 @@
     </w:lvlOverride>
   </w:num>
   <w:num w:numId="1008">
+    <w:abstractNumId w:val="99711"/>
+    <w:lvlOverride w:ilvl="0">
+      <w:startOverride w:val="1"/>
+    </w:lvlOverride>
+    <w:lvlOverride w:ilvl="1">
+      <w:startOverride w:val="1"/>
+    </w:lvlOverride>
+    <w:lvlOverride w:ilvl="2">
+      <w:startOverride w:val="1"/>
+    </w:lvlOverride>
+    <w:lvlOverride w:ilvl="3">
+      <w:startOverride w:val="1"/>
+    </w:lvlOverride>
+    <w:lvlOverride w:ilvl="4">
+      <w:startOverride w:val="1"/>
+    </w:lvlOverride>
+    <w:lvlOverride w:ilvl="5">
+      <w:startOverride w:val="1"/>
+    </w:lvlOverride>
+    <w:lvlOverride w:ilvl="6">
+      <w:startOverride w:val="1"/>
+    </w:lvlOverride>
+    <w:lvlOverride w:ilvl="7">
+      <w:startOverride w:val="1"/>
+    </w:lvlOverride>
+    <w:lvlOverride w:ilvl="8">
+      <w:startOverride w:val="1"/>
+    </w:lvlOverride>
+  </w:num>
+  <w:num w:numId="1009">
     <w:abstractNumId w:val="99712"/>
     <w:lvlOverride w:ilvl="0">
       <w:startOverride w:val="2"/>
@@ -6378,67 +6572,7 @@
       <w:startOverride w:val="2"/>
     </w:lvlOverride>
   </w:num>
-  <w:num w:numId="1009">
-    <w:abstractNumId w:val="99711"/>
-    <w:lvlOverride w:ilvl="0">
-      <w:startOverride w:val="1"/>
-    </w:lvlOverride>
-    <w:lvlOverride w:ilvl="1">
-      <w:startOverride w:val="1"/>
-    </w:lvlOverride>
-    <w:lvlOverride w:ilvl="2">
-      <w:startOverride w:val="1"/>
-    </w:lvlOverride>
-    <w:lvlOverride w:ilvl="3">
-      <w:startOverride w:val="1"/>
-    </w:lvlOverride>
-    <w:lvlOverride w:ilvl="4">
-      <w:startOverride w:val="1"/>
-    </w:lvlOverride>
-    <w:lvlOverride w:ilvl="5">
-      <w:startOverride w:val="1"/>
-    </w:lvlOverride>
-    <w:lvlOverride w:ilvl="6">
-      <w:startOverride w:val="1"/>
-    </w:lvlOverride>
-    <w:lvlOverride w:ilvl="7">
-      <w:startOverride w:val="1"/>
-    </w:lvlOverride>
-    <w:lvlOverride w:ilvl="8">
-      <w:startOverride w:val="1"/>
-    </w:lvlOverride>
-  </w:num>
   <w:num w:numId="1010">
-    <w:abstractNumId w:val="99712"/>
-    <w:lvlOverride w:ilvl="0">
-      <w:startOverride w:val="2"/>
-    </w:lvlOverride>
-    <w:lvlOverride w:ilvl="1">
-      <w:startOverride w:val="2"/>
-    </w:lvlOverride>
-    <w:lvlOverride w:ilvl="2">
-      <w:startOverride w:val="2"/>
-    </w:lvlOverride>
-    <w:lvlOverride w:ilvl="3">
-      <w:startOverride w:val="2"/>
-    </w:lvlOverride>
-    <w:lvlOverride w:ilvl="4">
-      <w:startOverride w:val="2"/>
-    </w:lvlOverride>
-    <w:lvlOverride w:ilvl="5">
-      <w:startOverride w:val="2"/>
-    </w:lvlOverride>
-    <w:lvlOverride w:ilvl="6">
-      <w:startOverride w:val="2"/>
-    </w:lvlOverride>
-    <w:lvlOverride w:ilvl="7">
-      <w:startOverride w:val="2"/>
-    </w:lvlOverride>
-    <w:lvlOverride w:ilvl="8">
-      <w:startOverride w:val="2"/>
-    </w:lvlOverride>
-  </w:num>
-  <w:num w:numId="1011">
     <w:abstractNumId w:val="99715"/>
     <w:lvlOverride w:ilvl="0">
       <w:startOverride w:val="5"/>
@@ -6466,6 +6600,36 @@
     </w:lvlOverride>
     <w:lvlOverride w:ilvl="8">
       <w:startOverride w:val="5"/>
+    </w:lvlOverride>
+  </w:num>
+  <w:num w:numId="1011">
+    <w:abstractNumId w:val="99711"/>
+    <w:lvlOverride w:ilvl="0">
+      <w:startOverride w:val="1"/>
+    </w:lvlOverride>
+    <w:lvlOverride w:ilvl="1">
+      <w:startOverride w:val="1"/>
+    </w:lvlOverride>
+    <w:lvlOverride w:ilvl="2">
+      <w:startOverride w:val="1"/>
+    </w:lvlOverride>
+    <w:lvlOverride w:ilvl="3">
+      <w:startOverride w:val="1"/>
+    </w:lvlOverride>
+    <w:lvlOverride w:ilvl="4">
+      <w:startOverride w:val="1"/>
+    </w:lvlOverride>
+    <w:lvlOverride w:ilvl="5">
+      <w:startOverride w:val="1"/>
+    </w:lvlOverride>
+    <w:lvlOverride w:ilvl="6">
+      <w:startOverride w:val="1"/>
+    </w:lvlOverride>
+    <w:lvlOverride w:ilvl="7">
+      <w:startOverride w:val="1"/>
+    </w:lvlOverride>
+    <w:lvlOverride w:ilvl="8">
+      <w:startOverride w:val="1"/>
     </w:lvlOverride>
   </w:num>
   <w:num w:numId="1012">
@@ -6499,36 +6663,6 @@
     </w:lvlOverride>
   </w:num>
   <w:num w:numId="1013">
-    <w:abstractNumId w:val="99711"/>
-    <w:lvlOverride w:ilvl="0">
-      <w:startOverride w:val="1"/>
-    </w:lvlOverride>
-    <w:lvlOverride w:ilvl="1">
-      <w:startOverride w:val="1"/>
-    </w:lvlOverride>
-    <w:lvlOverride w:ilvl="2">
-      <w:startOverride w:val="1"/>
-    </w:lvlOverride>
-    <w:lvlOverride w:ilvl="3">
-      <w:startOverride w:val="1"/>
-    </w:lvlOverride>
-    <w:lvlOverride w:ilvl="4">
-      <w:startOverride w:val="1"/>
-    </w:lvlOverride>
-    <w:lvlOverride w:ilvl="5">
-      <w:startOverride w:val="1"/>
-    </w:lvlOverride>
-    <w:lvlOverride w:ilvl="6">
-      <w:startOverride w:val="1"/>
-    </w:lvlOverride>
-    <w:lvlOverride w:ilvl="7">
-      <w:startOverride w:val="1"/>
-    </w:lvlOverride>
-    <w:lvlOverride w:ilvl="8">
-      <w:startOverride w:val="1"/>
-    </w:lvlOverride>
-  </w:num>
-  <w:num w:numId="1014">
     <w:abstractNumId w:val="99712"/>
     <w:lvlOverride w:ilvl="0">
       <w:startOverride w:val="2"/>
@@ -6556,6 +6690,36 @@
     </w:lvlOverride>
     <w:lvlOverride w:ilvl="8">
       <w:startOverride w:val="2"/>
+    </w:lvlOverride>
+  </w:num>
+  <w:num w:numId="1014">
+    <w:abstractNumId w:val="99711"/>
+    <w:lvlOverride w:ilvl="0">
+      <w:startOverride w:val="1"/>
+    </w:lvlOverride>
+    <w:lvlOverride w:ilvl="1">
+      <w:startOverride w:val="1"/>
+    </w:lvlOverride>
+    <w:lvlOverride w:ilvl="2">
+      <w:startOverride w:val="1"/>
+    </w:lvlOverride>
+    <w:lvlOverride w:ilvl="3">
+      <w:startOverride w:val="1"/>
+    </w:lvlOverride>
+    <w:lvlOverride w:ilvl="4">
+      <w:startOverride w:val="1"/>
+    </w:lvlOverride>
+    <w:lvlOverride w:ilvl="5">
+      <w:startOverride w:val="1"/>
+    </w:lvlOverride>
+    <w:lvlOverride w:ilvl="6">
+      <w:startOverride w:val="1"/>
+    </w:lvlOverride>
+    <w:lvlOverride w:ilvl="7">
+      <w:startOverride w:val="1"/>
+    </w:lvlOverride>
+    <w:lvlOverride w:ilvl="8">
+      <w:startOverride w:val="1"/>
     </w:lvlOverride>
   </w:num>
   <w:num w:numId="1015">
@@ -6619,36 +6783,6 @@
     </w:lvlOverride>
   </w:num>
   <w:num w:numId="1017">
-    <w:abstractNumId w:val="99711"/>
-    <w:lvlOverride w:ilvl="0">
-      <w:startOverride w:val="1"/>
-    </w:lvlOverride>
-    <w:lvlOverride w:ilvl="1">
-      <w:startOverride w:val="1"/>
-    </w:lvlOverride>
-    <w:lvlOverride w:ilvl="2">
-      <w:startOverride w:val="1"/>
-    </w:lvlOverride>
-    <w:lvlOverride w:ilvl="3">
-      <w:startOverride w:val="1"/>
-    </w:lvlOverride>
-    <w:lvlOverride w:ilvl="4">
-      <w:startOverride w:val="1"/>
-    </w:lvlOverride>
-    <w:lvlOverride w:ilvl="5">
-      <w:startOverride w:val="1"/>
-    </w:lvlOverride>
-    <w:lvlOverride w:ilvl="6">
-      <w:startOverride w:val="1"/>
-    </w:lvlOverride>
-    <w:lvlOverride w:ilvl="7">
-      <w:startOverride w:val="1"/>
-    </w:lvlOverride>
-    <w:lvlOverride w:ilvl="8">
-      <w:startOverride w:val="1"/>
-    </w:lvlOverride>
-  </w:num>
-  <w:num w:numId="1018">
     <w:abstractNumId w:val="99712"/>
     <w:lvlOverride w:ilvl="0">
       <w:startOverride w:val="2"/>
@@ -6676,6 +6810,36 @@
     </w:lvlOverride>
     <w:lvlOverride w:ilvl="8">
       <w:startOverride w:val="2"/>
+    </w:lvlOverride>
+  </w:num>
+  <w:num w:numId="1018">
+    <w:abstractNumId w:val="99711"/>
+    <w:lvlOverride w:ilvl="0">
+      <w:startOverride w:val="1"/>
+    </w:lvlOverride>
+    <w:lvlOverride w:ilvl="1">
+      <w:startOverride w:val="1"/>
+    </w:lvlOverride>
+    <w:lvlOverride w:ilvl="2">
+      <w:startOverride w:val="1"/>
+    </w:lvlOverride>
+    <w:lvlOverride w:ilvl="3">
+      <w:startOverride w:val="1"/>
+    </w:lvlOverride>
+    <w:lvlOverride w:ilvl="4">
+      <w:startOverride w:val="1"/>
+    </w:lvlOverride>
+    <w:lvlOverride w:ilvl="5">
+      <w:startOverride w:val="1"/>
+    </w:lvlOverride>
+    <w:lvlOverride w:ilvl="6">
+      <w:startOverride w:val="1"/>
+    </w:lvlOverride>
+    <w:lvlOverride w:ilvl="7">
+      <w:startOverride w:val="1"/>
+    </w:lvlOverride>
+    <w:lvlOverride w:ilvl="8">
+      <w:startOverride w:val="1"/>
     </w:lvlOverride>
   </w:num>
   <w:num w:numId="1019">
@@ -6769,39 +6933,9 @@
     </w:lvlOverride>
   </w:num>
   <w:num w:numId="1022">
-    <w:abstractNumId w:val="99711"/>
-    <w:lvlOverride w:ilvl="0">
-      <w:startOverride w:val="1"/>
-    </w:lvlOverride>
-    <w:lvlOverride w:ilvl="1">
-      <w:startOverride w:val="1"/>
-    </w:lvlOverride>
-    <w:lvlOverride w:ilvl="2">
-      <w:startOverride w:val="1"/>
-    </w:lvlOverride>
-    <w:lvlOverride w:ilvl="3">
-      <w:startOverride w:val="1"/>
-    </w:lvlOverride>
-    <w:lvlOverride w:ilvl="4">
-      <w:startOverride w:val="1"/>
-    </w:lvlOverride>
-    <w:lvlOverride w:ilvl="5">
-      <w:startOverride w:val="1"/>
-    </w:lvlOverride>
-    <w:lvlOverride w:ilvl="6">
-      <w:startOverride w:val="1"/>
-    </w:lvlOverride>
-    <w:lvlOverride w:ilvl="7">
-      <w:startOverride w:val="1"/>
-    </w:lvlOverride>
-    <w:lvlOverride w:ilvl="8">
-      <w:startOverride w:val="1"/>
-    </w:lvlOverride>
+    <w:abstractNumId w:val="991"/>
   </w:num>
   <w:num w:numId="1023">
-    <w:abstractNumId w:val="991"/>
-  </w:num>
-  <w:num w:numId="1024">
     <w:abstractNumId w:val="99713"/>
     <w:lvlOverride w:ilvl="0">
       <w:startOverride w:val="3"/>
@@ -6831,7 +6965,7 @@
       <w:startOverride w:val="3"/>
     </w:lvlOverride>
   </w:num>
-  <w:num w:numId="1025">
+  <w:num w:numId="1024">
     <w:abstractNumId w:val="991"/>
   </w:num>
 </w:numbering>

</xml_diff>